<commit_message>
docs(manuscript): Discussion section (Step 5) + preview integration
Full-prose Discussion (~1,170 w) following the storyboard spine: opens on the
clinical/repurposing intent and the four therapeutic axes (method kept
subordinate); EGFR internal control + network reframing; epigenetic→ICI and
proteasome axes; metformin as metabolic vulnerability/combination (B2); hedged
"corroboration" not "validation" (M4), associations stated as associations.

- 8 new citations verified via PubMed → references.bib (carosi2026, bhatia2023,
  bear2025, zang2012, pujaltemartin2024, curry2018, crist2022, kemnade2023)
- literature claims logged in docs/CLINICAL_CRITERIA.md (all VERIFICADO)
- _build_preview.py now embeds Discussion; manuscript_PREVIEW.{md,docx} rebuilt
- WRITING_PLAN Step 5 marked in review

Co-Authored-By: Claude Opus 4.8 <noreply@anthropic.com>
</commit_message>
<xml_diff>
--- a/docs/manuscript/manuscript_PREVIEW_pandoc_markers.docx
+++ b/docs/manuscript/manuscript_PREVIEW_pandoc_markers.docx
@@ -2,7 +2,7 @@
 <file path=word/document.xml><?xml version="1.0" encoding="utf-8"?>
 <w:document xmlns:w="http://schemas.openxmlformats.org/wordprocessingml/2006/main" xmlns:m="http://schemas.openxmlformats.org/officeDocument/2006/math" xmlns:r="http://schemas.openxmlformats.org/officeDocument/2006/relationships" xmlns:o="urn:schemas-microsoft-com:office:office" xmlns:v="urn:schemas-microsoft-com:vml" xmlns:w10="urn:schemas-microsoft-com:office:word" xmlns:a="http://schemas.openxmlformats.org/drawingml/2006/main" xmlns:pic="http://schemas.openxmlformats.org/drawingml/2006/picture" xmlns:wp="http://schemas.openxmlformats.org/drawingml/2006/wordprocessingDrawing">
   <w:body>
-    <w:bookmarkStart w:id="26" w:name="X7df104631777e44d6eb0fc0c46edb5233ca053f"/>
+    <w:bookmarkStart w:id="38" w:name="X7df104631777e44d6eb0fc0c46edb5233ca053f"/>
     <w:p>
       <w:pPr>
         <w:pStyle w:val="Heading1"/>
@@ -16,10 +16,10 @@
         <w:pStyle w:val="FirstParagraph"/>
       </w:pPr>
       <w:r>
-        <w:t xml:space="preserve">Partial preview for pipeline testing: Introduction, Methods, Results, main-body figures (Fig 1-6) and the prioritized-candidate main table (Table 1). Discussion, Abstract, Title and complete Methods/Results citations are pending (WRITING_PLAN.md steps 5-8). Citations shown are PubMed-verified; the bibliography is generated by pandoc / scanned in Zotero.</w:t>
+        <w:t xml:space="preserve">Partial preview for pipeline testing: Introduction, Methods, Results, Discussion, main-body figures (Fig 1-6) and the prioritized-candidate main table (Table 1). Abstract, Title and complete Methods/Results citations are pending (WRITING_PLAN.md steps 6-8). Citations shown are PubMed-verified; the bibliography is generated by pandoc / scanned in Zotero.</w:t>
       </w:r>
     </w:p>
-    <w:bookmarkStart w:id="9" w:name="introduction"/>
+    <w:bookmarkStart w:id="20" w:name="introduction"/>
     <w:p>
       <w:pPr>
         <w:pStyle w:val="Heading2"/>
@@ -308,8 +308,8 @@
         <w:t xml:space="preserve">new, biologically interpretable vulnerabilities with translational potential.</w:t>
       </w:r>
     </w:p>
-    <w:bookmarkEnd w:id="9"/>
-    <w:bookmarkStart w:id="18" w:name="methods"/>
+    <w:bookmarkEnd w:id="20"/>
+    <w:bookmarkStart w:id="29" w:name="methods"/>
     <w:p>
       <w:pPr>
         <w:pStyle w:val="Heading2"/>
@@ -318,7 +318,7 @@
         <w:t xml:space="preserve">Methods</w:t>
       </w:r>
     </w:p>
-    <w:bookmarkStart w:id="10" w:name="X507864d58becb81b3eabdd876d38b9b6f4db955"/>
+    <w:bookmarkStart w:id="21" w:name="X507864d58becb81b3eabdd876d38b9b6f4db955"/>
     <w:p>
       <w:pPr>
         <w:pStyle w:val="Heading3"/>
@@ -428,8 +428,8 @@
         <w:t xml:space="preserve">unchanged (Table S2).</w:t>
       </w:r>
     </w:p>
-    <w:bookmarkEnd w:id="10"/>
-    <w:bookmarkStart w:id="11" w:name="functional-enrichment"/>
+    <w:bookmarkEnd w:id="21"/>
+    <w:bookmarkStart w:id="22" w:name="functional-enrichment"/>
     <w:p>
       <w:pPr>
         <w:pStyle w:val="Heading3"/>
@@ -464,8 +464,8 @@
         <w:t xml:space="preserve">adjusted p &lt; 0.05; fixed seed for reproducible permutations).</w:t>
       </w:r>
     </w:p>
-    <w:bookmarkEnd w:id="11"/>
-    <w:bookmarkStart w:id="12" w:name="drugtarget-mapping-and-integration"/>
+    <w:bookmarkEnd w:id="22"/>
+    <w:bookmarkStart w:id="23" w:name="drugtarget-mapping-and-integration"/>
     <w:p>
       <w:pPr>
         <w:pStyle w:val="Heading3"/>
@@ -554,8 +554,8 @@
         <w:t xml:space="preserve">removal of a curated exclusion list.</w:t>
       </w:r>
     </w:p>
-    <w:bookmarkEnd w:id="12"/>
-    <w:bookmarkStart w:id="13" w:name="proteinprotein-interaction-network"/>
+    <w:bookmarkEnd w:id="23"/>
+    <w:bookmarkStart w:id="24" w:name="proteinprotein-interaction-network"/>
     <w:p>
       <w:pPr>
         <w:pStyle w:val="Heading3"/>
@@ -608,8 +608,8 @@
         <w:t xml:space="preserve">druggable hubs only; or below threshold).</w:t>
       </w:r>
     </w:p>
-    <w:bookmarkEnd w:id="13"/>
-    <w:bookmarkStart w:id="14" w:name="X7ce957a7690d2b853bda9e15015edb572eafc2c"/>
+    <w:bookmarkEnd w:id="24"/>
+    <w:bookmarkStart w:id="25" w:name="X7ce957a7690d2b853bda9e15015edb572eafc2c"/>
     <w:p>
       <w:pPr>
         <w:pStyle w:val="Heading3"/>
@@ -729,8 +729,8 @@
         <w:t xml:space="preserve">tie-breaker among agents sharing a target.</w:t>
       </w:r>
     </w:p>
-    <w:bookmarkEnd w:id="14"/>
-    <w:bookmarkStart w:id="15" w:name="robustness"/>
+    <w:bookmarkEnd w:id="25"/>
+    <w:bookmarkStart w:id="26" w:name="robustness"/>
     <w:p>
       <w:pPr>
         <w:pStyle w:val="Heading3"/>
@@ -777,8 +777,8 @@
         <w:t xml:space="preserve">permutation p-value.</w:t>
       </w:r>
     </w:p>
-    <w:bookmarkEnd w:id="15"/>
-    <w:bookmarkStart w:id="16" w:name="X64b44461957c12521484b842e13a272e3266eb7"/>
+    <w:bookmarkEnd w:id="26"/>
+    <w:bookmarkStart w:id="27" w:name="X64b44461957c12521484b842e13a272e3266eb7"/>
     <w:p>
       <w:pPr>
         <w:pStyle w:val="Heading3"/>
@@ -858,8 +858,8 @@
         <w:t xml:space="preserve">annotated per target).</w:t>
       </w:r>
     </w:p>
-    <w:bookmarkEnd w:id="16"/>
-    <w:bookmarkStart w:id="17" w:name="software-and-reproducibility"/>
+    <w:bookmarkEnd w:id="27"/>
+    <w:bookmarkStart w:id="28" w:name="software-and-reproducibility"/>
     <w:p>
       <w:pPr>
         <w:pStyle w:val="Heading3"/>
@@ -912,9 +912,9 @@
         <w:t xml:space="preserve">statement will be provided at submission.</w:t>
       </w:r>
     </w:p>
-    <w:bookmarkEnd w:id="17"/>
-    <w:bookmarkEnd w:id="18"/>
-    <w:bookmarkStart w:id="25" w:name="results"/>
+    <w:bookmarkEnd w:id="28"/>
+    <w:bookmarkEnd w:id="29"/>
+    <w:bookmarkStart w:id="36" w:name="results"/>
     <w:p>
       <w:pPr>
         <w:pStyle w:val="Heading2"/>
@@ -923,7 +923,7 @@
         <w:t xml:space="preserve">Results</w:t>
       </w:r>
     </w:p>
-    <w:bookmarkStart w:id="19" w:name="Xa5daa2bb187e1e8dfecc2ef96fa7f2aebb26deb"/>
+    <w:bookmarkStart w:id="30" w:name="Xa5daa2bb187e1e8dfecc2ef96fa7f2aebb26deb"/>
     <w:p>
       <w:pPr>
         <w:pStyle w:val="Heading3"/>
@@ -1032,8 +1032,8 @@
         <w:t xml:space="preserve">conclusions about the prioritized targets and the OXPHOS axis hold up regardless of tissue composition.</w:t>
       </w:r>
     </w:p>
-    <w:bookmarkEnd w:id="19"/>
-    <w:bookmarkStart w:id="20" w:name="multi-source-druggable-candidate-space"/>
+    <w:bookmarkEnd w:id="30"/>
+    <w:bookmarkStart w:id="31" w:name="multi-source-druggable-candidate-space"/>
     <w:p>
       <w:pPr>
         <w:pStyle w:val="Heading3"/>
@@ -1080,8 +1080,8 @@
         <w:t xml:space="preserve">plot confirmed that the candidates were not an artifact of any single database (Fig 3C).</w:t>
       </w:r>
     </w:p>
-    <w:bookmarkEnd w:id="20"/>
-    <w:bookmarkStart w:id="21" w:name="X667b2ef2f3d1c648f40f67b8885bf345af9cef5"/>
+    <w:bookmarkEnd w:id="31"/>
+    <w:bookmarkStart w:id="32" w:name="X667b2ef2f3d1c648f40f67b8885bf345af9cef5"/>
     <w:p>
       <w:pPr>
         <w:pStyle w:val="Heading3"/>
@@ -1188,8 +1188,8 @@
         <w:t xml:space="preserve">module; the OXPHOS and proteasome pillars share the names of their modules.</w:t>
       </w:r>
     </w:p>
-    <w:bookmarkEnd w:id="21"/>
-    <w:bookmarkStart w:id="22" w:name="X70074d69435daa689fddf7b24d5faf48dd08b02"/>
+    <w:bookmarkEnd w:id="32"/>
+    <w:bookmarkStart w:id="33" w:name="X70074d69435daa689fddf7b24d5faf48dd08b02"/>
     <w:p>
       <w:pPr>
         <w:pStyle w:val="Heading3"/>
@@ -1345,8 +1345,8 @@
         <w:t xml:space="preserve">modules is provided in Table S5, and candidate provenance in Table S3.</w:t>
       </w:r>
     </w:p>
-    <w:bookmarkEnd w:id="22"/>
-    <w:bookmarkStart w:id="23" w:name="X284fdd6315c372fde6cdcbc15acfe1a88046859"/>
+    <w:bookmarkEnd w:id="33"/>
+    <w:bookmarkStart w:id="34" w:name="X284fdd6315c372fde6cdcbc15acfe1a88046859"/>
     <w:p>
       <w:pPr>
         <w:pStyle w:val="Heading3"/>
@@ -1423,8 +1423,8 @@
         <w:t xml:space="preserve">efficacy or of the candidate rank order.</w:t>
       </w:r>
     </w:p>
-    <w:bookmarkEnd w:id="23"/>
-    <w:bookmarkStart w:id="24" w:name="robustness-of-the-ranking"/>
+    <w:bookmarkEnd w:id="34"/>
+    <w:bookmarkStart w:id="35" w:name="robustness-of-the-ranking"/>
     <w:p>
       <w:pPr>
         <w:pStyle w:val="Heading3"/>
@@ -1477,10 +1477,608 @@
         <w:t xml:space="preserve">(Table 1, robustness columns), defining a robust core panel.</w:t>
       </w:r>
     </w:p>
-    <w:bookmarkEnd w:id="24"/>
-    <w:bookmarkEnd w:id="25"/>
-    <w:bookmarkEnd w:id="26"/>
-    <w:bookmarkStart w:id="45" w:name="figures"/>
+    <w:bookmarkEnd w:id="35"/>
+    <w:bookmarkEnd w:id="36"/>
+    <w:bookmarkStart w:id="37" w:name="discussion"/>
+    <w:p>
+      <w:pPr>
+        <w:pStyle w:val="Heading2"/>
+      </w:pPr>
+      <w:r>
+        <w:t xml:space="preserve">Discussion</w:t>
+      </w:r>
+    </w:p>
+    <w:p>
+      <w:pPr>
+        <w:pStyle w:val="FirstParagraph"/>
+      </w:pPr>
+      <w:r>
+        <w:t xml:space="preserve">Effective systemic options for HNSCC remain limited, and developing new agents de novo is slow and</w:t>
+      </w:r>
+      <w:r>
+        <w:t xml:space="preserve"> </w:t>
+      </w:r>
+      <w:r>
+        <w:t xml:space="preserve">costly; drug repurposing offers a faster, lower-risk route to deployable therapy</w:t>
+      </w:r>
+      <w:r>
+        <w:t xml:space="preserve"> </w:t>
+      </w:r>
+      <w:r>
+        <w:t xml:space="preserve">[@pushpakom2019; @tanoli2025]. Starting from the proteomes of paired HNSCC tumors, this study</w:t>
+      </w:r>
+      <w:r>
+        <w:t xml:space="preserve"> </w:t>
+      </w:r>
+      <w:r>
+        <w:t xml:space="preserve">proposes a credible, mechanistically organized shortlist of repurposing candidates that resolves</w:t>
+      </w:r>
+      <w:r>
+        <w:t xml:space="preserve"> </w:t>
+      </w:r>
+      <w:r>
+        <w:t xml:space="preserve">into interpretable therapeutic axes (EGFR, epigenetic, proteasome, and metabolic), each with a</w:t>
+      </w:r>
+      <w:r>
+        <w:t xml:space="preserve"> </w:t>
+      </w:r>
+      <w:r>
+        <w:t xml:space="preserve">biological rationale a translational reader can evaluate. Two observations argue for taking the</w:t>
+      </w:r>
+      <w:r>
+        <w:t xml:space="preserve"> </w:t>
+      </w:r>
+      <w:r>
+        <w:t xml:space="preserve">shortlist seriously. First, without disease-specific tuning, the analysis re-discovered the EGFR</w:t>
+      </w:r>
+      <w:r>
+        <w:t xml:space="preserve"> </w:t>
+      </w:r>
+      <w:r>
+        <w:t xml:space="preserve">axis, the molecular target with established approved therapy in HNSCC [@burtness2019; @carosi2026].</w:t>
+      </w:r>
+      <w:r>
+        <w:t xml:space="preserve"> </w:t>
+      </w:r>
+      <w:r>
+        <w:t xml:space="preserve">Second, the direction of change in the prioritized targets was reproduced across two independent</w:t>
+      </w:r>
+      <w:r>
+        <w:t xml:space="preserve"> </w:t>
+      </w:r>
+      <w:r>
+        <w:t xml:space="preserve">cohorts. The prioritization procedure itself, which weighs where a target sits in the tumor protein</w:t>
+      </w:r>
+      <w:r>
+        <w:t xml:space="preserve"> </w:t>
+      </w:r>
+      <w:r>
+        <w:t xml:space="preserve">network alongside how deployable its drug is rather than fold-change magnitude alone, is the means</w:t>
+      </w:r>
+      <w:r>
+        <w:t xml:space="preserve"> </w:t>
+      </w:r>
+      <w:r>
+        <w:t xml:space="preserve">to this end rather than the focus of the work.</w:t>
+      </w:r>
+    </w:p>
+    <w:p>
+      <w:pPr>
+        <w:pStyle w:val="BodyText"/>
+      </w:pPr>
+      <w:r>
+        <w:t xml:space="preserve">The unsupervised recovery of cetuximab at the top of the ranking (composite 0.73), accompanied by</w:t>
+      </w:r>
+      <w:r>
+        <w:t xml:space="preserve"> </w:t>
+      </w:r>
+      <w:r>
+        <w:t xml:space="preserve">other approved EGFR-directed agents, served as an internal positive control: a method that</w:t>
+      </w:r>
+      <w:r>
+        <w:t xml:space="preserve"> </w:t>
+      </w:r>
+      <w:r>
+        <w:t xml:space="preserve">independently elevates the established standard target is more credible when it also nominates less</w:t>
+      </w:r>
+      <w:r>
+        <w:t xml:space="preserve"> </w:t>
+      </w:r>
+      <w:r>
+        <w:t xml:space="preserve">obvious ones. Beyond this control, the result invites viewing EGFR not as an isolated receptor but</w:t>
+      </w:r>
+      <w:r>
+        <w:t xml:space="preserve"> </w:t>
+      </w:r>
+      <w:r>
+        <w:t xml:space="preserve">as a central hub within a broader signaling network. EGFR is frequently overexpressed in HNSCC, yet</w:t>
+      </w:r>
+      <w:r>
+        <w:t xml:space="preserve"> </w:t>
+      </w:r>
+      <w:r>
+        <w:t xml:space="preserve">single-agent anti-EGFR benefit is limited, a limitation that has been attributed to intrinsic and</w:t>
+      </w:r>
+      <w:r>
+        <w:t xml:space="preserve"> </w:t>
+      </w:r>
+      <w:r>
+        <w:t xml:space="preserve">acquired resistance, including compensatory receptor tyrosine kinase activation, downstream pathway</w:t>
+      </w:r>
+      <w:r>
+        <w:t xml:space="preserve"> </w:t>
+      </w:r>
+      <w:r>
+        <w:t xml:space="preserve">alterations, and epithelial-mesenchymal transition [@carosi2026]. Viewing EGFR as a network node</w:t>
+      </w:r>
+      <w:r>
+        <w:t xml:space="preserve"> </w:t>
+      </w:r>
+      <w:r>
+        <w:t xml:space="preserve">rather than a solitary target is consistent with the rationale for the combination strategies (dual</w:t>
+      </w:r>
+      <w:r>
+        <w:t xml:space="preserve"> </w:t>
+      </w:r>
+      <w:r>
+        <w:t xml:space="preserve">EGFR blockade, pan-HER inhibitors, or EGFR inhibition plus immunomodulation) currently being</w:t>
+      </w:r>
+      <w:r>
+        <w:t xml:space="preserve"> </w:t>
+      </w:r>
+      <w:r>
+        <w:t xml:space="preserve">explored to overcome resistance [@carosi2026; @bhatia2023]. The same network logic that recovers</w:t>
+      </w:r>
+      <w:r>
+        <w:t xml:space="preserve"> </w:t>
+      </w:r>
+      <w:r>
+        <w:t xml:space="preserve">EGFR also organizes the remaining candidates into interpretable mechanistic axes.</w:t>
+      </w:r>
+    </w:p>
+    <w:p>
+      <w:pPr>
+        <w:pStyle w:val="BodyText"/>
+      </w:pPr>
+      <w:r>
+        <w:t xml:space="preserve">Two non-canonical axes are, in our reading, the most novel. The epigenetic axis, anchored by DNMT1</w:t>
+      </w:r>
+      <w:r>
+        <w:t xml:space="preserve"> </w:t>
+      </w:r>
+      <w:r>
+        <w:t xml:space="preserve">(decitabine, azacitidine) and MAOA (tranylcypromine), suggests that chromatin and DNA-methylation</w:t>
+      </w:r>
+      <w:r>
+        <w:t xml:space="preserve"> </w:t>
+      </w:r>
+      <w:r>
+        <w:t xml:space="preserve">regulators may be an integral part of the HNSCC tumor state rather than only a secondary</w:t>
+      </w:r>
+      <w:r>
+        <w:t xml:space="preserve"> </w:t>
+      </w:r>
+      <w:r>
+        <w:t xml:space="preserve">epiphenomenon. This axis carries a plausible translational rationale: DNA methyltransferase</w:t>
+      </w:r>
+      <w:r>
+        <w:t xml:space="preserve"> </w:t>
+      </w:r>
+      <w:r>
+        <w:t xml:space="preserve">inhibition can increase tumor immunogenicity and remodel the immune microenvironment, which</w:t>
+      </w:r>
+      <w:r>
+        <w:t xml:space="preserve"> </w:t>
+      </w:r>
+      <w:r>
+        <w:t xml:space="preserve">provides a mechanistic basis for combining hypomethylating agents with immune-checkpoint inhibitors</w:t>
+      </w:r>
+      <w:r>
+        <w:t xml:space="preserve"> </w:t>
+      </w:r>
+      <w:r>
+        <w:t xml:space="preserve">[@bear2025]. A recent phase 2 window trial reported that decitabine followed by pembrolizumab</w:t>
+      </w:r>
+      <w:r>
+        <w:t xml:space="preserve"> </w:t>
+      </w:r>
+      <w:r>
+        <w:t xml:space="preserve">increased tumor-infiltrating lymphocytes and PD-L1 expression and reduced myeloid-derived</w:t>
+      </w:r>
+      <w:r>
+        <w:t xml:space="preserve"> </w:t>
+      </w:r>
+      <w:r>
+        <w:t xml:space="preserve">suppressor cells before standard therapy [@bear2025], illustrating the prime-then-checkpoint</w:t>
+      </w:r>
+      <w:r>
+        <w:t xml:space="preserve"> </w:t>
+      </w:r>
+      <w:r>
+        <w:t xml:space="preserve">strategy that our epigenetic nominations would support, an approach now being explored clinically.</w:t>
+      </w:r>
+      <w:r>
+        <w:t xml:space="preserve"> </w:t>
+      </w:r>
+      <w:r>
+        <w:t xml:space="preserve">The proteasome axis, anchored by the 20S subunits PSMA2 and PSMB3 (carfilzomib), points to a</w:t>
+      </w:r>
+      <w:r>
+        <w:t xml:space="preserve"> </w:t>
+      </w:r>
+      <w:r>
+        <w:t xml:space="preserve">possible dependence on protein homeostasis: a high biosynthetic burden and accumulation of</w:t>
+      </w:r>
+      <w:r>
+        <w:t xml:space="preserve"> </w:t>
+      </w:r>
+      <w:r>
+        <w:t xml:space="preserve">misfolded proteins could render HNSCC cells reliant on proteasomal clearance, a vulnerability that</w:t>
+      </w:r>
+      <w:r>
+        <w:t xml:space="preserve"> </w:t>
+      </w:r>
+      <w:r>
+        <w:t xml:space="preserve">next-generation proteasome inhibitors such as carfilzomib and oprozomib have been reported to</w:t>
+      </w:r>
+      <w:r>
+        <w:t xml:space="preserve"> </w:t>
+      </w:r>
+      <w:r>
+        <w:t xml:space="preserve">exploit in HNSCC preclinical models, in part through induction of the unfolded protein response</w:t>
+      </w:r>
+      <w:r>
+        <w:t xml:space="preserve"> </w:t>
+      </w:r>
+      <w:r>
+        <w:t xml:space="preserve">[@zang2012]. Proteostasis targeting is clinically established in hematologic malignancies but</w:t>
+      </w:r>
+      <w:r>
+        <w:t xml:space="preserve"> </w:t>
+      </w:r>
+      <w:r>
+        <w:t xml:space="preserve">comparatively under-explored in solid tumors such as HNSCC [@zang2012], which positions this axis</w:t>
+      </w:r>
+      <w:r>
+        <w:t xml:space="preserve"> </w:t>
+      </w:r>
+      <w:r>
+        <w:t xml:space="preserve">as a hypothesis worth dedicated preclinical testing rather than an established therapy. A feature</w:t>
+      </w:r>
+      <w:r>
+        <w:t xml:space="preserve"> </w:t>
+      </w:r>
+      <w:r>
+        <w:t xml:space="preserve">that distinguishes both axes from EGFR is that their anchors are differentially abundant nodes whose</w:t>
+      </w:r>
+      <w:r>
+        <w:t xml:space="preserve"> </w:t>
+      </w:r>
+      <w:r>
+        <w:t xml:space="preserve">proposed therapeutic logic would be reprogramming or stress-exploitation rather than the simple</w:t>
+      </w:r>
+      <w:r>
+        <w:t xml:space="preserve"> </w:t>
+      </w:r>
+      <w:r>
+        <w:t xml:space="preserve">inhibition of an overexpressed driver.</w:t>
+      </w:r>
+    </w:p>
+    <w:p>
+      <w:pPr>
+        <w:pStyle w:val="BodyText"/>
+      </w:pPr>
+      <w:r>
+        <w:t xml:space="preserve">The metabolic axis requires the most careful framing. Unlike EGFR, which is over-abundant and</w:t>
+      </w:r>
+      <w:r>
+        <w:t xml:space="preserve"> </w:t>
+      </w:r>
+      <w:r>
+        <w:t xml:space="preserve">addressed by direct inhibition, Complex I subunits were robustly under-abundant in tumors</w:t>
+      </w:r>
+      <w:r>
+        <w:t xml:space="preserve"> </w:t>
+      </w:r>
+      <w:r>
+        <w:t xml:space="preserve">(NDUFS2 log2FC = -3.05), a direction reproduced in both the CPTAC proteome and the TCGA</w:t>
+      </w:r>
+      <w:r>
+        <w:t xml:space="preserve"> </w:t>
+      </w:r>
+      <w:r>
+        <w:t xml:space="preserve">transcriptome and consistent with a glycolytic, Warburg-like shift. Metformin rose to the top of</w:t>
+      </w:r>
+      <w:r>
+        <w:t xml:space="preserve"> </w:t>
+      </w:r>
+      <w:r>
+        <w:t xml:space="preserve">the metabolic module (composite 0.591) through the high network centrality of its anchor, NDUFS2,</w:t>
+      </w:r>
+      <w:r>
+        <w:t xml:space="preserve"> </w:t>
+      </w:r>
+      <w:r>
+        <w:t xml:space="preserve">independent of fold-change direction. Its nomination therefore rests on a metabolic-vulnerability</w:t>
+      </w:r>
+      <w:r>
+        <w:t xml:space="preserve"> </w:t>
+      </w:r>
+      <w:r>
+        <w:t xml:space="preserve">rationale rather than on target overexpression: residual oxidative-phosphorylation dependence may</w:t>
+      </w:r>
+      <w:r>
+        <w:t xml:space="preserve"> </w:t>
+      </w:r>
+      <w:r>
+        <w:t xml:space="preserve">remain a targetable feature of cancer cells, and Complex I inhibition has been reported to exert</w:t>
+      </w:r>
+      <w:r>
+        <w:t xml:space="preserve"> </w:t>
+      </w:r>
+      <w:r>
+        <w:t xml:space="preserve">immunometabolic effects on the tumor microenvironment [@pujaltemartin2024]. In HNSCC specifically,</w:t>
+      </w:r>
+      <w:r>
+        <w:t xml:space="preserve"> </w:t>
+      </w:r>
+      <w:r>
+        <w:t xml:space="preserve">metformin use has been associated with improved outcomes and may act in part through immune</w:t>
+      </w:r>
+      <w:r>
+        <w:t xml:space="preserve"> </w:t>
+      </w:r>
+      <w:r>
+        <w:t xml:space="preserve">mechanisms, including increased CD8+ infiltration and enhanced natural-killer-cell cytotoxicity</w:t>
+      </w:r>
+      <w:r>
+        <w:t xml:space="preserve"> </w:t>
+      </w:r>
+      <w:r>
+        <w:t xml:space="preserve">[@curry2018; @crist2022]. Because single-agent metformin trials have been less effective than</w:t>
+      </w:r>
+      <w:r>
+        <w:t xml:space="preserve"> </w:t>
+      </w:r>
+      <w:r>
+        <w:t xml:space="preserve">observational data suggested [@pujaltemartin2024], and early-phase HNSCC studies indicate</w:t>
+      </w:r>
+      <w:r>
+        <w:t xml:space="preserve"> </w:t>
+      </w:r>
+      <w:r>
+        <w:t xml:space="preserve">tolerability in combination with chemoradiation [@kemnade2023], we position metformin as a</w:t>
+      </w:r>
+      <w:r>
+        <w:t xml:space="preserve"> </w:t>
+      </w:r>
+      <w:r>
+        <w:t xml:space="preserve">combination candidate (with chemoradiation or immunotherapy) rather than as a single-agent</w:t>
+      </w:r>
+      <w:r>
+        <w:t xml:space="preserve"> </w:t>
+      </w:r>
+      <w:r>
+        <w:t xml:space="preserve">inhibitor of an over-expressed target.</w:t>
+      </w:r>
+    </w:p>
+    <w:p>
+      <w:pPr>
+        <w:pStyle w:val="BodyText"/>
+      </w:pPr>
+      <w:r>
+        <w:t xml:space="preserve">More broadly, weighting network position together with drug deployability and cross-cohort support</w:t>
+      </w:r>
+      <w:r>
+        <w:t xml:space="preserve"> </w:t>
+      </w:r>
+      <w:r>
+        <w:t xml:space="preserve">is intended to yield a list that is actionable, not merely ranked. By design the composite is</w:t>
+      </w:r>
+      <w:r>
+        <w:t xml:space="preserve"> </w:t>
+      </w:r>
+      <w:r>
+        <w:t xml:space="preserve">dominated by network centrality (Spearman rho approximately 0.78 with centrality alone), with the</w:t>
+      </w:r>
+      <w:r>
+        <w:t xml:space="preserve"> </w:t>
+      </w:r>
+      <w:r>
+        <w:t xml:space="preserve">drug-level DrugViability term acting mainly as a clinical and pharmacological tie-breaker among</w:t>
+      </w:r>
+      <w:r>
+        <w:t xml:space="preserve"> </w:t>
+      </w:r>
+      <w:r>
+        <w:t xml:space="preserve">agents that share a target; we therefore present the score as a transparent aggregation of evidence</w:t>
+      </w:r>
+      <w:r>
+        <w:t xml:space="preserve"> </w:t>
+      </w:r>
+      <w:r>
+        <w:t xml:space="preserve">rather than as a method whose superiority over fold-change or database-count ranking is</w:t>
+      </w:r>
+      <w:r>
+        <w:t xml:space="preserve"> </w:t>
+      </w:r>
+      <w:r>
+        <w:t xml:space="preserve">established, a comparison that would require dedicated benchmarking [@pushpakom2019; @tanoli2025].</w:t>
+      </w:r>
+      <w:r>
+        <w:t xml:space="preserve"> </w:t>
+      </w:r>
+      <w:r>
+        <w:t xml:space="preserve">This network-centric view, in which therapeutic effect may depend on modulating functional modules</w:t>
+      </w:r>
+      <w:r>
+        <w:t xml:space="preserve"> </w:t>
+      </w:r>
+      <w:r>
+        <w:t xml:space="preserve">rather than single proteins, is consistent with network-medicine principles [@barabasi2011].</w:t>
+      </w:r>
+      <w:r>
+        <w:t xml:space="preserve"> </w:t>
+      </w:r>
+      <w:r>
+        <w:t xml:space="preserve">Several prioritized agents are approved for non-oncologic indications (valproate, acetazolamide,</w:t>
+      </w:r>
+      <w:r>
+        <w:t xml:space="preserve"> </w:t>
+      </w:r>
+      <w:r>
+        <w:t xml:space="preserve">disulfiram) and could in principle offer short-horizon, accessible repurposing options. The</w:t>
+      </w:r>
+      <w:r>
+        <w:t xml:space="preserve"> </w:t>
+      </w:r>
+      <w:r>
+        <w:t xml:space="preserve">relevance of such combination candidates may be heightened by the field’s shift toward</w:t>
+      </w:r>
+      <w:r>
+        <w:t xml:space="preserve"> </w:t>
+      </w:r>
+      <w:r>
+        <w:t xml:space="preserve">perioperative, immunotherapy-based regimens in resectable HNSCC [@uppaluri2025], a setting in which</w:t>
+      </w:r>
+      <w:r>
+        <w:t xml:space="preserve"> </w:t>
+      </w:r>
+      <w:r>
+        <w:t xml:space="preserve">agents that prime or sensitize the tumor microenvironment could complement checkpoint blockade,</w:t>
+      </w:r>
+      <w:r>
+        <w:t xml:space="preserve"> </w:t>
+      </w:r>
+      <w:r>
+        <w:t xml:space="preserve">although our data speak to target biology rather than to patient selection.</w:t>
+      </w:r>
+    </w:p>
+    <w:p>
+      <w:pPr>
+        <w:pStyle w:val="BodyText"/>
+      </w:pPr>
+      <w:r>
+        <w:t xml:space="preserve">Several limitations bound these conclusions. The discovery cohort is small (10 paired specimens);</w:t>
+      </w:r>
+      <w:r>
+        <w:t xml:space="preserve"> </w:t>
+      </w:r>
+      <w:r>
+        <w:t xml:space="preserve">cross-cohort corroboration mitigates but does not replace adequately powered confirmation. Tumor</w:t>
+      </w:r>
+      <w:r>
+        <w:t xml:space="preserve"> </w:t>
+      </w:r>
+      <w:r>
+        <w:t xml:space="preserve">and adjacent-normal specimens differ in cellular composition, and muscle and respiratory-mucosa</w:t>
+      </w:r>
+      <w:r>
+        <w:t xml:space="preserve"> </w:t>
+      </w:r>
+      <w:r>
+        <w:t xml:space="preserve">signals in the down-regulated proteome likely reflect tissue context rather than tumor-intrinsic</w:t>
+      </w:r>
+      <w:r>
+        <w:t xml:space="preserve"> </w:t>
+      </w:r>
+      <w:r>
+        <w:t xml:space="preserve">biology; hallmark terms such as Myogenesis and Adipogenesis should be read accordingly, although</w:t>
+      </w:r>
+      <w:r>
+        <w:t xml:space="preserve"> </w:t>
+      </w:r>
+      <w:r>
+        <w:t xml:space="preserve">sensitivity analyses excluding tissue-composition markers left the prioritized targets and the</w:t>
+      </w:r>
+      <w:r>
+        <w:t xml:space="preserve"> </w:t>
+      </w:r>
+      <w:r>
+        <w:t xml:space="preserve">oxidative-phosphorylation axis essentially unchanged. Data-independent acquisition with MinProb</w:t>
+      </w:r>
+      <w:r>
+        <w:t xml:space="preserve"> </w:t>
+      </w:r>
+      <w:r>
+        <w:t xml:space="preserve">imputation can mildly bias proteins absent from tumor tissue toward apparent under-abundance, an</w:t>
+      </w:r>
+      <w:r>
+        <w:t xml:space="preserve"> </w:t>
+      </w:r>
+      <w:r>
+        <w:t xml:space="preserve">effect that appears to be largely genuine biology and affected only a small minority of</w:t>
+      </w:r>
+      <w:r>
+        <w:t xml:space="preserve"> </w:t>
+      </w:r>
+      <w:r>
+        <w:t xml:space="preserve">under-abundant proteins. The differential-abundance component of the score is directional,</w:t>
+      </w:r>
+      <w:r>
+        <w:t xml:space="preserve"> </w:t>
+      </w:r>
+      <w:r>
+        <w:t xml:space="preserve">rewarding inhibition of over-abundant targets, so under-abundant or potential tumor-suppressor</w:t>
+      </w:r>
+      <w:r>
+        <w:t xml:space="preserve"> </w:t>
+      </w:r>
+      <w:r>
+        <w:t xml:space="preserve">nodes are structurally down-weighted and reach prioritization mainly through centrality, as for the</w:t>
+      </w:r>
+      <w:r>
+        <w:t xml:space="preserve"> </w:t>
+      </w:r>
+      <w:r>
+        <w:t xml:space="preserve">metabolic axis. Crucially, the external cohorts corroborate the direction of change in the</w:t>
+      </w:r>
+      <w:r>
+        <w:t xml:space="preserve"> </w:t>
+      </w:r>
+      <w:r>
+        <w:t xml:space="preserve">prioritized targets; they do not test drug efficacy or the candidate rank order, and four anchors</w:t>
+      </w:r>
+      <w:r>
+        <w:t xml:space="preserve"> </w:t>
+      </w:r>
+      <w:r>
+        <w:t xml:space="preserve">(PDE6D, CA2, CDA, RPS11) were weakly concordant or discordant and should be treated as</w:t>
+      </w:r>
+      <w:r>
+        <w:t xml:space="preserve"> </w:t>
+      </w:r>
+      <w:r>
+        <w:t xml:space="preserve">lower-confidence nominations. Finally, this is an in silico prioritization: the candidates are</w:t>
+      </w:r>
+      <w:r>
+        <w:t xml:space="preserve"> </w:t>
+      </w:r>
+      <w:r>
+        <w:t xml:space="preserve">hypotheses, and functional preclinical validation will be required, particularly for the</w:t>
+      </w:r>
+      <w:r>
+        <w:t xml:space="preserve"> </w:t>
+      </w:r>
+      <w:r>
+        <w:t xml:space="preserve">under-explored epigenetic and proteasome axes. Within these bounds, the study offers a credible,</w:t>
+      </w:r>
+      <w:r>
+        <w:t xml:space="preserve"> </w:t>
+      </w:r>
+      <w:r>
+        <w:t xml:space="preserve">mechanism-organized set of repurposing candidates and a prioritized agenda for preclinical and</w:t>
+      </w:r>
+      <w:r>
+        <w:t xml:space="preserve"> </w:t>
+      </w:r>
+      <w:r>
+        <w:t xml:space="preserve">combination-trial follow-up in HNSCC.</w:t>
+      </w:r>
+    </w:p>
+    <w:bookmarkEnd w:id="37"/>
+    <w:bookmarkEnd w:id="38"/>
+    <w:bookmarkStart w:id="57" w:name="figures"/>
     <w:p>
       <w:pPr>
         <w:pStyle w:val="Heading1"/>
@@ -1498,18 +2096,18 @@
           <wp:inline>
             <wp:extent cx="5334000" cy="2581427"/>
             <wp:effectExtent b="0" l="0" r="0" t="0"/>
-            <wp:docPr descr="" title="" id="28" name="Picture"/>
+            <wp:docPr descr="" title="" id="40" name="Picture"/>
             <a:graphic>
               <a:graphicData uri="http://schemas.openxmlformats.org/drawingml/2006/picture">
                 <pic:pic>
                   <pic:nvPicPr>
-                    <pic:cNvPr descr="../../results/figures/pub/main/Fig1_workflow.png" id="29" name="Picture"/>
+                    <pic:cNvPr descr="../../results/figures/pub/main/Fig1_workflow.png" id="41" name="Picture"/>
                     <pic:cNvPicPr>
                       <a:picLocks noChangeArrowheads="1" noChangeAspect="1"/>
                     </pic:cNvPicPr>
                   </pic:nvPicPr>
                   <pic:blipFill>
-                    <a:blip r:embed="rId27"/>
+                    <a:blip r:embed="rId39"/>
                     <a:stretch>
                       <a:fillRect/>
                     </a:stretch>
@@ -1627,18 +2225,18 @@
           <wp:inline>
             <wp:extent cx="5334000" cy="6325590"/>
             <wp:effectExtent b="0" l="0" r="0" t="0"/>
-            <wp:docPr descr="" title="" id="31" name="Picture"/>
+            <wp:docPr descr="" title="" id="43" name="Picture"/>
             <a:graphic>
               <a:graphicData uri="http://schemas.openxmlformats.org/drawingml/2006/picture">
                 <pic:pic>
                   <pic:nvPicPr>
-                    <pic:cNvPr descr="../../results/figures/pub/main/Fig2_multipanel.png" id="32" name="Picture"/>
+                    <pic:cNvPr descr="../../results/figures/pub/main/Fig2_multipanel.png" id="44" name="Picture"/>
                     <pic:cNvPicPr>
                       <a:picLocks noChangeArrowheads="1" noChangeAspect="1"/>
                     </pic:cNvPicPr>
                   </pic:nvPicPr>
                   <pic:blipFill>
-                    <a:blip r:embed="rId30"/>
+                    <a:blip r:embed="rId42"/>
                     <a:stretch>
                       <a:fillRect/>
                     </a:stretch>
@@ -1675,11 +2273,11 @@
     </w:p>
     <w:p>
       <w:pPr>
-        <w:pStyle w:val="Compact"/>
         <w:numPr>
           <w:ilvl w:val="0"/>
           <w:numId w:val="1001"/>
         </w:numPr>
+        <w:pStyle w:val="Compact"/>
       </w:pPr>
       <w:r>
         <w:t xml:space="preserve">Volcano plot of differential protein abundance in tumor versus adjacent-normal tissue</w:t>
@@ -1760,18 +2358,18 @@
           <wp:inline>
             <wp:extent cx="5334000" cy="4161315"/>
             <wp:effectExtent b="0" l="0" r="0" t="0"/>
-            <wp:docPr descr="" title="" id="34" name="Picture"/>
+            <wp:docPr descr="" title="" id="46" name="Picture"/>
             <a:graphic>
               <a:graphicData uri="http://schemas.openxmlformats.org/drawingml/2006/picture">
                 <pic:pic>
                   <pic:nvPicPr>
-                    <pic:cNvPr descr="../../results/figures/pub/main/Fig3_multipanel.png" id="35" name="Picture"/>
+                    <pic:cNvPr descr="../../results/figures/pub/main/Fig3_multipanel.png" id="47" name="Picture"/>
                     <pic:cNvPicPr>
                       <a:picLocks noChangeArrowheads="1" noChangeAspect="1"/>
                     </pic:cNvPicPr>
                   </pic:nvPicPr>
                   <pic:blipFill>
-                    <a:blip r:embed="rId33"/>
+                    <a:blip r:embed="rId45"/>
                     <a:stretch>
                       <a:fillRect/>
                     </a:stretch>
@@ -1859,18 +2457,18 @@
           <wp:inline>
             <wp:extent cx="5334000" cy="4315026"/>
             <wp:effectExtent b="0" l="0" r="0" t="0"/>
-            <wp:docPr descr="" title="" id="37" name="Picture"/>
+            <wp:docPr descr="" title="" id="49" name="Picture"/>
             <a:graphic>
               <a:graphicData uri="http://schemas.openxmlformats.org/drawingml/2006/picture">
                 <pic:pic>
                   <pic:nvPicPr>
-                    <pic:cNvPr descr="../../results/figures/pub/main/Fig4_multipanel.png" id="38" name="Picture"/>
+                    <pic:cNvPr descr="../../results/figures/pub/main/Fig4_multipanel.png" id="50" name="Picture"/>
                     <pic:cNvPicPr>
                       <a:picLocks noChangeArrowheads="1" noChangeAspect="1"/>
                     </pic:cNvPicPr>
                   </pic:nvPicPr>
                   <pic:blipFill>
-                    <a:blip r:embed="rId36"/>
+                    <a:blip r:embed="rId48"/>
                     <a:stretch>
                       <a:fillRect/>
                     </a:stretch>
@@ -1907,11 +2505,11 @@
     </w:p>
     <w:p>
       <w:pPr>
-        <w:pStyle w:val="Compact"/>
         <w:numPr>
           <w:ilvl w:val="0"/>
           <w:numId w:val="1002"/>
         </w:numPr>
+        <w:pStyle w:val="Compact"/>
       </w:pPr>
       <w:r>
         <w:t xml:space="preserve">Tumor PPI network (STRING) arranged with a stress layout that emphasizes intra-module</w:t>
@@ -1968,18 +2566,18 @@
           <wp:inline>
             <wp:extent cx="5334000" cy="2587953"/>
             <wp:effectExtent b="0" l="0" r="0" t="0"/>
-            <wp:docPr descr="" title="" id="40" name="Picture"/>
+            <wp:docPr descr="" title="" id="52" name="Picture"/>
             <a:graphic>
               <a:graphicData uri="http://schemas.openxmlformats.org/drawingml/2006/picture">
                 <pic:pic>
                   <pic:nvPicPr>
-                    <pic:cNvPr descr="../../results/figures/pub/main/Fig5_multipanel.png" id="41" name="Picture"/>
+                    <pic:cNvPr descr="../../results/figures/pub/main/Fig5_multipanel.png" id="53" name="Picture"/>
                     <pic:cNvPicPr>
                       <a:picLocks noChangeArrowheads="1" noChangeAspect="1"/>
                     </pic:cNvPicPr>
                   </pic:nvPicPr>
                   <pic:blipFill>
-                    <a:blip r:embed="rId39"/>
+                    <a:blip r:embed="rId51"/>
                     <a:stretch>
                       <a:fillRect/>
                     </a:stretch>
@@ -2016,11 +2614,11 @@
     </w:p>
     <w:p>
       <w:pPr>
-        <w:pStyle w:val="Compact"/>
         <w:numPr>
           <w:ilvl w:val="0"/>
           <w:numId w:val="1003"/>
         </w:numPr>
+        <w:pStyle w:val="Compact"/>
       </w:pPr>
       <w:r>
         <w:t xml:space="preserve">Prioritized shortlist faceted by tier, with each candidate’s composite score</w:t>
@@ -2101,18 +2699,18 @@
           <wp:inline>
             <wp:extent cx="5334000" cy="4393409"/>
             <wp:effectExtent b="0" l="0" r="0" t="0"/>
-            <wp:docPr descr="" title="" id="43" name="Picture"/>
+            <wp:docPr descr="" title="" id="55" name="Picture"/>
             <a:graphic>
               <a:graphicData uri="http://schemas.openxmlformats.org/drawingml/2006/picture">
                 <pic:pic>
                   <pic:nvPicPr>
-                    <pic:cNvPr descr="../../results/figures/pub/main/Fig6_multipanel.png" id="44" name="Picture"/>
+                    <pic:cNvPr descr="../../results/figures/pub/main/Fig6_multipanel.png" id="56" name="Picture"/>
                     <pic:cNvPicPr>
                       <a:picLocks noChangeArrowheads="1" noChangeAspect="1"/>
                     </pic:cNvPicPr>
                   </pic:nvPicPr>
                   <pic:blipFill>
-                    <a:blip r:embed="rId42"/>
+                    <a:blip r:embed="rId54"/>
                     <a:stretch>
                       <a:fillRect/>
                     </a:stretch>
@@ -2240,8 +2838,8 @@
         </w:pict>
       </w:r>
     </w:p>
-    <w:bookmarkEnd w:id="45"/>
-    <w:bookmarkStart w:id="46" w:name="tables"/>
+    <w:bookmarkEnd w:id="57"/>
+    <w:bookmarkStart w:id="58" w:name="tables"/>
     <w:p>
       <w:pPr>
         <w:pStyle w:val="Heading1"/>
@@ -2254,8 +2852,8 @@
       <w:tblPr>
         <w:tblStyle w:val="Table"/>
         <w:tblW w:type="pct" w:w="5000"/>
-        <w:tblLayout w:type="fixed"/>
         <w:tblLook w:firstRow="1" w:lastRow="0" w:firstColumn="0" w:lastColumn="0" w:noHBand="0" w:noVBand="0" w:val="0020"/>
+        <w:jc w:val="start"/>
       </w:tblPr>
       <w:tblGrid>
         <w:gridCol w:w="660"/>
@@ -2273,13 +2871,14 @@
       </w:tblGrid>
       <w:tr>
         <w:trPr>
-          <w:tblHeader w:val="on"/>
+          <w:tblHeader w:val="true"/>
         </w:trPr>
         <w:tc>
           <w:tcPr/>
           <w:p>
             <w:pPr>
               <w:pStyle w:val="Compact"/>
+              <w:jc w:val="left"/>
             </w:pPr>
             <w:r>
               <w:t xml:space="preserve">Drug</w:t>
@@ -2291,6 +2890,7 @@
           <w:p>
             <w:pPr>
               <w:pStyle w:val="Compact"/>
+              <w:jc w:val="left"/>
             </w:pPr>
             <w:r>
               <w:t xml:space="preserve">Block / tier</w:t>
@@ -2302,6 +2902,7 @@
           <w:p>
             <w:pPr>
               <w:pStyle w:val="Compact"/>
+              <w:jc w:val="left"/>
             </w:pPr>
             <w:r>
               <w:t xml:space="preserve">Module / subclass</w:t>
@@ -2313,6 +2914,7 @@
           <w:p>
             <w:pPr>
               <w:pStyle w:val="Compact"/>
+              <w:jc w:val="left"/>
             </w:pPr>
             <w:r>
               <w:t xml:space="preserve">Anchor target</w:t>
@@ -2324,6 +2926,7 @@
           <w:p>
             <w:pPr>
               <w:pStyle w:val="Compact"/>
+              <w:jc w:val="left"/>
             </w:pPr>
             <w:r>
               <w:t xml:space="preserve">Max clinical phase</w:t>
@@ -2335,6 +2938,7 @@
           <w:p>
             <w:pPr>
               <w:pStyle w:val="Compact"/>
+              <w:jc w:val="left"/>
             </w:pPr>
             <w:r>
               <w:t xml:space="preserve">HNSCC-approved</w:t>
@@ -2346,6 +2950,7 @@
           <w:p>
             <w:pPr>
               <w:pStyle w:val="Compact"/>
+              <w:jc w:val="left"/>
             </w:pPr>
             <w:r>
               <w:t xml:space="preserve">Composite</w:t>
@@ -2357,6 +2962,7 @@
           <w:p>
             <w:pPr>
               <w:pStyle w:val="Compact"/>
+              <w:jc w:val="left"/>
             </w:pPr>
             <w:r>
               <w:t xml:space="preserve">TP</w:t>
@@ -2368,6 +2974,7 @@
           <w:p>
             <w:pPr>
               <w:pStyle w:val="Compact"/>
+              <w:jc w:val="left"/>
             </w:pPr>
             <w:r>
               <w:t xml:space="preserve">DV</w:t>
@@ -2379,6 +2986,7 @@
           <w:p>
             <w:pPr>
               <w:pStyle w:val="Compact"/>
+              <w:jc w:val="left"/>
             </w:pPr>
             <w:r>
               <w:t xml:space="preserve">Sources (/4)</w:t>
@@ -2390,6 +2998,7 @@
           <w:p>
             <w:pPr>
               <w:pStyle w:val="Compact"/>
+              <w:jc w:val="left"/>
             </w:pPr>
             <w:r>
               <w:t xml:space="preserve">LOD-stable</w:t>
@@ -2401,6 +3010,7 @@
           <w:p>
             <w:pPr>
               <w:pStyle w:val="Compact"/>
+              <w:jc w:val="left"/>
             </w:pPr>
             <w:r>
               <w:t xml:space="preserve">Robustness (n/6)</w:t>
@@ -2414,6 +3024,7 @@
           <w:p>
             <w:pPr>
               <w:pStyle w:val="Compact"/>
+              <w:jc w:val="left"/>
             </w:pPr>
             <w:r>
               <w:t xml:space="preserve">Cetuximab</w:t>
@@ -2425,6 +3036,7 @@
           <w:p>
             <w:pPr>
               <w:pStyle w:val="Compact"/>
+              <w:jc w:val="left"/>
             </w:pPr>
             <w:r>
               <w:t xml:space="preserve">EGFR control</w:t>
@@ -2436,6 +3048,7 @@
           <w:p>
             <w:pPr>
               <w:pStyle w:val="Compact"/>
+              <w:jc w:val="left"/>
             </w:pPr>
             <w:r>
               <w:t xml:space="preserve">Anti-EGFR antibody/ADC</w:t>
@@ -2447,6 +3060,7 @@
           <w:p>
             <w:pPr>
               <w:pStyle w:val="Compact"/>
+              <w:jc w:val="left"/>
             </w:pPr>
             <w:r>
               <w:t xml:space="preserve">EGFR</w:t>
@@ -2458,6 +3072,7 @@
           <w:p>
             <w:pPr>
               <w:pStyle w:val="Compact"/>
+              <w:jc w:val="left"/>
             </w:pPr>
             <w:r>
               <w:t xml:space="preserve">Approved (Phase IV)</w:t>
@@ -2469,6 +3084,7 @@
           <w:p>
             <w:pPr>
               <w:pStyle w:val="Compact"/>
+              <w:jc w:val="left"/>
             </w:pPr>
             <w:r>
               <w:t xml:space="preserve">Yes</w:t>
@@ -2480,6 +3096,7 @@
           <w:p>
             <w:pPr>
               <w:pStyle w:val="Compact"/>
+              <w:jc w:val="left"/>
             </w:pPr>
             <w:r>
               <w:t xml:space="preserve">0.73</w:t>
@@ -2491,6 +3108,7 @@
           <w:p>
             <w:pPr>
               <w:pStyle w:val="Compact"/>
+              <w:jc w:val="left"/>
             </w:pPr>
             <w:r>
               <w:t xml:space="preserve">0.605</w:t>
@@ -2502,6 +3120,7 @@
           <w:p>
             <w:pPr>
               <w:pStyle w:val="Compact"/>
+              <w:jc w:val="left"/>
             </w:pPr>
             <w:r>
               <w:t xml:space="preserve">0.917</w:t>
@@ -2513,6 +3132,7 @@
           <w:p>
             <w:pPr>
               <w:pStyle w:val="Compact"/>
+              <w:jc w:val="left"/>
             </w:pPr>
             <w:r>
               <w:t xml:space="preserve">3</w:t>
@@ -2524,6 +3144,7 @@
           <w:p>
             <w:pPr>
               <w:pStyle w:val="Compact"/>
+              <w:jc w:val="left"/>
             </w:pPr>
             <w:r>
               <w:t xml:space="preserve">Yes</w:t>
@@ -2535,6 +3156,7 @@
           <w:p>
             <w:pPr>
               <w:pStyle w:val="Compact"/>
+              <w:jc w:val="left"/>
             </w:pPr>
             <w:r>
               <w:t xml:space="preserve">6/6</w:t>
@@ -2548,6 +3170,7 @@
           <w:p>
             <w:pPr>
               <w:pStyle w:val="Compact"/>
+              <w:jc w:val="left"/>
             </w:pPr>
             <w:r>
               <w:t xml:space="preserve">Nimotuzumab</w:t>
@@ -2559,6 +3182,7 @@
           <w:p>
             <w:pPr>
               <w:pStyle w:val="Compact"/>
+              <w:jc w:val="left"/>
             </w:pPr>
             <w:r>
               <w:t xml:space="preserve">EGFR control</w:t>
@@ -2570,6 +3194,7 @@
           <w:p>
             <w:pPr>
               <w:pStyle w:val="Compact"/>
+              <w:jc w:val="left"/>
             </w:pPr>
             <w:r>
               <w:t xml:space="preserve">Anti-EGFR antibody/ADC</w:t>
@@ -2581,6 +3206,7 @@
           <w:p>
             <w:pPr>
               <w:pStyle w:val="Compact"/>
+              <w:jc w:val="left"/>
             </w:pPr>
             <w:r>
               <w:t xml:space="preserve">EGFR</w:t>
@@ -2592,6 +3218,7 @@
           <w:p>
             <w:pPr>
               <w:pStyle w:val="Compact"/>
+              <w:jc w:val="left"/>
             </w:pPr>
             <w:r>
               <w:t xml:space="preserve">Approved (Phase IV)</w:t>
@@ -2603,6 +3230,7 @@
           <w:p>
             <w:pPr>
               <w:pStyle w:val="Compact"/>
+              <w:jc w:val="left"/>
             </w:pPr>
             <w:r>
               <w:t xml:space="preserve">No</w:t>
@@ -2614,6 +3242,7 @@
           <w:p>
             <w:pPr>
               <w:pStyle w:val="Compact"/>
+              <w:jc w:val="left"/>
             </w:pPr>
             <w:r>
               <w:t xml:space="preserve">0.73</w:t>
@@ -2625,6 +3254,7 @@
           <w:p>
             <w:pPr>
               <w:pStyle w:val="Compact"/>
+              <w:jc w:val="left"/>
             </w:pPr>
             <w:r>
               <w:t xml:space="preserve">0.605</w:t>
@@ -2636,6 +3266,7 @@
           <w:p>
             <w:pPr>
               <w:pStyle w:val="Compact"/>
+              <w:jc w:val="left"/>
             </w:pPr>
             <w:r>
               <w:t xml:space="preserve">0.917</w:t>
@@ -2647,6 +3278,7 @@
           <w:p>
             <w:pPr>
               <w:pStyle w:val="Compact"/>
+              <w:jc w:val="left"/>
             </w:pPr>
             <w:r>
               <w:t xml:space="preserve">3</w:t>
@@ -2658,6 +3290,7 @@
           <w:p>
             <w:pPr>
               <w:pStyle w:val="Compact"/>
+              <w:jc w:val="left"/>
             </w:pPr>
             <w:r>
               <w:t xml:space="preserve">Yes</w:t>
@@ -2669,6 +3302,7 @@
           <w:p>
             <w:pPr>
               <w:pStyle w:val="Compact"/>
+              <w:jc w:val="left"/>
             </w:pPr>
             <w:r>
               <w:t xml:space="preserve">6/6</w:t>
@@ -2682,6 +3316,7 @@
           <w:p>
             <w:pPr>
               <w:pStyle w:val="Compact"/>
+              <w:jc w:val="left"/>
             </w:pPr>
             <w:r>
               <w:t xml:space="preserve">Panitumumab</w:t>
@@ -2693,6 +3328,7 @@
           <w:p>
             <w:pPr>
               <w:pStyle w:val="Compact"/>
+              <w:jc w:val="left"/>
             </w:pPr>
             <w:r>
               <w:t xml:space="preserve">EGFR control</w:t>
@@ -2704,6 +3340,7 @@
           <w:p>
             <w:pPr>
               <w:pStyle w:val="Compact"/>
+              <w:jc w:val="left"/>
             </w:pPr>
             <w:r>
               <w:t xml:space="preserve">Anti-EGFR antibody/ADC</w:t>
@@ -2715,6 +3352,7 @@
           <w:p>
             <w:pPr>
               <w:pStyle w:val="Compact"/>
+              <w:jc w:val="left"/>
             </w:pPr>
             <w:r>
               <w:t xml:space="preserve">EGFR</w:t>
@@ -2726,6 +3364,7 @@
           <w:p>
             <w:pPr>
               <w:pStyle w:val="Compact"/>
+              <w:jc w:val="left"/>
             </w:pPr>
             <w:r>
               <w:t xml:space="preserve">Approved (Phase IV)</w:t>
@@ -2737,6 +3376,7 @@
           <w:p>
             <w:pPr>
               <w:pStyle w:val="Compact"/>
+              <w:jc w:val="left"/>
             </w:pPr>
             <w:r>
               <w:t xml:space="preserve">No</w:t>
@@ -2748,6 +3388,7 @@
           <w:p>
             <w:pPr>
               <w:pStyle w:val="Compact"/>
+              <w:jc w:val="left"/>
             </w:pPr>
             <w:r>
               <w:t xml:space="preserve">0.73</w:t>
@@ -2759,6 +3400,7 @@
           <w:p>
             <w:pPr>
               <w:pStyle w:val="Compact"/>
+              <w:jc w:val="left"/>
             </w:pPr>
             <w:r>
               <w:t xml:space="preserve">0.605</w:t>
@@ -2770,6 +3412,7 @@
           <w:p>
             <w:pPr>
               <w:pStyle w:val="Compact"/>
+              <w:jc w:val="left"/>
             </w:pPr>
             <w:r>
               <w:t xml:space="preserve">0.917</w:t>
@@ -2781,6 +3424,7 @@
           <w:p>
             <w:pPr>
               <w:pStyle w:val="Compact"/>
+              <w:jc w:val="left"/>
             </w:pPr>
             <w:r>
               <w:t xml:space="preserve">3</w:t>
@@ -2792,6 +3436,7 @@
           <w:p>
             <w:pPr>
               <w:pStyle w:val="Compact"/>
+              <w:jc w:val="left"/>
             </w:pPr>
             <w:r>
               <w:t xml:space="preserve">Yes</w:t>
@@ -2803,6 +3448,7 @@
           <w:p>
             <w:pPr>
               <w:pStyle w:val="Compact"/>
+              <w:jc w:val="left"/>
             </w:pPr>
             <w:r>
               <w:t xml:space="preserve">6/6</w:t>
@@ -2816,6 +3462,7 @@
           <w:p>
             <w:pPr>
               <w:pStyle w:val="Compact"/>
+              <w:jc w:val="left"/>
             </w:pPr>
             <w:r>
               <w:t xml:space="preserve">Gefitinib</w:t>
@@ -2827,6 +3474,7 @@
           <w:p>
             <w:pPr>
               <w:pStyle w:val="Compact"/>
+              <w:jc w:val="left"/>
             </w:pPr>
             <w:r>
               <w:t xml:space="preserve">EGFR control</w:t>
@@ -2838,6 +3486,7 @@
           <w:p>
             <w:pPr>
               <w:pStyle w:val="Compact"/>
+              <w:jc w:val="left"/>
             </w:pPr>
             <w:r>
               <w:t xml:space="preserve">EGFR TKI (1st-2nd gen)</w:t>
@@ -2849,6 +3498,7 @@
           <w:p>
             <w:pPr>
               <w:pStyle w:val="Compact"/>
+              <w:jc w:val="left"/>
             </w:pPr>
             <w:r>
               <w:t xml:space="preserve">EGFR</w:t>
@@ -2860,6 +3510,7 @@
           <w:p>
             <w:pPr>
               <w:pStyle w:val="Compact"/>
+              <w:jc w:val="left"/>
             </w:pPr>
             <w:r>
               <w:t xml:space="preserve">Approved (Phase IV)</w:t>
@@ -2871,6 +3522,7 @@
           <w:p>
             <w:pPr>
               <w:pStyle w:val="Compact"/>
+              <w:jc w:val="left"/>
             </w:pPr>
             <w:r>
               <w:t xml:space="preserve">No</w:t>
@@ -2882,6 +3534,7 @@
           <w:p>
             <w:pPr>
               <w:pStyle w:val="Compact"/>
+              <w:jc w:val="left"/>
             </w:pPr>
             <w:r>
               <w:t xml:space="preserve">0.717</w:t>
@@ -2893,6 +3546,7 @@
           <w:p>
             <w:pPr>
               <w:pStyle w:val="Compact"/>
+              <w:jc w:val="left"/>
             </w:pPr>
             <w:r>
               <w:t xml:space="preserve">0.605</w:t>
@@ -2904,6 +3558,7 @@
           <w:p>
             <w:pPr>
               <w:pStyle w:val="Compact"/>
+              <w:jc w:val="left"/>
             </w:pPr>
             <w:r>
               <w:t xml:space="preserve">0.884</w:t>
@@ -2915,6 +3570,7 @@
           <w:p>
             <w:pPr>
               <w:pStyle w:val="Compact"/>
+              <w:jc w:val="left"/>
             </w:pPr>
             <w:r>
               <w:t xml:space="preserve">4</w:t>
@@ -2926,6 +3582,7 @@
           <w:p>
             <w:pPr>
               <w:pStyle w:val="Compact"/>
+              <w:jc w:val="left"/>
             </w:pPr>
             <w:r>
               <w:t xml:space="preserve">Yes</w:t>
@@ -2937,6 +3594,7 @@
           <w:p>
             <w:pPr>
               <w:pStyle w:val="Compact"/>
+              <w:jc w:val="left"/>
             </w:pPr>
             <w:r>
               <w:t xml:space="preserve">6/6</w:t>
@@ -2950,6 +3608,7 @@
           <w:p>
             <w:pPr>
               <w:pStyle w:val="Compact"/>
+              <w:jc w:val="left"/>
             </w:pPr>
             <w:r>
               <w:t xml:space="preserve">Lapatinib</w:t>
@@ -2961,6 +3620,7 @@
           <w:p>
             <w:pPr>
               <w:pStyle w:val="Compact"/>
+              <w:jc w:val="left"/>
             </w:pPr>
             <w:r>
               <w:t xml:space="preserve">EGFR control</w:t>
@@ -2972,6 +3632,7 @@
           <w:p>
             <w:pPr>
               <w:pStyle w:val="Compact"/>
+              <w:jc w:val="left"/>
             </w:pPr>
             <w:r>
               <w:t xml:space="preserve">EGFR TKI (1st-2nd gen)</w:t>
@@ -2983,6 +3644,7 @@
           <w:p>
             <w:pPr>
               <w:pStyle w:val="Compact"/>
+              <w:jc w:val="left"/>
             </w:pPr>
             <w:r>
               <w:t xml:space="preserve">EGFR</w:t>
@@ -2994,6 +3656,7 @@
           <w:p>
             <w:pPr>
               <w:pStyle w:val="Compact"/>
+              <w:jc w:val="left"/>
             </w:pPr>
             <w:r>
               <w:t xml:space="preserve">Approved (Phase IV)</w:t>
@@ -3005,6 +3668,7 @@
           <w:p>
             <w:pPr>
               <w:pStyle w:val="Compact"/>
+              <w:jc w:val="left"/>
             </w:pPr>
             <w:r>
               <w:t xml:space="preserve">No</w:t>
@@ -3016,6 +3680,7 @@
           <w:p>
             <w:pPr>
               <w:pStyle w:val="Compact"/>
+              <w:jc w:val="left"/>
             </w:pPr>
             <w:r>
               <w:t xml:space="preserve">0.698</w:t>
@@ -3027,6 +3692,7 @@
           <w:p>
             <w:pPr>
               <w:pStyle w:val="Compact"/>
+              <w:jc w:val="left"/>
             </w:pPr>
             <w:r>
               <w:t xml:space="preserve">0.605</w:t>
@@ -3038,6 +3704,7 @@
           <w:p>
             <w:pPr>
               <w:pStyle w:val="Compact"/>
+              <w:jc w:val="left"/>
             </w:pPr>
             <w:r>
               <w:t xml:space="preserve">0.836</w:t>
@@ -3049,6 +3716,7 @@
           <w:p>
             <w:pPr>
               <w:pStyle w:val="Compact"/>
+              <w:jc w:val="left"/>
             </w:pPr>
             <w:r>
               <w:t xml:space="preserve">4</w:t>
@@ -3060,6 +3728,7 @@
           <w:p>
             <w:pPr>
               <w:pStyle w:val="Compact"/>
+              <w:jc w:val="left"/>
             </w:pPr>
             <w:r>
               <w:t xml:space="preserve">Yes</w:t>
@@ -3071,6 +3740,7 @@
           <w:p>
             <w:pPr>
               <w:pStyle w:val="Compact"/>
+              <w:jc w:val="left"/>
             </w:pPr>
             <w:r>
               <w:t xml:space="preserve">6/6</w:t>
@@ -3084,6 +3754,7 @@
           <w:p>
             <w:pPr>
               <w:pStyle w:val="Compact"/>
+              <w:jc w:val="left"/>
             </w:pPr>
             <w:r>
               <w:t xml:space="preserve">Afatinib</w:t>
@@ -3095,6 +3766,7 @@
           <w:p>
             <w:pPr>
               <w:pStyle w:val="Compact"/>
+              <w:jc w:val="left"/>
             </w:pPr>
             <w:r>
               <w:t xml:space="preserve">EGFR control</w:t>
@@ -3106,6 +3778,7 @@
           <w:p>
             <w:pPr>
               <w:pStyle w:val="Compact"/>
+              <w:jc w:val="left"/>
             </w:pPr>
             <w:r>
               <w:t xml:space="preserve">EGFR TKI (1st-2nd gen)</w:t>
@@ -3117,6 +3790,7 @@
           <w:p>
             <w:pPr>
               <w:pStyle w:val="Compact"/>
+              <w:jc w:val="left"/>
             </w:pPr>
             <w:r>
               <w:t xml:space="preserve">EGFR</w:t>
@@ -3128,6 +3802,7 @@
           <w:p>
             <w:pPr>
               <w:pStyle w:val="Compact"/>
+              <w:jc w:val="left"/>
             </w:pPr>
             <w:r>
               <w:t xml:space="preserve">Approved (Phase IV)</w:t>
@@ -3139,6 +3814,7 @@
           <w:p>
             <w:pPr>
               <w:pStyle w:val="Compact"/>
+              <w:jc w:val="left"/>
             </w:pPr>
             <w:r>
               <w:t xml:space="preserve">Yes</w:t>
@@ -3150,6 +3826,7 @@
           <w:p>
             <w:pPr>
               <w:pStyle w:val="Compact"/>
+              <w:jc w:val="left"/>
             </w:pPr>
             <w:r>
               <w:t xml:space="preserve">0.695</w:t>
@@ -3161,6 +3838,7 @@
           <w:p>
             <w:pPr>
               <w:pStyle w:val="Compact"/>
+              <w:jc w:val="left"/>
             </w:pPr>
             <w:r>
               <w:t xml:space="preserve">0.605</w:t>
@@ -3172,6 +3850,7 @@
           <w:p>
             <w:pPr>
               <w:pStyle w:val="Compact"/>
+              <w:jc w:val="left"/>
             </w:pPr>
             <w:r>
               <w:t xml:space="preserve">0.829</w:t>
@@ -3183,6 +3862,7 @@
           <w:p>
             <w:pPr>
               <w:pStyle w:val="Compact"/>
+              <w:jc w:val="left"/>
             </w:pPr>
             <w:r>
               <w:t xml:space="preserve">4</w:t>
@@ -3194,6 +3874,7 @@
           <w:p>
             <w:pPr>
               <w:pStyle w:val="Compact"/>
+              <w:jc w:val="left"/>
             </w:pPr>
             <w:r>
               <w:t xml:space="preserve">Yes</w:t>
@@ -3205,6 +3886,7 @@
           <w:p>
             <w:pPr>
               <w:pStyle w:val="Compact"/>
+              <w:jc w:val="left"/>
             </w:pPr>
             <w:r>
               <w:t xml:space="preserve">6/6</w:t>
@@ -3218,6 +3900,7 @@
           <w:p>
             <w:pPr>
               <w:pStyle w:val="Compact"/>
+              <w:jc w:val="left"/>
             </w:pPr>
             <w:r>
               <w:t xml:space="preserve">Erlotinib</w:t>
@@ -3229,6 +3912,7 @@
           <w:p>
             <w:pPr>
               <w:pStyle w:val="Compact"/>
+              <w:jc w:val="left"/>
             </w:pPr>
             <w:r>
               <w:t xml:space="preserve">EGFR control</w:t>
@@ -3240,6 +3924,7 @@
           <w:p>
             <w:pPr>
               <w:pStyle w:val="Compact"/>
+              <w:jc w:val="left"/>
             </w:pPr>
             <w:r>
               <w:t xml:space="preserve">EGFR TKI (1st-2nd gen)</w:t>
@@ -3251,6 +3936,7 @@
           <w:p>
             <w:pPr>
               <w:pStyle w:val="Compact"/>
+              <w:jc w:val="left"/>
             </w:pPr>
             <w:r>
               <w:t xml:space="preserve">EGFR</w:t>
@@ -3262,6 +3948,7 @@
           <w:p>
             <w:pPr>
               <w:pStyle w:val="Compact"/>
+              <w:jc w:val="left"/>
             </w:pPr>
             <w:r>
               <w:t xml:space="preserve">Approved (Phase IV)</w:t>
@@ -3273,6 +3960,7 @@
           <w:p>
             <w:pPr>
               <w:pStyle w:val="Compact"/>
+              <w:jc w:val="left"/>
             </w:pPr>
             <w:r>
               <w:t xml:space="preserve">No</w:t>
@@ -3284,6 +3972,7 @@
           <w:p>
             <w:pPr>
               <w:pStyle w:val="Compact"/>
+              <w:jc w:val="left"/>
             </w:pPr>
             <w:r>
               <w:t xml:space="preserve">0.689</w:t>
@@ -3295,6 +3984,7 @@
           <w:p>
             <w:pPr>
               <w:pStyle w:val="Compact"/>
+              <w:jc w:val="left"/>
             </w:pPr>
             <w:r>
               <w:t xml:space="preserve">0.605</w:t>
@@ -3306,6 +3996,7 @@
           <w:p>
             <w:pPr>
               <w:pStyle w:val="Compact"/>
+              <w:jc w:val="left"/>
             </w:pPr>
             <w:r>
               <w:t xml:space="preserve">0.813</w:t>
@@ -3317,6 +4008,7 @@
           <w:p>
             <w:pPr>
               <w:pStyle w:val="Compact"/>
+              <w:jc w:val="left"/>
             </w:pPr>
             <w:r>
               <w:t xml:space="preserve">3</w:t>
@@ -3328,6 +4020,7 @@
           <w:p>
             <w:pPr>
               <w:pStyle w:val="Compact"/>
+              <w:jc w:val="left"/>
             </w:pPr>
             <w:r>
               <w:t xml:space="preserve">Yes</w:t>
@@ -3339,6 +4032,7 @@
           <w:p>
             <w:pPr>
               <w:pStyle w:val="Compact"/>
+              <w:jc w:val="left"/>
             </w:pPr>
             <w:r>
               <w:t xml:space="preserve">6/6</w:t>
@@ -3352,11 +4046,12 @@
           <w:p>
             <w:pPr>
               <w:pStyle w:val="Compact"/>
+              <w:jc w:val="left"/>
             </w:pPr>
             <w:r>
               <w:rPr>
+                <w:iCs/>
                 <w:i/>
-                <w:iCs/>
               </w:rPr>
               <w:t xml:space="preserve">plus 60 additional anti-EGFR agents</w:t>
             </w:r>
@@ -3367,6 +4062,7 @@
           <w:p>
             <w:pPr>
               <w:pStyle w:val="Compact"/>
+              <w:jc w:val="left"/>
             </w:pPr>
             <w:r>
               <w:t xml:space="preserve">EGFR control</w:t>
@@ -3378,6 +4074,7 @@
           <w:p>
             <w:pPr>
               <w:pStyle w:val="Compact"/>
+              <w:jc w:val="left"/>
             </w:pPr>
             <w:r>
               <w:t xml:space="preserve">anti-EGFR (mixed)</w:t>
@@ -3389,6 +4086,7 @@
           <w:p>
             <w:pPr>
               <w:pStyle w:val="Compact"/>
+              <w:jc w:val="left"/>
             </w:pPr>
             <w:r>
               <w:t xml:space="preserve">EGFR</w:t>
@@ -3400,6 +4098,7 @@
           <w:p>
             <w:pPr>
               <w:pStyle w:val="Compact"/>
+              <w:jc w:val="left"/>
             </w:pPr>
             <w:r>
               <w:t xml:space="preserve">Approved-to-Phase I</w:t>
@@ -3411,6 +4110,7 @@
           <w:p>
             <w:pPr>
               <w:pStyle w:val="Compact"/>
+              <w:jc w:val="left"/>
             </w:pPr>
             <w:r>
               <w:t xml:space="preserve">mixed</w:t>
@@ -3422,6 +4122,7 @@
           <w:p>
             <w:pPr>
               <w:pStyle w:val="Compact"/>
+              <w:jc w:val="left"/>
             </w:pPr>
             <w:r>
               <w:t xml:space="preserve">0.50-0.66</w:t>
@@ -3433,6 +4134,7 @@
           <w:p>
             <w:pPr>
               <w:pStyle w:val="Compact"/>
+              <w:jc w:val="left"/>
             </w:pPr>
             <w:r>
               <w:t xml:space="preserve">0.605</w:t>
@@ -3444,6 +4146,7 @@
           <w:p>
             <w:pPr>
               <w:pStyle w:val="Compact"/>
+              <w:jc w:val="left"/>
             </w:pPr>
             <w:r>
               <w:t xml:space="preserve">varies</w:t>
@@ -3455,6 +4158,7 @@
           <w:p>
             <w:pPr>
               <w:pStyle w:val="Compact"/>
+              <w:jc w:val="left"/>
             </w:pPr>
             <w:r>
               <w:t xml:space="preserve">2-3</w:t>
@@ -3466,6 +4170,7 @@
           <w:p>
             <w:pPr>
               <w:pStyle w:val="Compact"/>
+              <w:jc w:val="left"/>
             </w:pPr>
             <w:r>
               <w:t xml:space="preserve">mixed</w:t>
@@ -3477,6 +4182,7 @@
           <w:p>
             <w:pPr>
               <w:pStyle w:val="Compact"/>
+              <w:jc w:val="left"/>
             </w:pPr>
             <w:r>
               <w:t xml:space="preserve">mixed</w:t>
@@ -3490,6 +4196,7 @@
           <w:p>
             <w:pPr>
               <w:pStyle w:val="Compact"/>
+              <w:jc w:val="left"/>
             </w:pPr>
             <w:r>
               <w:t xml:space="preserve">Metformin</w:t>
@@ -3501,6 +4208,7 @@
           <w:p>
             <w:pPr>
               <w:pStyle w:val="Compact"/>
+              <w:jc w:val="left"/>
             </w:pPr>
             <w:r>
               <w:t xml:space="preserve">Hub-central</w:t>
@@ -3512,6 +4220,7 @@
           <w:p>
             <w:pPr>
               <w:pStyle w:val="Compact"/>
+              <w:jc w:val="left"/>
             </w:pPr>
             <w:r>
               <w:t xml:space="preserve">OXPHOS</w:t>
@@ -3523,6 +4232,7 @@
           <w:p>
             <w:pPr>
               <w:pStyle w:val="Compact"/>
+              <w:jc w:val="left"/>
             </w:pPr>
             <w:r>
               <w:t xml:space="preserve">NDUFS2</w:t>
@@ -3534,6 +4244,7 @@
           <w:p>
             <w:pPr>
               <w:pStyle w:val="Compact"/>
+              <w:jc w:val="left"/>
             </w:pPr>
             <w:r>
               <w:t xml:space="preserve">Approved (Phase IV)</w:t>
@@ -3545,6 +4256,7 @@
           <w:p>
             <w:pPr>
               <w:pStyle w:val="Compact"/>
+              <w:jc w:val="left"/>
             </w:pPr>
             <w:r>
               <w:t xml:space="preserve">No</w:t>
@@ -3556,6 +4268,7 @@
           <w:p>
             <w:pPr>
               <w:pStyle w:val="Compact"/>
+              <w:jc w:val="left"/>
             </w:pPr>
             <w:r>
               <w:t xml:space="preserve">0.591</w:t>
@@ -3567,6 +4280,7 @@
           <w:p>
             <w:pPr>
               <w:pStyle w:val="Compact"/>
+              <w:jc w:val="left"/>
             </w:pPr>
             <w:r>
               <w:t xml:space="preserve">0.502</w:t>
@@ -3578,6 +4292,7 @@
           <w:p>
             <w:pPr>
               <w:pStyle w:val="Compact"/>
+              <w:jc w:val="left"/>
             </w:pPr>
             <w:r>
               <w:t xml:space="preserve">0.725</w:t>
@@ -3589,6 +4304,7 @@
           <w:p>
             <w:pPr>
               <w:pStyle w:val="Compact"/>
+              <w:jc w:val="left"/>
             </w:pPr>
             <w:r>
               <w:t xml:space="preserve">3</w:t>
@@ -3600,6 +4316,7 @@
           <w:p>
             <w:pPr>
               <w:pStyle w:val="Compact"/>
+              <w:jc w:val="left"/>
             </w:pPr>
             <w:r>
               <w:t xml:space="preserve">Yes</w:t>
@@ -3611,6 +4328,7 @@
           <w:p>
             <w:pPr>
               <w:pStyle w:val="Compact"/>
+              <w:jc w:val="left"/>
             </w:pPr>
             <w:r>
               <w:t xml:space="preserve">6/6</w:t>
@@ -3624,6 +4342,7 @@
           <w:p>
             <w:pPr>
               <w:pStyle w:val="Compact"/>
+              <w:jc w:val="left"/>
             </w:pPr>
             <w:r>
               <w:t xml:space="preserve">Bortezomib D-Mannitol</w:t>
@@ -3635,6 +4354,7 @@
           <w:p>
             <w:pPr>
               <w:pStyle w:val="Compact"/>
+              <w:jc w:val="left"/>
             </w:pPr>
             <w:r>
               <w:t xml:space="preserve">Hub-central</w:t>
@@ -3646,6 +4366,7 @@
           <w:p>
             <w:pPr>
               <w:pStyle w:val="Compact"/>
+              <w:jc w:val="left"/>
             </w:pPr>
             <w:r>
               <w:t xml:space="preserve">Proteasome</w:t>
@@ -3657,6 +4378,7 @@
           <w:p>
             <w:pPr>
               <w:pStyle w:val="Compact"/>
+              <w:jc w:val="left"/>
             </w:pPr>
             <w:r>
               <w:t xml:space="preserve">PSMA2</w:t>
@@ -3668,6 +4390,7 @@
           <w:p>
             <w:pPr>
               <w:pStyle w:val="Compact"/>
+              <w:jc w:val="left"/>
             </w:pPr>
             <w:r>
               <w:t xml:space="preserve">Approved (Phase IV)</w:t>
@@ -3679,6 +4402,7 @@
           <w:p>
             <w:pPr>
               <w:pStyle w:val="Compact"/>
+              <w:jc w:val="left"/>
             </w:pPr>
             <w:r>
               <w:t xml:space="preserve">No</w:t>
@@ -3690,6 +4414,7 @@
           <w:p>
             <w:pPr>
               <w:pStyle w:val="Compact"/>
+              <w:jc w:val="left"/>
             </w:pPr>
             <w:r>
               <w:t xml:space="preserve">0.5</w:t>
@@ -3701,6 +4426,7 @@
           <w:p>
             <w:pPr>
               <w:pStyle w:val="Compact"/>
+              <w:jc w:val="left"/>
             </w:pPr>
             <w:r>
               <w:t xml:space="preserve">0.389</w:t>
@@ -3712,6 +4438,7 @@
           <w:p>
             <w:pPr>
               <w:pStyle w:val="Compact"/>
+              <w:jc w:val="left"/>
             </w:pPr>
             <w:r>
               <w:t xml:space="preserve">0.667</w:t>
@@ -3723,6 +4450,7 @@
           <w:p>
             <w:pPr>
               <w:pStyle w:val="Compact"/>
+              <w:jc w:val="left"/>
             </w:pPr>
             <w:r>
               <w:t xml:space="preserve">2</w:t>
@@ -3734,6 +4462,7 @@
           <w:p>
             <w:pPr>
               <w:pStyle w:val="Compact"/>
+              <w:jc w:val="left"/>
             </w:pPr>
             <w:r>
               <w:t xml:space="preserve">No</w:t>
@@ -3745,6 +4474,7 @@
           <w:p>
             <w:pPr>
               <w:pStyle w:val="Compact"/>
+              <w:jc w:val="left"/>
             </w:pPr>
             <w:r>
               <w:t xml:space="preserve">0/6</w:t>
@@ -3758,6 +4488,7 @@
           <w:p>
             <w:pPr>
               <w:pStyle w:val="Compact"/>
+              <w:jc w:val="left"/>
             </w:pPr>
             <w:r>
               <w:t xml:space="preserve">Andecaliximab</w:t>
@@ -3769,6 +4500,7 @@
           <w:p>
             <w:pPr>
               <w:pStyle w:val="Compact"/>
+              <w:jc w:val="left"/>
             </w:pPr>
             <w:r>
               <w:t xml:space="preserve">Hub-central</w:t>
@@ -3780,6 +4512,7 @@
           <w:p>
             <w:pPr>
               <w:pStyle w:val="Compact"/>
+              <w:jc w:val="left"/>
             </w:pPr>
             <w:r>
               <w:t xml:space="preserve">Immune response</w:t>
@@ -3791,6 +4524,7 @@
           <w:p>
             <w:pPr>
               <w:pStyle w:val="Compact"/>
+              <w:jc w:val="left"/>
             </w:pPr>
             <w:r>
               <w:t xml:space="preserve">MMP9</w:t>
@@ -3802,6 +4536,7 @@
           <w:p>
             <w:pPr>
               <w:pStyle w:val="Compact"/>
+              <w:jc w:val="left"/>
             </w:pPr>
             <w:r>
               <w:t xml:space="preserve">Phase III</w:t>
@@ -3813,6 +4548,7 @@
           <w:p>
             <w:pPr>
               <w:pStyle w:val="Compact"/>
+              <w:jc w:val="left"/>
             </w:pPr>
             <w:r>
               <w:t xml:space="preserve">No</w:t>
@@ -3824,6 +4560,7 @@
           <w:p>
             <w:pPr>
               <w:pStyle w:val="Compact"/>
+              <w:jc w:val="left"/>
             </w:pPr>
             <w:r>
               <w:t xml:space="preserve">0.425</w:t>
@@ -3835,6 +4572,7 @@
           <w:p>
             <w:pPr>
               <w:pStyle w:val="Compact"/>
+              <w:jc w:val="left"/>
             </w:pPr>
             <w:r>
               <w:t xml:space="preserve">0.431</w:t>
@@ -3846,6 +4584,7 @@
           <w:p>
             <w:pPr>
               <w:pStyle w:val="Compact"/>
+              <w:jc w:val="left"/>
             </w:pPr>
             <w:r>
               <w:t xml:space="preserve">0.417</w:t>
@@ -3857,6 +4596,7 @@
           <w:p>
             <w:pPr>
               <w:pStyle w:val="Compact"/>
+              <w:jc w:val="left"/>
             </w:pPr>
             <w:r>
               <w:t xml:space="preserve">3</w:t>
@@ -3868,6 +4608,7 @@
           <w:p>
             <w:pPr>
               <w:pStyle w:val="Compact"/>
+              <w:jc w:val="left"/>
             </w:pPr>
             <w:r>
               <w:t xml:space="preserve">No</w:t>
@@ -3879,6 +4620,7 @@
           <w:p>
             <w:pPr>
               <w:pStyle w:val="Compact"/>
+              <w:jc w:val="left"/>
             </w:pPr>
             <w:r>
               <w:t xml:space="preserve">0/6</w:t>
@@ -3892,6 +4634,7 @@
           <w:p>
             <w:pPr>
               <w:pStyle w:val="Compact"/>
+              <w:jc w:val="left"/>
             </w:pPr>
             <w:r>
               <w:t xml:space="preserve">Mt-3724</w:t>
@@ -3903,6 +4646,7 @@
           <w:p>
             <w:pPr>
               <w:pStyle w:val="Compact"/>
+              <w:jc w:val="left"/>
             </w:pPr>
             <w:r>
               <w:t xml:space="preserve">Hub-central</w:t>
@@ -3914,6 +4658,7 @@
           <w:p>
             <w:pPr>
               <w:pStyle w:val="Compact"/>
+              <w:jc w:val="left"/>
             </w:pPr>
             <w:r>
               <w:t xml:space="preserve">Translation</w:t>
@@ -3925,6 +4670,7 @@
           <w:p>
             <w:pPr>
               <w:pStyle w:val="Compact"/>
+              <w:jc w:val="left"/>
             </w:pPr>
             <w:r>
               <w:t xml:space="preserve">RPS11</w:t>
@@ -3936,6 +4682,7 @@
           <w:p>
             <w:pPr>
               <w:pStyle w:val="Compact"/>
+              <w:jc w:val="left"/>
             </w:pPr>
             <w:r>
               <w:t xml:space="preserve">Phase II</w:t>
@@ -3947,6 +4694,7 @@
           <w:p>
             <w:pPr>
               <w:pStyle w:val="Compact"/>
+              <w:jc w:val="left"/>
             </w:pPr>
             <w:r>
               <w:t xml:space="preserve">No</w:t>
@@ -3958,6 +4706,7 @@
           <w:p>
             <w:pPr>
               <w:pStyle w:val="Compact"/>
+              <w:jc w:val="left"/>
             </w:pPr>
             <w:r>
               <w:t xml:space="preserve">0.421</w:t>
@@ -3969,6 +4718,7 @@
           <w:p>
             <w:pPr>
               <w:pStyle w:val="Compact"/>
+              <w:jc w:val="left"/>
             </w:pPr>
             <w:r>
               <w:t xml:space="preserve">0.48</w:t>
@@ -3980,6 +4730,7 @@
           <w:p>
             <w:pPr>
               <w:pStyle w:val="Compact"/>
+              <w:jc w:val="left"/>
             </w:pPr>
             <w:r>
               <w:t xml:space="preserve">0.333</w:t>
@@ -3991,6 +4742,7 @@
           <w:p>
             <w:pPr>
               <w:pStyle w:val="Compact"/>
+              <w:jc w:val="left"/>
             </w:pPr>
             <w:r>
               <w:t xml:space="preserve">2</w:t>
@@ -4002,6 +4754,7 @@
           <w:p>
             <w:pPr>
               <w:pStyle w:val="Compact"/>
+              <w:jc w:val="left"/>
             </w:pPr>
             <w:r>
               <w:t xml:space="preserve">No</w:t>
@@ -4013,6 +4766,7 @@
           <w:p>
             <w:pPr>
               <w:pStyle w:val="Compact"/>
+              <w:jc w:val="left"/>
             </w:pPr>
             <w:r>
               <w:t xml:space="preserve">0/6</w:t>
@@ -4026,6 +4780,7 @@
           <w:p>
             <w:pPr>
               <w:pStyle w:val="Compact"/>
+              <w:jc w:val="left"/>
             </w:pPr>
             <w:r>
               <w:t xml:space="preserve">Cedazuridine</w:t>
@@ -4037,6 +4792,7 @@
           <w:p>
             <w:pPr>
               <w:pStyle w:val="Compact"/>
+              <w:jc w:val="left"/>
             </w:pPr>
             <w:r>
               <w:t xml:space="preserve">Peripheral-differential</w:t>
@@ -4048,6 +4804,7 @@
           <w:p>
             <w:pPr>
               <w:pStyle w:val="Compact"/>
+              <w:jc w:val="left"/>
             </w:pPr>
             <w:r>
               <w:t xml:space="preserve">Amino acid metabolism</w:t>
@@ -4059,6 +4816,7 @@
           <w:p>
             <w:pPr>
               <w:pStyle w:val="Compact"/>
+              <w:jc w:val="left"/>
             </w:pPr>
             <w:r>
               <w:t xml:space="preserve">CDA</w:t>
@@ -4070,6 +4828,7 @@
           <w:p>
             <w:pPr>
               <w:pStyle w:val="Compact"/>
+              <w:jc w:val="left"/>
             </w:pPr>
             <w:r>
               <w:t xml:space="preserve">Approved (Phase IV)</w:t>
@@ -4081,6 +4840,7 @@
           <w:p>
             <w:pPr>
               <w:pStyle w:val="Compact"/>
+              <w:jc w:val="left"/>
             </w:pPr>
             <w:r>
               <w:t xml:space="preserve">No</w:t>
@@ -4092,6 +4852,7 @@
           <w:p>
             <w:pPr>
               <w:pStyle w:val="Compact"/>
+              <w:jc w:val="left"/>
             </w:pPr>
             <w:r>
               <w:t xml:space="preserve">0.5</w:t>
@@ -4103,6 +4864,7 @@
           <w:p>
             <w:pPr>
               <w:pStyle w:val="Compact"/>
+              <w:jc w:val="left"/>
             </w:pPr>
             <w:r>
               <w:t xml:space="preserve">0.333</w:t>
@@ -4114,6 +4876,7 @@
           <w:p>
             <w:pPr>
               <w:pStyle w:val="Compact"/>
+              <w:jc w:val="left"/>
             </w:pPr>
             <w:r>
               <w:t xml:space="preserve">0.75</w:t>
@@ -4125,6 +4888,7 @@
           <w:p>
             <w:pPr>
               <w:pStyle w:val="Compact"/>
+              <w:jc w:val="left"/>
             </w:pPr>
             <w:r>
               <w:t xml:space="preserve">3</w:t>
@@ -4136,6 +4900,7 @@
           <w:p>
             <w:pPr>
               <w:pStyle w:val="Compact"/>
+              <w:jc w:val="left"/>
             </w:pPr>
             <w:r>
               <w:t xml:space="preserve">No</w:t>
@@ -4147,6 +4912,7 @@
           <w:p>
             <w:pPr>
               <w:pStyle w:val="Compact"/>
+              <w:jc w:val="left"/>
             </w:pPr>
             <w:r>
               <w:t xml:space="preserve">0/6</w:t>
@@ -4160,6 +4926,7 @@
           <w:p>
             <w:pPr>
               <w:pStyle w:val="Compact"/>
+              <w:jc w:val="left"/>
             </w:pPr>
             <w:r>
               <w:t xml:space="preserve">Azacitidine</w:t>
@@ -4171,6 +4938,7 @@
           <w:p>
             <w:pPr>
               <w:pStyle w:val="Compact"/>
+              <w:jc w:val="left"/>
             </w:pPr>
             <w:r>
               <w:t xml:space="preserve">Peripheral-differential</w:t>
@@ -4182,6 +4950,7 @@
           <w:p>
             <w:pPr>
               <w:pStyle w:val="Compact"/>
+              <w:jc w:val="left"/>
             </w:pPr>
             <w:r>
               <w:t xml:space="preserve">Chromatin remodeling</w:t>
@@ -4193,6 +4962,7 @@
           <w:p>
             <w:pPr>
               <w:pStyle w:val="Compact"/>
+              <w:jc w:val="left"/>
             </w:pPr>
             <w:r>
               <w:t xml:space="preserve">DNMT1</w:t>
@@ -4204,6 +4974,7 @@
           <w:p>
             <w:pPr>
               <w:pStyle w:val="Compact"/>
+              <w:jc w:val="left"/>
             </w:pPr>
             <w:r>
               <w:t xml:space="preserve">Approved (Phase IV)</w:t>
@@ -4215,6 +4986,7 @@
           <w:p>
             <w:pPr>
               <w:pStyle w:val="Compact"/>
+              <w:jc w:val="left"/>
             </w:pPr>
             <w:r>
               <w:t xml:space="preserve">No</w:t>
@@ -4226,6 +4998,7 @@
           <w:p>
             <w:pPr>
               <w:pStyle w:val="Compact"/>
+              <w:jc w:val="left"/>
             </w:pPr>
             <w:r>
               <w:t xml:space="preserve">0.494</w:t>
@@ -4237,6 +5010,7 @@
           <w:p>
             <w:pPr>
               <w:pStyle w:val="Compact"/>
+              <w:jc w:val="left"/>
             </w:pPr>
             <w:r>
               <w:t xml:space="preserve">0.359</w:t>
@@ -4248,6 +5022,7 @@
           <w:p>
             <w:pPr>
               <w:pStyle w:val="Compact"/>
+              <w:jc w:val="left"/>
             </w:pPr>
             <w:r>
               <w:t xml:space="preserve">0.695</w:t>
@@ -4259,6 +5034,7 @@
           <w:p>
             <w:pPr>
               <w:pStyle w:val="Compact"/>
+              <w:jc w:val="left"/>
             </w:pPr>
             <w:r>
               <w:t xml:space="preserve">4</w:t>
@@ -4270,6 +5046,7 @@
           <w:p>
             <w:pPr>
               <w:pStyle w:val="Compact"/>
+              <w:jc w:val="left"/>
             </w:pPr>
             <w:r>
               <w:t xml:space="preserve">No</w:t>
@@ -4281,6 +5058,7 @@
           <w:p>
             <w:pPr>
               <w:pStyle w:val="Compact"/>
+              <w:jc w:val="left"/>
             </w:pPr>
             <w:r>
               <w:t xml:space="preserve">4/6</w:t>
@@ -4294,6 +5072,7 @@
           <w:p>
             <w:pPr>
               <w:pStyle w:val="Compact"/>
+              <w:jc w:val="left"/>
             </w:pPr>
             <w:r>
               <w:t xml:space="preserve">Pentoxifylline</w:t>
@@ -4305,6 +5084,7 @@
           <w:p>
             <w:pPr>
               <w:pStyle w:val="Compact"/>
+              <w:jc w:val="left"/>
             </w:pPr>
             <w:r>
               <w:t xml:space="preserve">Peripheral-differential</w:t>
@@ -4316,6 +5096,7 @@
           <w:p>
             <w:pPr>
               <w:pStyle w:val="Compact"/>
+              <w:jc w:val="left"/>
             </w:pPr>
             <w:r>
               <w:t xml:space="preserve">Amino acid metabolism</w:t>
@@ -4327,6 +5108,7 @@
           <w:p>
             <w:pPr>
               <w:pStyle w:val="Compact"/>
+              <w:jc w:val="left"/>
             </w:pPr>
             <w:r>
               <w:t xml:space="preserve">PDE6D</w:t>
@@ -4338,6 +5120,7 @@
           <w:p>
             <w:pPr>
               <w:pStyle w:val="Compact"/>
+              <w:jc w:val="left"/>
             </w:pPr>
             <w:r>
               <w:t xml:space="preserve">Approved (Phase IV)</w:t>
@@ -4349,6 +5132,7 @@
           <w:p>
             <w:pPr>
               <w:pStyle w:val="Compact"/>
+              <w:jc w:val="left"/>
             </w:pPr>
             <w:r>
               <w:t xml:space="preserve">No</w:t>
@@ -4360,6 +5144,7 @@
           <w:p>
             <w:pPr>
               <w:pStyle w:val="Compact"/>
+              <w:jc w:val="left"/>
             </w:pPr>
             <w:r>
               <w:t xml:space="preserve">0.454</w:t>
@@ -4371,6 +5156,7 @@
           <w:p>
             <w:pPr>
               <w:pStyle w:val="Compact"/>
+              <w:jc w:val="left"/>
             </w:pPr>
             <w:r>
               <w:t xml:space="preserve">0.316</w:t>
@@ -4382,6 +5168,7 @@
           <w:p>
             <w:pPr>
               <w:pStyle w:val="Compact"/>
+              <w:jc w:val="left"/>
             </w:pPr>
             <w:r>
               <w:t xml:space="preserve">0.661</w:t>
@@ -4393,6 +5180,7 @@
           <w:p>
             <w:pPr>
               <w:pStyle w:val="Compact"/>
+              <w:jc w:val="left"/>
             </w:pPr>
             <w:r>
               <w:t xml:space="preserve">3</w:t>
@@ -4404,6 +5192,7 @@
           <w:p>
             <w:pPr>
               <w:pStyle w:val="Compact"/>
+              <w:jc w:val="left"/>
             </w:pPr>
             <w:r>
               <w:t xml:space="preserve">No</w:t>
@@ -4415,6 +5204,7 @@
           <w:p>
             <w:pPr>
               <w:pStyle w:val="Compact"/>
+              <w:jc w:val="left"/>
             </w:pPr>
             <w:r>
               <w:t xml:space="preserve">3/6</w:t>
@@ -4428,6 +5218,7 @@
           <w:p>
             <w:pPr>
               <w:pStyle w:val="Compact"/>
+              <w:jc w:val="left"/>
             </w:pPr>
             <w:r>
               <w:t xml:space="preserve">Mitapivat</w:t>
@@ -4439,6 +5230,7 @@
           <w:p>
             <w:pPr>
               <w:pStyle w:val="Compact"/>
+              <w:jc w:val="left"/>
             </w:pPr>
             <w:r>
               <w:t xml:space="preserve">Peripheral-differential</w:t>
@@ -4450,6 +5242,7 @@
           <w:p>
             <w:pPr>
               <w:pStyle w:val="Compact"/>
+              <w:jc w:val="left"/>
             </w:pPr>
             <w:r>
               <w:t xml:space="preserve">Carbohydrate catabolism</w:t>
@@ -4461,6 +5254,7 @@
           <w:p>
             <w:pPr>
               <w:pStyle w:val="Compact"/>
+              <w:jc w:val="left"/>
             </w:pPr>
             <w:r>
               <w:t xml:space="preserve">PKLR</w:t>
@@ -4472,6 +5266,7 @@
           <w:p>
             <w:pPr>
               <w:pStyle w:val="Compact"/>
+              <w:jc w:val="left"/>
             </w:pPr>
             <w:r>
               <w:t xml:space="preserve">Approved (Phase IV)</w:t>
@@ -4483,6 +5278,7 @@
           <w:p>
             <w:pPr>
               <w:pStyle w:val="Compact"/>
+              <w:jc w:val="left"/>
             </w:pPr>
             <w:r>
               <w:t xml:space="preserve">No</w:t>
@@ -4494,6 +5290,7 @@
           <w:p>
             <w:pPr>
               <w:pStyle w:val="Compact"/>
+              <w:jc w:val="left"/>
             </w:pPr>
             <w:r>
               <w:t xml:space="preserve">0.445</w:t>
@@ -4505,6 +5302,7 @@
           <w:p>
             <w:pPr>
               <w:pStyle w:val="Compact"/>
+              <w:jc w:val="left"/>
             </w:pPr>
             <w:r>
               <w:t xml:space="preserve">0.353</w:t>
@@ -4516,6 +5314,7 @@
           <w:p>
             <w:pPr>
               <w:pStyle w:val="Compact"/>
+              <w:jc w:val="left"/>
             </w:pPr>
             <w:r>
               <w:t xml:space="preserve">0.583</w:t>
@@ -4527,6 +5326,7 @@
           <w:p>
             <w:pPr>
               <w:pStyle w:val="Compact"/>
+              <w:jc w:val="left"/>
             </w:pPr>
             <w:r>
               <w:t xml:space="preserve">3</w:t>
@@ -4538,6 +5338,7 @@
           <w:p>
             <w:pPr>
               <w:pStyle w:val="Compact"/>
+              <w:jc w:val="left"/>
             </w:pPr>
             <w:r>
               <w:t xml:space="preserve">No</w:t>
@@ -4549,6 +5350,7 @@
           <w:p>
             <w:pPr>
               <w:pStyle w:val="Compact"/>
+              <w:jc w:val="left"/>
             </w:pPr>
             <w:r>
               <w:t xml:space="preserve">0/6</w:t>
@@ -4562,6 +5364,7 @@
           <w:p>
             <w:pPr>
               <w:pStyle w:val="Compact"/>
+              <w:jc w:val="left"/>
             </w:pPr>
             <w:r>
               <w:t xml:space="preserve">Valproic Acid</w:t>
@@ -4573,6 +5376,7 @@
           <w:p>
             <w:pPr>
               <w:pStyle w:val="Compact"/>
+              <w:jc w:val="left"/>
             </w:pPr>
             <w:r>
               <w:t xml:space="preserve">Peripheral-differential</w:t>
@@ -4584,6 +5388,7 @@
           <w:p>
             <w:pPr>
               <w:pStyle w:val="Compact"/>
+              <w:jc w:val="left"/>
             </w:pPr>
             <w:r>
               <w:t xml:space="preserve">Carboxylic acid metabolism</w:t>
@@ -4595,6 +5400,7 @@
           <w:p>
             <w:pPr>
               <w:pStyle w:val="Compact"/>
+              <w:jc w:val="left"/>
             </w:pPr>
             <w:r>
               <w:t xml:space="preserve">ALDH5A1</w:t>
@@ -4606,6 +5412,7 @@
           <w:p>
             <w:pPr>
               <w:pStyle w:val="Compact"/>
+              <w:jc w:val="left"/>
             </w:pPr>
             <w:r>
               <w:t xml:space="preserve">Approved (Phase IV)</w:t>
@@ -4617,6 +5424,7 @@
           <w:p>
             <w:pPr>
               <w:pStyle w:val="Compact"/>
+              <w:jc w:val="left"/>
             </w:pPr>
             <w:r>
               <w:t xml:space="preserve">No</w:t>
@@ -4628,6 +5436,7 @@
           <w:p>
             <w:pPr>
               <w:pStyle w:val="Compact"/>
+              <w:jc w:val="left"/>
             </w:pPr>
             <w:r>
               <w:t xml:space="preserve">0.438</w:t>
@@ -4639,6 +5448,7 @@
           <w:p>
             <w:pPr>
               <w:pStyle w:val="Compact"/>
+              <w:jc w:val="left"/>
             </w:pPr>
             <w:r>
               <w:t xml:space="preserve">0.244</w:t>
@@ -4650,6 +5460,7 @@
           <w:p>
             <w:pPr>
               <w:pStyle w:val="Compact"/>
+              <w:jc w:val="left"/>
             </w:pPr>
             <w:r>
               <w:t xml:space="preserve">0.73</w:t>
@@ -4661,6 +5472,7 @@
           <w:p>
             <w:pPr>
               <w:pStyle w:val="Compact"/>
+              <w:jc w:val="left"/>
             </w:pPr>
             <w:r>
               <w:t xml:space="preserve">4</w:t>
@@ -4672,6 +5484,7 @@
           <w:p>
             <w:pPr>
               <w:pStyle w:val="Compact"/>
+              <w:jc w:val="left"/>
             </w:pPr>
             <w:r>
               <w:t xml:space="preserve">No</w:t>
@@ -4683,6 +5496,7 @@
           <w:p>
             <w:pPr>
               <w:pStyle w:val="Compact"/>
+              <w:jc w:val="left"/>
             </w:pPr>
             <w:r>
               <w:t xml:space="preserve">2/6</w:t>
@@ -4696,6 +5510,7 @@
           <w:p>
             <w:pPr>
               <w:pStyle w:val="Compact"/>
+              <w:jc w:val="left"/>
             </w:pPr>
             <w:r>
               <w:t xml:space="preserve">Mycophenolate Mofetil</w:t>
@@ -4707,6 +5522,7 @@
           <w:p>
             <w:pPr>
               <w:pStyle w:val="Compact"/>
+              <w:jc w:val="left"/>
             </w:pPr>
             <w:r>
               <w:t xml:space="preserve">Peripheral-differential</w:t>
@@ -4718,6 +5534,7 @@
           <w:p>
             <w:pPr>
               <w:pStyle w:val="Compact"/>
+              <w:jc w:val="left"/>
             </w:pPr>
             <w:r>
               <w:t xml:space="preserve">Amino acid metabolism</w:t>
@@ -4729,6 +5546,7 @@
           <w:p>
             <w:pPr>
               <w:pStyle w:val="Compact"/>
+              <w:jc w:val="left"/>
             </w:pPr>
             <w:r>
               <w:t xml:space="preserve">IMPDH2</w:t>
@@ -4740,6 +5558,7 @@
           <w:p>
             <w:pPr>
               <w:pStyle w:val="Compact"/>
+              <w:jc w:val="left"/>
             </w:pPr>
             <w:r>
               <w:t xml:space="preserve">Approved (Phase IV)</w:t>
@@ -4751,6 +5570,7 @@
           <w:p>
             <w:pPr>
               <w:pStyle w:val="Compact"/>
+              <w:jc w:val="left"/>
             </w:pPr>
             <w:r>
               <w:t xml:space="preserve">No</w:t>
@@ -4762,6 +5582,7 @@
           <w:p>
             <w:pPr>
               <w:pStyle w:val="Compact"/>
+              <w:jc w:val="left"/>
             </w:pPr>
             <w:r>
               <w:t xml:space="preserve">0.431</w:t>
@@ -4773,6 +5594,7 @@
           <w:p>
             <w:pPr>
               <w:pStyle w:val="Compact"/>
+              <w:jc w:val="left"/>
             </w:pPr>
             <w:r>
               <w:t xml:space="preserve">0.274</w:t>
@@ -4784,6 +5606,7 @@
           <w:p>
             <w:pPr>
               <w:pStyle w:val="Compact"/>
+              <w:jc w:val="left"/>
             </w:pPr>
             <w:r>
               <w:t xml:space="preserve">0.667</w:t>
@@ -4795,6 +5618,7 @@
           <w:p>
             <w:pPr>
               <w:pStyle w:val="Compact"/>
+              <w:jc w:val="left"/>
             </w:pPr>
             <w:r>
               <w:t xml:space="preserve">2</w:t>
@@ -4806,6 +5630,7 @@
           <w:p>
             <w:pPr>
               <w:pStyle w:val="Compact"/>
+              <w:jc w:val="left"/>
             </w:pPr>
             <w:r>
               <w:t xml:space="preserve">No</w:t>
@@ -4817,6 +5642,7 @@
           <w:p>
             <w:pPr>
               <w:pStyle w:val="Compact"/>
+              <w:jc w:val="left"/>
             </w:pPr>
             <w:r>
               <w:t xml:space="preserve">0/6</w:t>
@@ -4830,6 +5656,7 @@
           <w:p>
             <w:pPr>
               <w:pStyle w:val="Compact"/>
+              <w:jc w:val="left"/>
             </w:pPr>
             <w:r>
               <w:t xml:space="preserve">Acetazolamide</w:t>
@@ -4841,6 +5668,7 @@
           <w:p>
             <w:pPr>
               <w:pStyle w:val="Compact"/>
+              <w:jc w:val="left"/>
             </w:pPr>
             <w:r>
               <w:t xml:space="preserve">Peripheral-differential</w:t>
@@ -4852,6 +5680,7 @@
           <w:p>
             <w:pPr>
               <w:pStyle w:val="Compact"/>
+              <w:jc w:val="left"/>
             </w:pPr>
             <w:r>
               <w:t xml:space="preserve">Cell adhesion / membrane</w:t>
@@ -4863,6 +5692,7 @@
           <w:p>
             <w:pPr>
               <w:pStyle w:val="Compact"/>
+              <w:jc w:val="left"/>
             </w:pPr>
             <w:r>
               <w:t xml:space="preserve">CA2</w:t>
@@ -4874,6 +5704,7 @@
           <w:p>
             <w:pPr>
               <w:pStyle w:val="Compact"/>
+              <w:jc w:val="left"/>
             </w:pPr>
             <w:r>
               <w:t xml:space="preserve">Approved (Phase IV)</w:t>
@@ -4885,6 +5716,7 @@
           <w:p>
             <w:pPr>
               <w:pStyle w:val="Compact"/>
+              <w:jc w:val="left"/>
             </w:pPr>
             <w:r>
               <w:t xml:space="preserve">No</w:t>
@@ -4896,6 +5728,7 @@
           <w:p>
             <w:pPr>
               <w:pStyle w:val="Compact"/>
+              <w:jc w:val="left"/>
             </w:pPr>
             <w:r>
               <w:t xml:space="preserve">0.422</w:t>
@@ -4907,6 +5740,7 @@
           <w:p>
             <w:pPr>
               <w:pStyle w:val="Compact"/>
+              <w:jc w:val="left"/>
             </w:pPr>
             <w:r>
               <w:t xml:space="preserve">0.249</w:t>
@@ -4918,6 +5752,7 @@
           <w:p>
             <w:pPr>
               <w:pStyle w:val="Compact"/>
+              <w:jc w:val="left"/>
             </w:pPr>
             <w:r>
               <w:t xml:space="preserve">0.682</w:t>
@@ -4929,6 +5764,7 @@
           <w:p>
             <w:pPr>
               <w:pStyle w:val="Compact"/>
+              <w:jc w:val="left"/>
             </w:pPr>
             <w:r>
               <w:t xml:space="preserve">4</w:t>
@@ -4940,6 +5776,7 @@
           <w:p>
             <w:pPr>
               <w:pStyle w:val="Compact"/>
+              <w:jc w:val="left"/>
             </w:pPr>
             <w:r>
               <w:t xml:space="preserve">No</w:t>
@@ -4951,6 +5788,7 @@
           <w:p>
             <w:pPr>
               <w:pStyle w:val="Compact"/>
+              <w:jc w:val="left"/>
             </w:pPr>
             <w:r>
               <w:t xml:space="preserve">2/6</w:t>
@@ -4964,6 +5802,7 @@
           <w:p>
             <w:pPr>
               <w:pStyle w:val="Compact"/>
+              <w:jc w:val="left"/>
             </w:pPr>
             <w:r>
               <w:t xml:space="preserve">Tranylcypromine</w:t>
@@ -4975,6 +5814,7 @@
           <w:p>
             <w:pPr>
               <w:pStyle w:val="Compact"/>
+              <w:jc w:val="left"/>
             </w:pPr>
             <w:r>
               <w:t xml:space="preserve">Peripheral-differential</w:t>
@@ -4986,6 +5826,7 @@
           <w:p>
             <w:pPr>
               <w:pStyle w:val="Compact"/>
+              <w:jc w:val="left"/>
             </w:pPr>
             <w:r>
               <w:t xml:space="preserve">Amino acid metabolism</w:t>
@@ -4997,6 +5838,7 @@
           <w:p>
             <w:pPr>
               <w:pStyle w:val="Compact"/>
+              <w:jc w:val="left"/>
             </w:pPr>
             <w:r>
               <w:t xml:space="preserve">MAOA</w:t>
@@ -5008,6 +5850,7 @@
           <w:p>
             <w:pPr>
               <w:pStyle w:val="Compact"/>
+              <w:jc w:val="left"/>
             </w:pPr>
             <w:r>
               <w:t xml:space="preserve">Approved (Phase IV)</w:t>
@@ -5019,6 +5862,7 @@
           <w:p>
             <w:pPr>
               <w:pStyle w:val="Compact"/>
+              <w:jc w:val="left"/>
             </w:pPr>
             <w:r>
               <w:t xml:space="preserve">No</w:t>
@@ -5030,6 +5874,7 @@
           <w:p>
             <w:pPr>
               <w:pStyle w:val="Compact"/>
+              <w:jc w:val="left"/>
             </w:pPr>
             <w:r>
               <w:t xml:space="preserve">0.421</w:t>
@@ -5041,6 +5886,7 @@
           <w:p>
             <w:pPr>
               <w:pStyle w:val="Compact"/>
+              <w:jc w:val="left"/>
             </w:pPr>
             <w:r>
               <w:t xml:space="preserve">0.258</w:t>
@@ -5052,6 +5898,7 @@
           <w:p>
             <w:pPr>
               <w:pStyle w:val="Compact"/>
+              <w:jc w:val="left"/>
             </w:pPr>
             <w:r>
               <w:t xml:space="preserve">0.667</w:t>
@@ -5063,6 +5910,7 @@
           <w:p>
             <w:pPr>
               <w:pStyle w:val="Compact"/>
+              <w:jc w:val="left"/>
             </w:pPr>
             <w:r>
               <w:t xml:space="preserve">3</w:t>
@@ -5074,6 +5922,7 @@
           <w:p>
             <w:pPr>
               <w:pStyle w:val="Compact"/>
+              <w:jc w:val="left"/>
             </w:pPr>
             <w:r>
               <w:t xml:space="preserve">No</w:t>
@@ -5085,6 +5934,7 @@
           <w:p>
             <w:pPr>
               <w:pStyle w:val="Compact"/>
+              <w:jc w:val="left"/>
             </w:pPr>
             <w:r>
               <w:t xml:space="preserve">2/6</w:t>
@@ -5098,6 +5948,7 @@
           <w:p>
             <w:pPr>
               <w:pStyle w:val="Compact"/>
+              <w:jc w:val="left"/>
             </w:pPr>
             <w:r>
               <w:t xml:space="preserve">Doxycycline</w:t>
@@ -5109,6 +5960,7 @@
           <w:p>
             <w:pPr>
               <w:pStyle w:val="Compact"/>
+              <w:jc w:val="left"/>
             </w:pPr>
             <w:r>
               <w:t xml:space="preserve">Peripheral-differential</w:t>
@@ -5120,6 +5972,7 @@
           <w:p>
             <w:pPr>
               <w:pStyle w:val="Compact"/>
+              <w:jc w:val="left"/>
             </w:pPr>
             <w:r>
               <w:t xml:space="preserve">Immune response</w:t>
@@ -5131,6 +5984,7 @@
           <w:p>
             <w:pPr>
               <w:pStyle w:val="Compact"/>
+              <w:jc w:val="left"/>
             </w:pPr>
             <w:r>
               <w:t xml:space="preserve">MMP8</w:t>
@@ -5142,6 +5996,7 @@
           <w:p>
             <w:pPr>
               <w:pStyle w:val="Compact"/>
+              <w:jc w:val="left"/>
             </w:pPr>
             <w:r>
               <w:t xml:space="preserve">Approved (Phase IV)</w:t>
@@ -5153,6 +6008,7 @@
           <w:p>
             <w:pPr>
               <w:pStyle w:val="Compact"/>
+              <w:jc w:val="left"/>
             </w:pPr>
             <w:r>
               <w:t xml:space="preserve">No</w:t>
@@ -5164,6 +6020,7 @@
           <w:p>
             <w:pPr>
               <w:pStyle w:val="Compact"/>
+              <w:jc w:val="left"/>
             </w:pPr>
             <w:r>
               <w:t xml:space="preserve">0.418</w:t>
@@ -5175,6 +6032,7 @@
           <w:p>
             <w:pPr>
               <w:pStyle w:val="Compact"/>
+              <w:jc w:val="left"/>
             </w:pPr>
             <w:r>
               <w:t xml:space="preserve">0.338</w:t>
@@ -5186,6 +6044,7 @@
           <w:p>
             <w:pPr>
               <w:pStyle w:val="Compact"/>
+              <w:jc w:val="left"/>
             </w:pPr>
             <w:r>
               <w:t xml:space="preserve">0.537</w:t>
@@ -5197,6 +6056,7 @@
           <w:p>
             <w:pPr>
               <w:pStyle w:val="Compact"/>
+              <w:jc w:val="left"/>
             </w:pPr>
             <w:r>
               <w:t xml:space="preserve">3</w:t>
@@ -5208,6 +6068,7 @@
           <w:p>
             <w:pPr>
               <w:pStyle w:val="Compact"/>
+              <w:jc w:val="left"/>
             </w:pPr>
             <w:r>
               <w:t xml:space="preserve">No</w:t>
@@ -5219,6 +6080,7 @@
           <w:p>
             <w:pPr>
               <w:pStyle w:val="Compact"/>
+              <w:jc w:val="left"/>
             </w:pPr>
             <w:r>
               <w:t xml:space="preserve">2/6</w:t>
@@ -5334,59 +6196,59 @@
       </w:r>
       <w:r>
         <w:rPr>
+          <w:iCs/>
           <w:i/>
-          <w:iCs/>
         </w:rPr>
         <w:t xml:space="preserve">Assembled from</w:t>
       </w:r>
       <w:r>
         <w:rPr>
+          <w:iCs/>
           <w:i/>
-          <w:iCs/>
         </w:rPr>
         <w:t xml:space="preserve"> </w:t>
       </w:r>
       <w:r>
         <w:rPr>
           <w:rStyle w:val="VerbatimChar"/>
+          <w:iCs/>
           <w:i/>
-          <w:iCs/>
         </w:rPr>
         <w:t xml:space="preserve">results/tables/pub/main/Tab4_EGFR_validation.tsv</w:t>
       </w:r>
       <w:r>
         <w:rPr>
+          <w:iCs/>
           <w:i/>
+        </w:rPr>
+        <w:t xml:space="preserve"> </w:t>
+      </w:r>
+      <w:r>
+        <w:rPr>
           <w:iCs/>
-        </w:rPr>
-        <w:t xml:space="preserve"> </w:t>
-      </w:r>
-      <w:r>
-        <w:rPr>
           <w:i/>
-          <w:iCs/>
         </w:rPr>
         <w:t xml:space="preserve">and</w:t>
       </w:r>
       <w:r>
         <w:rPr>
+          <w:iCs/>
           <w:i/>
-          <w:iCs/>
         </w:rPr>
         <w:t xml:space="preserve"> </w:t>
       </w:r>
       <w:r>
         <w:rPr>
           <w:rStyle w:val="VerbatimChar"/>
+          <w:iCs/>
           <w:i/>
-          <w:iCs/>
         </w:rPr>
         <w:t xml:space="preserve">Tab5_novel_candidates_by_module.tsv</w:t>
       </w:r>
       <w:r>
         <w:rPr>
+          <w:iCs/>
           <w:i/>
-          <w:iCs/>
         </w:rPr>
         <w:t xml:space="preserve">.</w:t>
       </w:r>
@@ -5398,8 +6260,8 @@
         </w:pict>
       </w:r>
     </w:p>
-    <w:bookmarkEnd w:id="46"/>
-    <w:bookmarkStart w:id="47" w:name="references"/>
+    <w:bookmarkEnd w:id="58"/>
+    <w:bookmarkStart w:id="59" w:name="references"/>
     <w:p>
       <w:pPr>
         <w:pStyle w:val="Heading1"/>
@@ -5408,7 +6270,7 @@
         <w:t xml:space="preserve">References</w:t>
       </w:r>
     </w:p>
-    <w:bookmarkEnd w:id="47"/>
+    <w:bookmarkEnd w:id="59"/>
     <w:sectPr>
       <w:footnotePr>
         <w:numRestart w:val="eachSect"/>
@@ -5444,14 +6306,14 @@
 <file path=word/numbering.xml><?xml version="1.0" encoding="utf-8"?>
 <w:numbering xmlns:w="http://schemas.openxmlformats.org/wordprocessingml/2006/main">
   <w:abstractNum w:abstractNumId="990">
-    <w:nsid w:val="0000A990"/>
+    <w:nsid w:val="A990"/>
     <w:multiLevelType w:val="multilevel"/>
     <w:lvl w:ilvl="0">
       <w:numFmt w:val="bullet"/>
       <w:lvlText w:val=" "/>
       <w:lvlJc w:val="left"/>
       <w:pPr>
-        <w:ind w:left="720" w:hanging="360"/>
+        <w:ind w:left="720" w:hanging="480"/>
       </w:pPr>
     </w:lvl>
     <w:lvl w:ilvl="1">
@@ -5459,7 +6321,7 @@
       <w:lvlText w:val=" "/>
       <w:lvlJc w:val="left"/>
       <w:pPr>
-        <w:ind w:left="1440" w:hanging="360"/>
+        <w:ind w:left="1440" w:hanging="480"/>
       </w:pPr>
     </w:lvl>
     <w:lvl w:ilvl="2">
@@ -5467,7 +6329,7 @@
       <w:lvlText w:val=" "/>
       <w:lvlJc w:val="left"/>
       <w:pPr>
-        <w:ind w:left="2160" w:hanging="360"/>
+        <w:ind w:left="2160" w:hanging="480"/>
       </w:pPr>
     </w:lvl>
     <w:lvl w:ilvl="3">
@@ -5475,7 +6337,7 @@
       <w:lvlText w:val=" "/>
       <w:lvlJc w:val="left"/>
       <w:pPr>
-        <w:ind w:left="2880" w:hanging="360"/>
+        <w:ind w:left="2880" w:hanging="480"/>
       </w:pPr>
     </w:lvl>
     <w:lvl w:ilvl="4">
@@ -5483,7 +6345,7 @@
       <w:lvlText w:val=" "/>
       <w:lvlJc w:val="left"/>
       <w:pPr>
-        <w:ind w:left="3600" w:hanging="360"/>
+        <w:ind w:left="3600" w:hanging="480"/>
       </w:pPr>
     </w:lvl>
     <w:lvl w:ilvl="5">
@@ -5491,7 +6353,7 @@
       <w:lvlText w:val=" "/>
       <w:lvlJc w:val="left"/>
       <w:pPr>
-        <w:ind w:left="4320" w:hanging="360"/>
+        <w:ind w:left="4320" w:hanging="480"/>
       </w:pPr>
     </w:lvl>
     <w:lvl w:ilvl="6">
@@ -5499,7 +6361,7 @@
       <w:lvlText w:val=" "/>
       <w:lvlJc w:val="left"/>
       <w:pPr>
-        <w:ind w:left="5040" w:hanging="360"/>
+        <w:ind w:left="5040" w:hanging="480"/>
       </w:pPr>
     </w:lvl>
     <w:lvl w:ilvl="7">
@@ -5507,7 +6369,7 @@
       <w:lvlText w:val=" "/>
       <w:lvlJc w:val="left"/>
       <w:pPr>
-        <w:ind w:left="5760" w:hanging="360"/>
+        <w:ind w:left="5760" w:hanging="480"/>
       </w:pPr>
     </w:lvl>
     <w:lvl w:ilvl="8">
@@ -5515,12 +6377,12 @@
       <w:lvlText w:val=" "/>
       <w:lvlJc w:val="left"/>
       <w:pPr>
-        <w:ind w:left="6480" w:hanging="360"/>
+        <w:ind w:left="6480" w:hanging="480"/>
       </w:pPr>
     </w:lvl>
   </w:abstractNum>
   <w:abstractNum w:abstractNumId="99831">
-    <w:nsid w:val="00A99831"/>
+    <w:nsid w:val="A99831"/>
     <w:multiLevelType w:val="multilevel"/>
     <w:lvl w:ilvl="0">
       <w:start w:val="1"/>
@@ -5528,7 +6390,7 @@
       <w:lvlText w:val="(%1)"/>
       <w:lvlJc w:val="left"/>
       <w:pPr>
-        <w:ind w:left="720" w:hanging="360"/>
+        <w:ind w:left="720" w:hanging="480"/>
       </w:pPr>
     </w:lvl>
     <w:lvl w:ilvl="1">
@@ -5537,7 +6399,7 @@
       <w:lvlText w:val="(%2)"/>
       <w:lvlJc w:val="left"/>
       <w:pPr>
-        <w:ind w:left="1440" w:hanging="360"/>
+        <w:ind w:left="1440" w:hanging="480"/>
       </w:pPr>
     </w:lvl>
     <w:lvl w:ilvl="2">
@@ -5546,7 +6408,7 @@
       <w:lvlText w:val="(%3)"/>
       <w:lvlJc w:val="left"/>
       <w:pPr>
-        <w:ind w:left="2160" w:hanging="360"/>
+        <w:ind w:left="2160" w:hanging="480"/>
       </w:pPr>
     </w:lvl>
     <w:lvl w:ilvl="3">
@@ -5555,7 +6417,7 @@
       <w:lvlText w:val="(%4)"/>
       <w:lvlJc w:val="left"/>
       <w:pPr>
-        <w:ind w:left="2880" w:hanging="360"/>
+        <w:ind w:left="2880" w:hanging="480"/>
       </w:pPr>
     </w:lvl>
     <w:lvl w:ilvl="4">
@@ -5564,7 +6426,7 @@
       <w:lvlText w:val="(%5)"/>
       <w:lvlJc w:val="left"/>
       <w:pPr>
-        <w:ind w:left="3600" w:hanging="360"/>
+        <w:ind w:left="3600" w:hanging="480"/>
       </w:pPr>
     </w:lvl>
     <w:lvl w:ilvl="5">
@@ -5573,7 +6435,7 @@
       <w:lvlText w:val="(%6)"/>
       <w:lvlJc w:val="left"/>
       <w:pPr>
-        <w:ind w:left="4320" w:hanging="360"/>
+        <w:ind w:left="4320" w:hanging="480"/>
       </w:pPr>
     </w:lvl>
     <w:lvl w:ilvl="6">
@@ -5582,7 +6444,7 @@
       <w:lvlText w:val="(%7)"/>
       <w:lvlJc w:val="left"/>
       <w:pPr>
-        <w:ind w:left="5040" w:hanging="360"/>
+        <w:ind w:left="5040" w:hanging="480"/>
       </w:pPr>
     </w:lvl>
     <w:lvl w:ilvl="7">
@@ -5591,7 +6453,7 @@
       <w:lvlText w:val="(%8)"/>
       <w:lvlJc w:val="left"/>
       <w:pPr>
-        <w:ind w:left="5760" w:hanging="360"/>
+        <w:ind w:left="5760" w:hanging="480"/>
       </w:pPr>
     </w:lvl>
     <w:lvl w:ilvl="8">
@@ -5600,7 +6462,7 @@
       <w:lvlText w:val="(%9)"/>
       <w:lvlJc w:val="left"/>
       <w:pPr>
-        <w:ind w:left="6480" w:hanging="360"/>
+        <w:ind w:left="6480" w:hanging="480"/>
       </w:pPr>
     </w:lvl>
   </w:abstractNum>
@@ -6375,8 +7237,8 @@
     <w:name w:val="KeywordTok"/>
     <w:basedOn w:val="VerbatimChar"/>
     <w:rPr>
+      <w:color w:val="007020"/>
       <w:b/>
-      <w:color w:val="007020"/>
     </w:rPr>
   </w:style>
   <w:style w:type="character" w:customStyle="1" w:styleId="DataTypeTok">
@@ -6453,42 +7315,42 @@
     <w:name w:val="ImportTok"/>
     <w:basedOn w:val="VerbatimChar"/>
     <w:rPr>
+      <w:color w:val="008000"/>
       <w:b/>
-      <w:color w:val="008000"/>
     </w:rPr>
   </w:style>
   <w:style w:type="character" w:customStyle="1" w:styleId="CommentTok">
     <w:name w:val="CommentTok"/>
     <w:basedOn w:val="VerbatimChar"/>
     <w:rPr>
+      <w:color w:val="60a0b0"/>
       <w:i/>
-      <w:color w:val="60a0b0"/>
     </w:rPr>
   </w:style>
   <w:style w:type="character" w:customStyle="1" w:styleId="DocumentationTok">
     <w:name w:val="DocumentationTok"/>
     <w:basedOn w:val="VerbatimChar"/>
     <w:rPr>
+      <w:color w:val="ba2121"/>
       <w:i/>
-      <w:color w:val="ba2121"/>
     </w:rPr>
   </w:style>
   <w:style w:type="character" w:customStyle="1" w:styleId="AnnotationTok">
     <w:name w:val="AnnotationTok"/>
     <w:basedOn w:val="VerbatimChar"/>
     <w:rPr>
+      <w:color w:val="60a0b0"/>
       <w:b/>
       <w:i/>
-      <w:color w:val="60a0b0"/>
     </w:rPr>
   </w:style>
   <w:style w:type="character" w:customStyle="1" w:styleId="CommentVarTok">
     <w:name w:val="CommentVarTok"/>
     <w:basedOn w:val="VerbatimChar"/>
     <w:rPr>
+      <w:color w:val="60a0b0"/>
       <w:b/>
       <w:i/>
-      <w:color w:val="60a0b0"/>
     </w:rPr>
   </w:style>
   <w:style w:type="character" w:customStyle="1" w:styleId="OtherTok">
@@ -6516,8 +7378,8 @@
     <w:name w:val="ControlFlowTok"/>
     <w:basedOn w:val="VerbatimChar"/>
     <w:rPr>
+      <w:color w:val="007020"/>
       <w:b/>
-      <w:color w:val="007020"/>
     </w:rPr>
   </w:style>
   <w:style w:type="character" w:customStyle="1" w:styleId="OperatorTok">
@@ -6562,34 +7424,34 @@
     <w:name w:val="InformationTok"/>
     <w:basedOn w:val="VerbatimChar"/>
     <w:rPr>
+      <w:color w:val="60a0b0"/>
       <w:b/>
       <w:i/>
-      <w:color w:val="60a0b0"/>
     </w:rPr>
   </w:style>
   <w:style w:type="character" w:customStyle="1" w:styleId="WarningTok">
     <w:name w:val="WarningTok"/>
     <w:basedOn w:val="VerbatimChar"/>
     <w:rPr>
+      <w:color w:val="60a0b0"/>
       <w:b/>
       <w:i/>
-      <w:color w:val="60a0b0"/>
     </w:rPr>
   </w:style>
   <w:style w:type="character" w:customStyle="1" w:styleId="AlertTok">
     <w:name w:val="AlertTok"/>
     <w:basedOn w:val="VerbatimChar"/>
     <w:rPr>
+      <w:color w:val="ff0000"/>
       <w:b/>
-      <w:color w:val="ff0000"/>
     </w:rPr>
   </w:style>
   <w:style w:type="character" w:customStyle="1" w:styleId="ErrorTok">
     <w:name w:val="ErrorTok"/>
     <w:basedOn w:val="VerbatimChar"/>
     <w:rPr>
+      <w:color w:val="ff0000"/>
       <w:b/>
-      <w:color w:val="ff0000"/>
     </w:rPr>
   </w:style>
   <w:style w:type="character" w:customStyle="1" w:styleId="NormalTok">

</xml_diff>

<commit_message>
docs(manuscript): revisión PI de Discussion — posicionamiento vs literatura previa, menos hedging, próximos pasos por eje
- Apertura lidera con candidatos/ejes (no el método)
- Integra contraste con repurposing previo en HNSCC: experimental (gu2022),
  in silico single-target (kumar2025), network-medicine pan-cáncer (cheng2019)
- Reencuadra composite≈centralidad como diseño intencional
- Corroboración EGFR independiente (li2024, wu2025); framing de combinación (noronha2023, oneill2022, flanary2023)
- Cierre con experimentos concretos por eje (epigenético/proteasoma/metabólico)
- +8 refs verificadas vía PubMed en references.bib y 8 filas en CLINICAL_CRITERIA.md
- Preview .md/.docx regenerados

Co-Authored-By: Claude Opus 4.8 <noreply@anthropic.com>
</commit_message>
<xml_diff>
--- a/docs/manuscript/manuscript_PREVIEW_pandoc_markers.docx
+++ b/docs/manuscript/manuscript_PREVIEW_pandoc_markers.docx
@@ -2,7 +2,7 @@
 <file path=word/document.xml><?xml version="1.0" encoding="utf-8"?>
 <w:document xmlns:w="http://schemas.openxmlformats.org/wordprocessingml/2006/main" xmlns:m="http://schemas.openxmlformats.org/officeDocument/2006/math" xmlns:r="http://schemas.openxmlformats.org/officeDocument/2006/relationships" xmlns:o="urn:schemas-microsoft-com:office:office" xmlns:v="urn:schemas-microsoft-com:vml" xmlns:w10="urn:schemas-microsoft-com:office:word" xmlns:a="http://schemas.openxmlformats.org/drawingml/2006/main" xmlns:pic="http://schemas.openxmlformats.org/drawingml/2006/picture" xmlns:wp="http://schemas.openxmlformats.org/drawingml/2006/wordprocessingDrawing">
   <w:body>
-    <w:bookmarkStart w:id="38" w:name="X7df104631777e44d6eb0fc0c46edb5233ca053f"/>
+    <w:bookmarkStart w:id="27" w:name="X7df104631777e44d6eb0fc0c46edb5233ca053f"/>
     <w:p>
       <w:pPr>
         <w:pStyle w:val="Heading1"/>
@@ -19,7 +19,7 @@
         <w:t xml:space="preserve">Partial preview for pipeline testing: Introduction, Methods, Results, Discussion, main-body figures (Fig 1-6) and the prioritized-candidate main table (Table 1). Abstract, Title and complete Methods/Results citations are pending (WRITING_PLAN.md steps 6-8). Citations shown are PubMed-verified; the bibliography is generated by pandoc / scanned in Zotero.</w:t>
       </w:r>
     </w:p>
-    <w:bookmarkStart w:id="20" w:name="introduction"/>
+    <w:bookmarkStart w:id="9" w:name="introduction"/>
     <w:p>
       <w:pPr>
         <w:pStyle w:val="Heading2"/>
@@ -308,8 +308,8 @@
         <w:t xml:space="preserve">new, biologically interpretable vulnerabilities with translational potential.</w:t>
       </w:r>
     </w:p>
-    <w:bookmarkEnd w:id="20"/>
-    <w:bookmarkStart w:id="29" w:name="methods"/>
+    <w:bookmarkEnd w:id="9"/>
+    <w:bookmarkStart w:id="18" w:name="methods"/>
     <w:p>
       <w:pPr>
         <w:pStyle w:val="Heading2"/>
@@ -318,7 +318,7 @@
         <w:t xml:space="preserve">Methods</w:t>
       </w:r>
     </w:p>
-    <w:bookmarkStart w:id="21" w:name="X507864d58becb81b3eabdd876d38b9b6f4db955"/>
+    <w:bookmarkStart w:id="10" w:name="X507864d58becb81b3eabdd876d38b9b6f4db955"/>
     <w:p>
       <w:pPr>
         <w:pStyle w:val="Heading3"/>
@@ -428,8 +428,8 @@
         <w:t xml:space="preserve">unchanged (Table S2).</w:t>
       </w:r>
     </w:p>
-    <w:bookmarkEnd w:id="21"/>
-    <w:bookmarkStart w:id="22" w:name="functional-enrichment"/>
+    <w:bookmarkEnd w:id="10"/>
+    <w:bookmarkStart w:id="11" w:name="functional-enrichment"/>
     <w:p>
       <w:pPr>
         <w:pStyle w:val="Heading3"/>
@@ -464,8 +464,8 @@
         <w:t xml:space="preserve">adjusted p &lt; 0.05; fixed seed for reproducible permutations).</w:t>
       </w:r>
     </w:p>
-    <w:bookmarkEnd w:id="22"/>
-    <w:bookmarkStart w:id="23" w:name="drugtarget-mapping-and-integration"/>
+    <w:bookmarkEnd w:id="11"/>
+    <w:bookmarkStart w:id="12" w:name="drugtarget-mapping-and-integration"/>
     <w:p>
       <w:pPr>
         <w:pStyle w:val="Heading3"/>
@@ -554,8 +554,8 @@
         <w:t xml:space="preserve">removal of a curated exclusion list.</w:t>
       </w:r>
     </w:p>
-    <w:bookmarkEnd w:id="23"/>
-    <w:bookmarkStart w:id="24" w:name="proteinprotein-interaction-network"/>
+    <w:bookmarkEnd w:id="12"/>
+    <w:bookmarkStart w:id="13" w:name="proteinprotein-interaction-network"/>
     <w:p>
       <w:pPr>
         <w:pStyle w:val="Heading3"/>
@@ -608,8 +608,8 @@
         <w:t xml:space="preserve">druggable hubs only; or below threshold).</w:t>
       </w:r>
     </w:p>
-    <w:bookmarkEnd w:id="24"/>
-    <w:bookmarkStart w:id="25" w:name="X7ce957a7690d2b853bda9e15015edb572eafc2c"/>
+    <w:bookmarkEnd w:id="13"/>
+    <w:bookmarkStart w:id="14" w:name="X7ce957a7690d2b853bda9e15015edb572eafc2c"/>
     <w:p>
       <w:pPr>
         <w:pStyle w:val="Heading3"/>
@@ -729,8 +729,8 @@
         <w:t xml:space="preserve">tie-breaker among agents sharing a target.</w:t>
       </w:r>
     </w:p>
-    <w:bookmarkEnd w:id="25"/>
-    <w:bookmarkStart w:id="26" w:name="robustness"/>
+    <w:bookmarkEnd w:id="14"/>
+    <w:bookmarkStart w:id="15" w:name="robustness"/>
     <w:p>
       <w:pPr>
         <w:pStyle w:val="Heading3"/>
@@ -777,8 +777,8 @@
         <w:t xml:space="preserve">permutation p-value.</w:t>
       </w:r>
     </w:p>
-    <w:bookmarkEnd w:id="26"/>
-    <w:bookmarkStart w:id="27" w:name="X64b44461957c12521484b842e13a272e3266eb7"/>
+    <w:bookmarkEnd w:id="15"/>
+    <w:bookmarkStart w:id="16" w:name="X64b44461957c12521484b842e13a272e3266eb7"/>
     <w:p>
       <w:pPr>
         <w:pStyle w:val="Heading3"/>
@@ -858,8 +858,8 @@
         <w:t xml:space="preserve">annotated per target).</w:t>
       </w:r>
     </w:p>
-    <w:bookmarkEnd w:id="27"/>
-    <w:bookmarkStart w:id="28" w:name="software-and-reproducibility"/>
+    <w:bookmarkEnd w:id="16"/>
+    <w:bookmarkStart w:id="17" w:name="software-and-reproducibility"/>
     <w:p>
       <w:pPr>
         <w:pStyle w:val="Heading3"/>
@@ -912,9 +912,9 @@
         <w:t xml:space="preserve">statement will be provided at submission.</w:t>
       </w:r>
     </w:p>
-    <w:bookmarkEnd w:id="28"/>
-    <w:bookmarkEnd w:id="29"/>
-    <w:bookmarkStart w:id="36" w:name="results"/>
+    <w:bookmarkEnd w:id="17"/>
+    <w:bookmarkEnd w:id="18"/>
+    <w:bookmarkStart w:id="25" w:name="results"/>
     <w:p>
       <w:pPr>
         <w:pStyle w:val="Heading2"/>
@@ -923,7 +923,7 @@
         <w:t xml:space="preserve">Results</w:t>
       </w:r>
     </w:p>
-    <w:bookmarkStart w:id="30" w:name="Xa5daa2bb187e1e8dfecc2ef96fa7f2aebb26deb"/>
+    <w:bookmarkStart w:id="19" w:name="Xa5daa2bb187e1e8dfecc2ef96fa7f2aebb26deb"/>
     <w:p>
       <w:pPr>
         <w:pStyle w:val="Heading3"/>
@@ -1032,8 +1032,8 @@
         <w:t xml:space="preserve">conclusions about the prioritized targets and the OXPHOS axis hold up regardless of tissue composition.</w:t>
       </w:r>
     </w:p>
-    <w:bookmarkEnd w:id="30"/>
-    <w:bookmarkStart w:id="31" w:name="multi-source-druggable-candidate-space"/>
+    <w:bookmarkEnd w:id="19"/>
+    <w:bookmarkStart w:id="20" w:name="multi-source-druggable-candidate-space"/>
     <w:p>
       <w:pPr>
         <w:pStyle w:val="Heading3"/>
@@ -1080,8 +1080,8 @@
         <w:t xml:space="preserve">plot confirmed that the candidates were not an artifact of any single database (Fig 3C).</w:t>
       </w:r>
     </w:p>
-    <w:bookmarkEnd w:id="31"/>
-    <w:bookmarkStart w:id="32" w:name="X667b2ef2f3d1c648f40f67b8885bf345af9cef5"/>
+    <w:bookmarkEnd w:id="20"/>
+    <w:bookmarkStart w:id="21" w:name="X667b2ef2f3d1c648f40f67b8885bf345af9cef5"/>
     <w:p>
       <w:pPr>
         <w:pStyle w:val="Heading3"/>
@@ -1188,8 +1188,8 @@
         <w:t xml:space="preserve">module; the OXPHOS and proteasome pillars share the names of their modules.</w:t>
       </w:r>
     </w:p>
-    <w:bookmarkEnd w:id="32"/>
-    <w:bookmarkStart w:id="33" w:name="X70074d69435daa689fddf7b24d5faf48dd08b02"/>
+    <w:bookmarkEnd w:id="21"/>
+    <w:bookmarkStart w:id="22" w:name="X70074d69435daa689fddf7b24d5faf48dd08b02"/>
     <w:p>
       <w:pPr>
         <w:pStyle w:val="Heading3"/>
@@ -1345,8 +1345,8 @@
         <w:t xml:space="preserve">modules is provided in Table S5, and candidate provenance in Table S3.</w:t>
       </w:r>
     </w:p>
-    <w:bookmarkEnd w:id="33"/>
-    <w:bookmarkStart w:id="34" w:name="X284fdd6315c372fde6cdcbc15acfe1a88046859"/>
+    <w:bookmarkEnd w:id="22"/>
+    <w:bookmarkStart w:id="23" w:name="X284fdd6315c372fde6cdcbc15acfe1a88046859"/>
     <w:p>
       <w:pPr>
         <w:pStyle w:val="Heading3"/>
@@ -1423,8 +1423,8 @@
         <w:t xml:space="preserve">efficacy or of the candidate rank order.</w:t>
       </w:r>
     </w:p>
-    <w:bookmarkEnd w:id="34"/>
-    <w:bookmarkStart w:id="35" w:name="robustness-of-the-ranking"/>
+    <w:bookmarkEnd w:id="23"/>
+    <w:bookmarkStart w:id="24" w:name="robustness-of-the-ranking"/>
     <w:p>
       <w:pPr>
         <w:pStyle w:val="Heading3"/>
@@ -1477,9 +1477,9 @@
         <w:t xml:space="preserve">(Table 1, robustness columns), defining a robust core panel.</w:t>
       </w:r>
     </w:p>
-    <w:bookmarkEnd w:id="35"/>
-    <w:bookmarkEnd w:id="36"/>
-    <w:bookmarkStart w:id="37" w:name="discussion"/>
+    <w:bookmarkEnd w:id="24"/>
+    <w:bookmarkEnd w:id="25"/>
+    <w:bookmarkStart w:id="26" w:name="discussion"/>
     <w:p>
       <w:pPr>
         <w:pStyle w:val="Heading2"/>
@@ -1511,55 +1511,61 @@
         <w:t xml:space="preserve"> </w:t>
       </w:r>
       <w:r>
-        <w:t xml:space="preserve">proposes a credible, mechanistically organized shortlist of repurposing candidates that resolves</w:t>
-      </w:r>
-      <w:r>
-        <w:t xml:space="preserve"> </w:t>
-      </w:r>
-      <w:r>
-        <w:t xml:space="preserve">into interpretable therapeutic axes (EGFR, epigenetic, proteasome, and metabolic), each with a</w:t>
-      </w:r>
-      <w:r>
-        <w:t xml:space="preserve"> </w:t>
-      </w:r>
-      <w:r>
-        <w:t xml:space="preserve">biological rationale a translational reader can evaluate. Two observations argue for taking the</w:t>
-      </w:r>
-      <w:r>
-        <w:t xml:space="preserve"> </w:t>
-      </w:r>
-      <w:r>
-        <w:t xml:space="preserve">shortlist seriously. First, without disease-specific tuning, the analysis re-discovered the EGFR</w:t>
-      </w:r>
-      <w:r>
-        <w:t xml:space="preserve"> </w:t>
-      </w:r>
-      <w:r>
-        <w:t xml:space="preserve">axis, the molecular target with established approved therapy in HNSCC [@burtness2019; @carosi2026].</w:t>
-      </w:r>
-      <w:r>
-        <w:t xml:space="preserve"> </w:t>
-      </w:r>
-      <w:r>
-        <w:t xml:space="preserve">Second, the direction of change in the prioritized targets was reproduced across two independent</w:t>
-      </w:r>
-      <w:r>
-        <w:t xml:space="preserve"> </w:t>
-      </w:r>
-      <w:r>
-        <w:t xml:space="preserve">cohorts. The prioritization procedure itself, which weighs where a target sits in the tumor protein</w:t>
-      </w:r>
-      <w:r>
-        <w:t xml:space="preserve"> </w:t>
-      </w:r>
-      <w:r>
-        <w:t xml:space="preserve">network alongside how deployable its drug is rather than fold-change magnitude alone, is the means</w:t>
-      </w:r>
-      <w:r>
-        <w:t xml:space="preserve"> </w:t>
-      </w:r>
-      <w:r>
-        <w:t xml:space="preserve">to this end rather than the focus of the work.</w:t>
+        <w:t xml:space="preserve">delivers a mechanistically organized shortlist of repurposing candidates that resolves into four</w:t>
+      </w:r>
+      <w:r>
+        <w:t xml:space="preserve"> </w:t>
+      </w:r>
+      <w:r>
+        <w:t xml:space="preserve">interpretable therapeutic axes: EGFR (cetuximab and other anti-EGFR agents), epigenetic</w:t>
+      </w:r>
+      <w:r>
+        <w:t xml:space="preserve"> </w:t>
+      </w:r>
+      <w:r>
+        <w:t xml:space="preserve">(decitabine, azacitidine, tranylcypromine), proteasome (carfilzomib), and metabolic (metformin).</w:t>
+      </w:r>
+      <w:r>
+        <w:t xml:space="preserve"> </w:t>
+      </w:r>
+      <w:r>
+        <w:t xml:space="preserve">Two observations argue for taking the shortlist seriously. First, without disease-specific tuning,</w:t>
+      </w:r>
+      <w:r>
+        <w:t xml:space="preserve"> </w:t>
+      </w:r>
+      <w:r>
+        <w:t xml:space="preserve">the analysis re-discovered the EGFR axis, the only molecular target with established approved</w:t>
+      </w:r>
+      <w:r>
+        <w:t xml:space="preserve"> </w:t>
+      </w:r>
+      <w:r>
+        <w:t xml:space="preserve">therapy in HNSCC [@burtness2019; @carosi2026]. Second, the direction of change in the prioritized</w:t>
+      </w:r>
+      <w:r>
+        <w:t xml:space="preserve"> </w:t>
+      </w:r>
+      <w:r>
+        <w:t xml:space="preserve">targets was reproduced across two independent cohorts. The prioritization that produced this</w:t>
+      </w:r>
+      <w:r>
+        <w:t xml:space="preserve"> </w:t>
+      </w:r>
+      <w:r>
+        <w:t xml:space="preserve">shortlist weighs where a target sits in the tumor protein network together with how deployable its</w:t>
+      </w:r>
+      <w:r>
+        <w:t xml:space="preserve"> </w:t>
+      </w:r>
+      <w:r>
+        <w:t xml:space="preserve">drug is, rather than fold-change magnitude alone; it is the means by which the candidates are</w:t>
+      </w:r>
+      <w:r>
+        <w:t xml:space="preserve"> </w:t>
+      </w:r>
+      <w:r>
+        <w:t xml:space="preserve">ranked, not the claim of the work.</w:t>
       </w:r>
     </w:p>
     <w:p>
@@ -1585,7 +1591,25 @@
         <w:t xml:space="preserve"> </w:t>
       </w:r>
       <w:r>
-        <w:t xml:space="preserve">obvious ones. Beyond this control, the result invites viewing EGFR not as an isolated receptor but</w:t>
+        <w:t xml:space="preserve">obvious ones. The recovery is consistent with independent HNSCC analyses that converge on EGFR by</w:t>
+      </w:r>
+      <w:r>
+        <w:t xml:space="preserve"> </w:t>
+      </w:r>
+      <w:r>
+        <w:t xml:space="preserve">different routes, including single-cell nominations of anti-EGFR agents [@li2024] and proteogenomic</w:t>
+      </w:r>
+      <w:r>
+        <w:t xml:space="preserve"> </w:t>
+      </w:r>
+      <w:r>
+        <w:t xml:space="preserve">stratification in which EGFR-high tumors respond to cetuximab in patient-derived xenografts</w:t>
+      </w:r>
+      <w:r>
+        <w:t xml:space="preserve"> </w:t>
+      </w:r>
+      <w:r>
+        <w:t xml:space="preserve">[@wu2025]. Beyond this control, the result invites viewing EGFR not as an isolated receptor but</w:t>
       </w:r>
       <w:r>
         <w:t xml:space="preserve"> </w:t>
@@ -1641,19 +1665,19 @@
         <w:pStyle w:val="BodyText"/>
       </w:pPr>
       <w:r>
-        <w:t xml:space="preserve">Two non-canonical axes are, in our reading, the most novel. The epigenetic axis, anchored by DNMT1</w:t>
-      </w:r>
-      <w:r>
-        <w:t xml:space="preserve"> </w:t>
-      </w:r>
-      <w:r>
-        <w:t xml:space="preserve">(decitabine, azacitidine) and MAOA (tranylcypromine), suggests that chromatin and DNA-methylation</w:t>
-      </w:r>
-      <w:r>
-        <w:t xml:space="preserve"> </w:t>
-      </w:r>
-      <w:r>
-        <w:t xml:space="preserve">regulators may be an integral part of the HNSCC tumor state rather than only a secondary</w:t>
+        <w:t xml:space="preserve">Two non-canonical axes are the most novel nominations. The epigenetic axis, anchored by DNMT1</w:t>
+      </w:r>
+      <w:r>
+        <w:t xml:space="preserve"> </w:t>
+      </w:r>
+      <w:r>
+        <w:t xml:space="preserve">(decitabine, azacitidine) and MAOA (tranylcypromine), implicates chromatin and DNA-methylation</w:t>
+      </w:r>
+      <w:r>
+        <w:t xml:space="preserve"> </w:t>
+      </w:r>
+      <w:r>
+        <w:t xml:space="preserve">regulators as an integral part of the HNSCC tumor state rather than only a secondary</w:t>
       </w:r>
       <w:r>
         <w:t xml:space="preserve"> </w:t>
@@ -1793,7 +1817,7 @@
         <w:t xml:space="preserve"> </w:t>
       </w:r>
       <w:r>
-        <w:t xml:space="preserve">the metabolic module (composite 0.591) through the high network centrality of its anchor, NDUFS2,</w:t>
+        <w:t xml:space="preserve">the metabolic module (composite 0.59) through the high network centrality of its anchor, NDUFS2,</w:t>
       </w:r>
       <w:r>
         <w:t xml:space="preserve"> </w:t>
@@ -1867,91 +1891,145 @@
         <w:pStyle w:val="BodyText"/>
       </w:pPr>
       <w:r>
-        <w:t xml:space="preserve">More broadly, weighting network position together with drug deployability and cross-cohort support</w:t>
-      </w:r>
-      <w:r>
-        <w:t xml:space="preserve"> </w:t>
-      </w:r>
-      <w:r>
-        <w:t xml:space="preserve">is intended to yield a list that is actionable, not merely ranked. By design the composite is</w:t>
-      </w:r>
-      <w:r>
-        <w:t xml:space="preserve"> </w:t>
-      </w:r>
-      <w:r>
-        <w:t xml:space="preserve">dominated by network centrality (Spearman rho approximately 0.78 with centrality alone), with the</w:t>
-      </w:r>
-      <w:r>
-        <w:t xml:space="preserve"> </w:t>
-      </w:r>
-      <w:r>
-        <w:t xml:space="preserve">drug-level DrugViability term acting mainly as a clinical and pharmacological tie-breaker among</w:t>
-      </w:r>
-      <w:r>
-        <w:t xml:space="preserve"> </w:t>
-      </w:r>
-      <w:r>
-        <w:t xml:space="preserve">agents that share a target; we therefore present the score as a transparent aggregation of evidence</w:t>
-      </w:r>
-      <w:r>
-        <w:t xml:space="preserve"> </w:t>
-      </w:r>
-      <w:r>
-        <w:t xml:space="preserve">rather than as a method whose superiority over fold-change or database-count ranking is</w:t>
-      </w:r>
-      <w:r>
-        <w:t xml:space="preserve"> </w:t>
-      </w:r>
-      <w:r>
-        <w:t xml:space="preserve">established, a comparison that would require dedicated benchmarking [@pushpakom2019; @tanoli2025].</w:t>
-      </w:r>
-      <w:r>
-        <w:t xml:space="preserve"> </w:t>
-      </w:r>
-      <w:r>
-        <w:t xml:space="preserve">This network-centric view, in which therapeutic effect may depend on modulating functional modules</w:t>
-      </w:r>
-      <w:r>
-        <w:t xml:space="preserve"> </w:t>
-      </w:r>
-      <w:r>
-        <w:t xml:space="preserve">rather than single proteins, is consistent with network-medicine principles [@barabasi2011].</w:t>
-      </w:r>
-      <w:r>
-        <w:t xml:space="preserve"> </w:t>
-      </w:r>
-      <w:r>
-        <w:t xml:space="preserve">Several prioritized agents are approved for non-oncologic indications (valproate, acetazolamide,</w:t>
-      </w:r>
-      <w:r>
-        <w:t xml:space="preserve"> </w:t>
-      </w:r>
-      <w:r>
-        <w:t xml:space="preserve">disulfiram) and could in principle offer short-horizon, accessible repurposing options. The</w:t>
-      </w:r>
-      <w:r>
-        <w:t xml:space="preserve"> </w:t>
-      </w:r>
-      <w:r>
-        <w:t xml:space="preserve">relevance of such combination candidates may be heightened by the field’s shift toward</w:t>
-      </w:r>
-      <w:r>
-        <w:t xml:space="preserve"> </w:t>
-      </w:r>
-      <w:r>
-        <w:t xml:space="preserve">perioperative, immunotherapy-based regimens in resectable HNSCC [@uppaluri2025], a setting in which</w:t>
-      </w:r>
-      <w:r>
-        <w:t xml:space="preserve"> </w:t>
-      </w:r>
-      <w:r>
-        <w:t xml:space="preserve">agents that prime or sensitize the tumor microenvironment could complement checkpoint blockade,</w:t>
-      </w:r>
-      <w:r>
-        <w:t xml:space="preserve"> </w:t>
-      </w:r>
-      <w:r>
-        <w:t xml:space="preserve">although our data speak to target biology rather than to patient selection.</w:t>
+        <w:t xml:space="preserve">More broadly, this study sits within, but is distinct from, prior repurposing efforts in HNSCC.</w:t>
+      </w:r>
+      <w:r>
+        <w:t xml:space="preserve"> </w:t>
+      </w:r>
+      <w:r>
+        <w:t xml:space="preserve">Experimental high-throughput screens nominate candidates directly from drug response but depend on</w:t>
+      </w:r>
+      <w:r>
+        <w:t xml:space="preserve"> </w:t>
+      </w:r>
+      <w:r>
+        <w:t xml:space="preserve">dedicated cell or patient-derived-cell resources [@gu2022], whereas existing in silico efforts have</w:t>
+      </w:r>
+      <w:r>
+        <w:t xml:space="preserve"> </w:t>
+      </w:r>
+      <w:r>
+        <w:t xml:space="preserve">typically operated on transcriptomic or genomic data from public repositories and converged on a</w:t>
+      </w:r>
+      <w:r>
+        <w:t xml:space="preserve"> </w:t>
+      </w:r>
+      <w:r>
+        <w:t xml:space="preserve">single hub target and a single drug [@kumar2025], or have applied network-medicine frameworks to</w:t>
+      </w:r>
+      <w:r>
+        <w:t xml:space="preserve"> </w:t>
+      </w:r>
+      <w:r>
+        <w:t xml:space="preserve">pan-cancer interactome modules rather than to a disease-specific proteome [@cheng2019; @barabasi2011].</w:t>
+      </w:r>
+      <w:r>
+        <w:t xml:space="preserve"> </w:t>
+      </w:r>
+      <w:r>
+        <w:t xml:space="preserve">Our contribution is the combination of three features: a paired tumor/normal DIA proteome as the</w:t>
+      </w:r>
+      <w:r>
+        <w:t xml:space="preserve"> </w:t>
+      </w:r>
+      <w:r>
+        <w:t xml:space="preserve">substrate, closer to the functional effector layer than mRNA; a network-centrality and</w:t>
+      </w:r>
+      <w:r>
+        <w:t xml:space="preserve"> </w:t>
+      </w:r>
+      <w:r>
+        <w:t xml:space="preserve">drug-deployability composite that resolves into several mechanistic axes rather than one target; and</w:t>
+      </w:r>
+      <w:r>
+        <w:t xml:space="preserve"> </w:t>
+      </w:r>
+      <w:r>
+        <w:t xml:space="preserve">directional corroboration across two external cohorts. By design the composite is dominated by</w:t>
+      </w:r>
+      <w:r>
+        <w:t xml:space="preserve"> </w:t>
+      </w:r>
+      <w:r>
+        <w:t xml:space="preserve">network centrality (Spearman rho approximately 0.78 with centrality alone): centrality carries the</w:t>
+      </w:r>
+      <w:r>
+        <w:t xml:space="preserve"> </w:t>
+      </w:r>
+      <w:r>
+        <w:t xml:space="preserve">biological signal, while the drug-level DrugViability term determines which agent to advance among</w:t>
+      </w:r>
+      <w:r>
+        <w:t xml:space="preserve"> </w:t>
+      </w:r>
+      <w:r>
+        <w:t xml:space="preserve">compounds that share a prioritized target. We therefore present the score as a transparent</w:t>
+      </w:r>
+      <w:r>
+        <w:t xml:space="preserve"> </w:t>
+      </w:r>
+      <w:r>
+        <w:t xml:space="preserve">aggregation of evidence rather than as a method whose superiority over fold-change or database-count</w:t>
+      </w:r>
+      <w:r>
+        <w:t xml:space="preserve"> </w:t>
+      </w:r>
+      <w:r>
+        <w:t xml:space="preserve">ranking is established, a comparison that would require dedicated benchmarking</w:t>
+      </w:r>
+      <w:r>
+        <w:t xml:space="preserve"> </w:t>
+      </w:r>
+      <w:r>
+        <w:t xml:space="preserve">[@pushpakom2019; @tanoli2025; @flanary2023]. Several prioritized agents are approved for</w:t>
+      </w:r>
+      <w:r>
+        <w:t xml:space="preserve"> </w:t>
+      </w:r>
+      <w:r>
+        <w:t xml:space="preserve">non-oncologic indications (valproate, acetazolamide, disulfiram) and could in principle offer</w:t>
+      </w:r>
+      <w:r>
+        <w:t xml:space="preserve"> </w:t>
+      </w:r>
+      <w:r>
+        <w:t xml:space="preserve">short-horizon, accessible repurposing options. Because single-agent repurposing has frequently</w:t>
+      </w:r>
+      <w:r>
+        <w:t xml:space="preserve"> </w:t>
+      </w:r>
+      <w:r>
+        <w:t xml:space="preserve">failed in HNSCC, as in a randomized trial of pantoprazole added to systemic therapy [@noronha2023],</w:t>
+      </w:r>
+      <w:r>
+        <w:t xml:space="preserve"> </w:t>
+      </w:r>
+      <w:r>
+        <w:t xml:space="preserve">and because the field is shifting toward perioperative, immunotherapy-based regimens in resectable</w:t>
+      </w:r>
+      <w:r>
+        <w:t xml:space="preserve"> </w:t>
+      </w:r>
+      <w:r>
+        <w:t xml:space="preserve">disease [@uppaluri2025], the prioritized agents are best positioned as combination candidates:</w:t>
+      </w:r>
+      <w:r>
+        <w:t xml:space="preserve"> </w:t>
+      </w:r>
+      <w:r>
+        <w:t xml:space="preserve">those that prime or sensitize the tumor microenvironment could complement checkpoint blockade, as</w:t>
+      </w:r>
+      <w:r>
+        <w:t xml:space="preserve"> </w:t>
+      </w:r>
+      <w:r>
+        <w:t xml:space="preserve">illustrated by repurposed fenofibrate in HPV+ models [@oneill2022], although our data speak to</w:t>
+      </w:r>
+      <w:r>
+        <w:t xml:space="preserve"> </w:t>
+      </w:r>
+      <w:r>
+        <w:t xml:space="preserve">target biology rather than to patient selection.</w:t>
       </w:r>
     </w:p>
     <w:p>
@@ -2049,36 +2127,80 @@
         <w:t xml:space="preserve"> </w:t>
       </w:r>
       <w:r>
-        <w:t xml:space="preserve">lower-confidence nominations. Finally, this is an in silico prioritization: the candidates are</w:t>
-      </w:r>
-      <w:r>
-        <w:t xml:space="preserve"> </w:t>
-      </w:r>
-      <w:r>
-        <w:t xml:space="preserve">hypotheses, and functional preclinical validation will be required, particularly for the</w:t>
-      </w:r>
-      <w:r>
-        <w:t xml:space="preserve"> </w:t>
-      </w:r>
-      <w:r>
-        <w:t xml:space="preserve">under-explored epigenetic and proteasome axes. Within these bounds, the study offers a credible,</w:t>
-      </w:r>
-      <w:r>
-        <w:t xml:space="preserve"> </w:t>
-      </w:r>
-      <w:r>
-        <w:t xml:space="preserve">mechanism-organized set of repurposing candidates and a prioritized agenda for preclinical and</w:t>
-      </w:r>
-      <w:r>
-        <w:t xml:space="preserve"> </w:t>
-      </w:r>
-      <w:r>
-        <w:t xml:space="preserve">combination-trial follow-up in HNSCC.</w:t>
-      </w:r>
-    </w:p>
-    <w:bookmarkEnd w:id="37"/>
-    <w:bookmarkEnd w:id="38"/>
-    <w:bookmarkStart w:id="57" w:name="figures"/>
+        <w:t xml:space="preserve">lower-confidence nominations.</w:t>
+      </w:r>
+    </w:p>
+    <w:p>
+      <w:pPr>
+        <w:pStyle w:val="BodyText"/>
+      </w:pPr>
+      <w:r>
+        <w:t xml:space="preserve">This is an in silico prioritization, so the candidates are hypotheses that require functional</w:t>
+      </w:r>
+      <w:r>
+        <w:t xml:space="preserve"> </w:t>
+      </w:r>
+      <w:r>
+        <w:t xml:space="preserve">validation, and the axes suggest concrete next experiments. The epigenetic axis is most directly</w:t>
+      </w:r>
+      <w:r>
+        <w:t xml:space="preserve"> </w:t>
+      </w:r>
+      <w:r>
+        <w:t xml:space="preserve">testable through a prime-then-checkpoint sequence, decitabine or azacitidine followed by PD-1</w:t>
+      </w:r>
+      <w:r>
+        <w:t xml:space="preserve"> </w:t>
+      </w:r>
+      <w:r>
+        <w:t xml:space="preserve">blockade, in immunocompetent HNSCC models with readouts of tumor-infiltrating lymphocytes and PD-L1</w:t>
+      </w:r>
+      <w:r>
+        <w:t xml:space="preserve"> </w:t>
+      </w:r>
+      <w:r>
+        <w:t xml:space="preserve">[@bear2025]. The proteasome axis warrants dose-response testing of carfilzomib in HNSCC cell lines</w:t>
+      </w:r>
+      <w:r>
+        <w:t xml:space="preserve"> </w:t>
+      </w:r>
+      <w:r>
+        <w:t xml:space="preserve">and patient-derived xenografts with an unfolded-protein-response readout, the under-explored axis</w:t>
+      </w:r>
+      <w:r>
+        <w:t xml:space="preserve"> </w:t>
+      </w:r>
+      <w:r>
+        <w:t xml:space="preserve">with the least precedent in solid tumors [@zang2012]. The metabolic axis is the closest to the</w:t>
+      </w:r>
+      <w:r>
+        <w:t xml:space="preserve"> </w:t>
+      </w:r>
+      <w:r>
+        <w:t xml:space="preserve">clinic and is best advanced as metformin combined with chemoradiation or checkpoint blockade rather</w:t>
+      </w:r>
+      <w:r>
+        <w:t xml:space="preserve"> </w:t>
+      </w:r>
+      <w:r>
+        <w:t xml:space="preserve">than as monotherapy, building on early-phase tolerability data [@kemnade2023]. Within these bounds,</w:t>
+      </w:r>
+      <w:r>
+        <w:t xml:space="preserve"> </w:t>
+      </w:r>
+      <w:r>
+        <w:t xml:space="preserve">the study offers a credible, mechanism-organized set of repurposing candidates and a prioritized</w:t>
+      </w:r>
+      <w:r>
+        <w:t xml:space="preserve"> </w:t>
+      </w:r>
+      <w:r>
+        <w:t xml:space="preserve">agenda for preclinical and combination-trial follow-up in HNSCC.</w:t>
+      </w:r>
+    </w:p>
+    <w:bookmarkEnd w:id="26"/>
+    <w:bookmarkEnd w:id="27"/>
+    <w:bookmarkStart w:id="46" w:name="figures"/>
     <w:p>
       <w:pPr>
         <w:pStyle w:val="Heading1"/>
@@ -2096,18 +2218,18 @@
           <wp:inline>
             <wp:extent cx="5334000" cy="2581427"/>
             <wp:effectExtent b="0" l="0" r="0" t="0"/>
-            <wp:docPr descr="" title="" id="40" name="Picture"/>
+            <wp:docPr descr="" title="" id="29" name="Picture"/>
             <a:graphic>
               <a:graphicData uri="http://schemas.openxmlformats.org/drawingml/2006/picture">
                 <pic:pic>
                   <pic:nvPicPr>
-                    <pic:cNvPr descr="../../results/figures/pub/main/Fig1_workflow.png" id="41" name="Picture"/>
+                    <pic:cNvPr descr="../../results/figures/pub/main/Fig1_workflow.png" id="30" name="Picture"/>
                     <pic:cNvPicPr>
                       <a:picLocks noChangeArrowheads="1" noChangeAspect="1"/>
                     </pic:cNvPicPr>
                   </pic:nvPicPr>
                   <pic:blipFill>
-                    <a:blip r:embed="rId39"/>
+                    <a:blip r:embed="rId28"/>
                     <a:stretch>
                       <a:fillRect/>
                     </a:stretch>
@@ -2225,18 +2347,18 @@
           <wp:inline>
             <wp:extent cx="5334000" cy="6325590"/>
             <wp:effectExtent b="0" l="0" r="0" t="0"/>
-            <wp:docPr descr="" title="" id="43" name="Picture"/>
+            <wp:docPr descr="" title="" id="32" name="Picture"/>
             <a:graphic>
               <a:graphicData uri="http://schemas.openxmlformats.org/drawingml/2006/picture">
                 <pic:pic>
                   <pic:nvPicPr>
-                    <pic:cNvPr descr="../../results/figures/pub/main/Fig2_multipanel.png" id="44" name="Picture"/>
+                    <pic:cNvPr descr="../../results/figures/pub/main/Fig2_multipanel.png" id="33" name="Picture"/>
                     <pic:cNvPicPr>
                       <a:picLocks noChangeArrowheads="1" noChangeAspect="1"/>
                     </pic:cNvPicPr>
                   </pic:nvPicPr>
                   <pic:blipFill>
-                    <a:blip r:embed="rId42"/>
+                    <a:blip r:embed="rId31"/>
                     <a:stretch>
                       <a:fillRect/>
                     </a:stretch>
@@ -2273,11 +2395,11 @@
     </w:p>
     <w:p>
       <w:pPr>
+        <w:pStyle w:val="Compact"/>
         <w:numPr>
           <w:ilvl w:val="0"/>
           <w:numId w:val="1001"/>
         </w:numPr>
-        <w:pStyle w:val="Compact"/>
       </w:pPr>
       <w:r>
         <w:t xml:space="preserve">Volcano plot of differential protein abundance in tumor versus adjacent-normal tissue</w:t>
@@ -2358,18 +2480,18 @@
           <wp:inline>
             <wp:extent cx="5334000" cy="4161315"/>
             <wp:effectExtent b="0" l="0" r="0" t="0"/>
-            <wp:docPr descr="" title="" id="46" name="Picture"/>
+            <wp:docPr descr="" title="" id="35" name="Picture"/>
             <a:graphic>
               <a:graphicData uri="http://schemas.openxmlformats.org/drawingml/2006/picture">
                 <pic:pic>
                   <pic:nvPicPr>
-                    <pic:cNvPr descr="../../results/figures/pub/main/Fig3_multipanel.png" id="47" name="Picture"/>
+                    <pic:cNvPr descr="../../results/figures/pub/main/Fig3_multipanel.png" id="36" name="Picture"/>
                     <pic:cNvPicPr>
                       <a:picLocks noChangeArrowheads="1" noChangeAspect="1"/>
                     </pic:cNvPicPr>
                   </pic:nvPicPr>
                   <pic:blipFill>
-                    <a:blip r:embed="rId45"/>
+                    <a:blip r:embed="rId34"/>
                     <a:stretch>
                       <a:fillRect/>
                     </a:stretch>
@@ -2457,18 +2579,18 @@
           <wp:inline>
             <wp:extent cx="5334000" cy="4315026"/>
             <wp:effectExtent b="0" l="0" r="0" t="0"/>
-            <wp:docPr descr="" title="" id="49" name="Picture"/>
+            <wp:docPr descr="" title="" id="38" name="Picture"/>
             <a:graphic>
               <a:graphicData uri="http://schemas.openxmlformats.org/drawingml/2006/picture">
                 <pic:pic>
                   <pic:nvPicPr>
-                    <pic:cNvPr descr="../../results/figures/pub/main/Fig4_multipanel.png" id="50" name="Picture"/>
+                    <pic:cNvPr descr="../../results/figures/pub/main/Fig4_multipanel.png" id="39" name="Picture"/>
                     <pic:cNvPicPr>
                       <a:picLocks noChangeArrowheads="1" noChangeAspect="1"/>
                     </pic:cNvPicPr>
                   </pic:nvPicPr>
                   <pic:blipFill>
-                    <a:blip r:embed="rId48"/>
+                    <a:blip r:embed="rId37"/>
                     <a:stretch>
                       <a:fillRect/>
                     </a:stretch>
@@ -2505,11 +2627,11 @@
     </w:p>
     <w:p>
       <w:pPr>
+        <w:pStyle w:val="Compact"/>
         <w:numPr>
           <w:ilvl w:val="0"/>
           <w:numId w:val="1002"/>
         </w:numPr>
-        <w:pStyle w:val="Compact"/>
       </w:pPr>
       <w:r>
         <w:t xml:space="preserve">Tumor PPI network (STRING) arranged with a stress layout that emphasizes intra-module</w:t>
@@ -2566,18 +2688,18 @@
           <wp:inline>
             <wp:extent cx="5334000" cy="2587953"/>
             <wp:effectExtent b="0" l="0" r="0" t="0"/>
-            <wp:docPr descr="" title="" id="52" name="Picture"/>
+            <wp:docPr descr="" title="" id="41" name="Picture"/>
             <a:graphic>
               <a:graphicData uri="http://schemas.openxmlformats.org/drawingml/2006/picture">
                 <pic:pic>
                   <pic:nvPicPr>
-                    <pic:cNvPr descr="../../results/figures/pub/main/Fig5_multipanel.png" id="53" name="Picture"/>
+                    <pic:cNvPr descr="../../results/figures/pub/main/Fig5_multipanel.png" id="42" name="Picture"/>
                     <pic:cNvPicPr>
                       <a:picLocks noChangeArrowheads="1" noChangeAspect="1"/>
                     </pic:cNvPicPr>
                   </pic:nvPicPr>
                   <pic:blipFill>
-                    <a:blip r:embed="rId51"/>
+                    <a:blip r:embed="rId40"/>
                     <a:stretch>
                       <a:fillRect/>
                     </a:stretch>
@@ -2614,11 +2736,11 @@
     </w:p>
     <w:p>
       <w:pPr>
+        <w:pStyle w:val="Compact"/>
         <w:numPr>
           <w:ilvl w:val="0"/>
           <w:numId w:val="1003"/>
         </w:numPr>
-        <w:pStyle w:val="Compact"/>
       </w:pPr>
       <w:r>
         <w:t xml:space="preserve">Prioritized shortlist faceted by tier, with each candidate’s composite score</w:t>
@@ -2699,18 +2821,18 @@
           <wp:inline>
             <wp:extent cx="5334000" cy="4393409"/>
             <wp:effectExtent b="0" l="0" r="0" t="0"/>
-            <wp:docPr descr="" title="" id="55" name="Picture"/>
+            <wp:docPr descr="" title="" id="44" name="Picture"/>
             <a:graphic>
               <a:graphicData uri="http://schemas.openxmlformats.org/drawingml/2006/picture">
                 <pic:pic>
                   <pic:nvPicPr>
-                    <pic:cNvPr descr="../../results/figures/pub/main/Fig6_multipanel.png" id="56" name="Picture"/>
+                    <pic:cNvPr descr="../../results/figures/pub/main/Fig6_multipanel.png" id="45" name="Picture"/>
                     <pic:cNvPicPr>
                       <a:picLocks noChangeArrowheads="1" noChangeAspect="1"/>
                     </pic:cNvPicPr>
                   </pic:nvPicPr>
                   <pic:blipFill>
-                    <a:blip r:embed="rId54"/>
+                    <a:blip r:embed="rId43"/>
                     <a:stretch>
                       <a:fillRect/>
                     </a:stretch>
@@ -2838,8 +2960,8 @@
         </w:pict>
       </w:r>
     </w:p>
-    <w:bookmarkEnd w:id="57"/>
-    <w:bookmarkStart w:id="58" w:name="tables"/>
+    <w:bookmarkEnd w:id="46"/>
+    <w:bookmarkStart w:id="47" w:name="tables"/>
     <w:p>
       <w:pPr>
         <w:pStyle w:val="Heading1"/>
@@ -2852,8 +2974,8 @@
       <w:tblPr>
         <w:tblStyle w:val="Table"/>
         <w:tblW w:type="pct" w:w="5000"/>
+        <w:tblLayout w:type="fixed"/>
         <w:tblLook w:firstRow="1" w:lastRow="0" w:firstColumn="0" w:lastColumn="0" w:noHBand="0" w:noVBand="0" w:val="0020"/>
-        <w:jc w:val="start"/>
       </w:tblPr>
       <w:tblGrid>
         <w:gridCol w:w="660"/>
@@ -2871,14 +2993,13 @@
       </w:tblGrid>
       <w:tr>
         <w:trPr>
-          <w:tblHeader w:val="true"/>
+          <w:tblHeader w:val="on"/>
         </w:trPr>
         <w:tc>
           <w:tcPr/>
           <w:p>
             <w:pPr>
               <w:pStyle w:val="Compact"/>
-              <w:jc w:val="left"/>
             </w:pPr>
             <w:r>
               <w:t xml:space="preserve">Drug</w:t>
@@ -2890,7 +3011,6 @@
           <w:p>
             <w:pPr>
               <w:pStyle w:val="Compact"/>
-              <w:jc w:val="left"/>
             </w:pPr>
             <w:r>
               <w:t xml:space="preserve">Block / tier</w:t>
@@ -2902,7 +3022,6 @@
           <w:p>
             <w:pPr>
               <w:pStyle w:val="Compact"/>
-              <w:jc w:val="left"/>
             </w:pPr>
             <w:r>
               <w:t xml:space="preserve">Module / subclass</w:t>
@@ -2914,7 +3033,6 @@
           <w:p>
             <w:pPr>
               <w:pStyle w:val="Compact"/>
-              <w:jc w:val="left"/>
             </w:pPr>
             <w:r>
               <w:t xml:space="preserve">Anchor target</w:t>
@@ -2926,7 +3044,6 @@
           <w:p>
             <w:pPr>
               <w:pStyle w:val="Compact"/>
-              <w:jc w:val="left"/>
             </w:pPr>
             <w:r>
               <w:t xml:space="preserve">Max clinical phase</w:t>
@@ -2938,7 +3055,6 @@
           <w:p>
             <w:pPr>
               <w:pStyle w:val="Compact"/>
-              <w:jc w:val="left"/>
             </w:pPr>
             <w:r>
               <w:t xml:space="preserve">HNSCC-approved</w:t>
@@ -2950,7 +3066,6 @@
           <w:p>
             <w:pPr>
               <w:pStyle w:val="Compact"/>
-              <w:jc w:val="left"/>
             </w:pPr>
             <w:r>
               <w:t xml:space="preserve">Composite</w:t>
@@ -2962,7 +3077,6 @@
           <w:p>
             <w:pPr>
               <w:pStyle w:val="Compact"/>
-              <w:jc w:val="left"/>
             </w:pPr>
             <w:r>
               <w:t xml:space="preserve">TP</w:t>
@@ -2974,7 +3088,6 @@
           <w:p>
             <w:pPr>
               <w:pStyle w:val="Compact"/>
-              <w:jc w:val="left"/>
             </w:pPr>
             <w:r>
               <w:t xml:space="preserve">DV</w:t>
@@ -2986,7 +3099,6 @@
           <w:p>
             <w:pPr>
               <w:pStyle w:val="Compact"/>
-              <w:jc w:val="left"/>
             </w:pPr>
             <w:r>
               <w:t xml:space="preserve">Sources (/4)</w:t>
@@ -2998,7 +3110,6 @@
           <w:p>
             <w:pPr>
               <w:pStyle w:val="Compact"/>
-              <w:jc w:val="left"/>
             </w:pPr>
             <w:r>
               <w:t xml:space="preserve">LOD-stable</w:t>
@@ -3010,7 +3121,6 @@
           <w:p>
             <w:pPr>
               <w:pStyle w:val="Compact"/>
-              <w:jc w:val="left"/>
             </w:pPr>
             <w:r>
               <w:t xml:space="preserve">Robustness (n/6)</w:t>
@@ -3024,7 +3134,6 @@
           <w:p>
             <w:pPr>
               <w:pStyle w:val="Compact"/>
-              <w:jc w:val="left"/>
             </w:pPr>
             <w:r>
               <w:t xml:space="preserve">Cetuximab</w:t>
@@ -3036,7 +3145,6 @@
           <w:p>
             <w:pPr>
               <w:pStyle w:val="Compact"/>
-              <w:jc w:val="left"/>
             </w:pPr>
             <w:r>
               <w:t xml:space="preserve">EGFR control</w:t>
@@ -3048,7 +3156,6 @@
           <w:p>
             <w:pPr>
               <w:pStyle w:val="Compact"/>
-              <w:jc w:val="left"/>
             </w:pPr>
             <w:r>
               <w:t xml:space="preserve">Anti-EGFR antibody/ADC</w:t>
@@ -3060,7 +3167,6 @@
           <w:p>
             <w:pPr>
               <w:pStyle w:val="Compact"/>
-              <w:jc w:val="left"/>
             </w:pPr>
             <w:r>
               <w:t xml:space="preserve">EGFR</w:t>
@@ -3072,7 +3178,6 @@
           <w:p>
             <w:pPr>
               <w:pStyle w:val="Compact"/>
-              <w:jc w:val="left"/>
             </w:pPr>
             <w:r>
               <w:t xml:space="preserve">Approved (Phase IV)</w:t>
@@ -3084,7 +3189,6 @@
           <w:p>
             <w:pPr>
               <w:pStyle w:val="Compact"/>
-              <w:jc w:val="left"/>
             </w:pPr>
             <w:r>
               <w:t xml:space="preserve">Yes</w:t>
@@ -3096,7 +3200,6 @@
           <w:p>
             <w:pPr>
               <w:pStyle w:val="Compact"/>
-              <w:jc w:val="left"/>
             </w:pPr>
             <w:r>
               <w:t xml:space="preserve">0.73</w:t>
@@ -3108,7 +3211,6 @@
           <w:p>
             <w:pPr>
               <w:pStyle w:val="Compact"/>
-              <w:jc w:val="left"/>
             </w:pPr>
             <w:r>
               <w:t xml:space="preserve">0.605</w:t>
@@ -3120,7 +3222,6 @@
           <w:p>
             <w:pPr>
               <w:pStyle w:val="Compact"/>
-              <w:jc w:val="left"/>
             </w:pPr>
             <w:r>
               <w:t xml:space="preserve">0.917</w:t>
@@ -3132,7 +3233,6 @@
           <w:p>
             <w:pPr>
               <w:pStyle w:val="Compact"/>
-              <w:jc w:val="left"/>
             </w:pPr>
             <w:r>
               <w:t xml:space="preserve">3</w:t>
@@ -3144,7 +3244,6 @@
           <w:p>
             <w:pPr>
               <w:pStyle w:val="Compact"/>
-              <w:jc w:val="left"/>
             </w:pPr>
             <w:r>
               <w:t xml:space="preserve">Yes</w:t>
@@ -3156,7 +3255,6 @@
           <w:p>
             <w:pPr>
               <w:pStyle w:val="Compact"/>
-              <w:jc w:val="left"/>
             </w:pPr>
             <w:r>
               <w:t xml:space="preserve">6/6</w:t>
@@ -3170,7 +3268,6 @@
           <w:p>
             <w:pPr>
               <w:pStyle w:val="Compact"/>
-              <w:jc w:val="left"/>
             </w:pPr>
             <w:r>
               <w:t xml:space="preserve">Nimotuzumab</w:t>
@@ -3182,7 +3279,6 @@
           <w:p>
             <w:pPr>
               <w:pStyle w:val="Compact"/>
-              <w:jc w:val="left"/>
             </w:pPr>
             <w:r>
               <w:t xml:space="preserve">EGFR control</w:t>
@@ -3194,7 +3290,6 @@
           <w:p>
             <w:pPr>
               <w:pStyle w:val="Compact"/>
-              <w:jc w:val="left"/>
             </w:pPr>
             <w:r>
               <w:t xml:space="preserve">Anti-EGFR antibody/ADC</w:t>
@@ -3206,7 +3301,6 @@
           <w:p>
             <w:pPr>
               <w:pStyle w:val="Compact"/>
-              <w:jc w:val="left"/>
             </w:pPr>
             <w:r>
               <w:t xml:space="preserve">EGFR</w:t>
@@ -3218,7 +3312,6 @@
           <w:p>
             <w:pPr>
               <w:pStyle w:val="Compact"/>
-              <w:jc w:val="left"/>
             </w:pPr>
             <w:r>
               <w:t xml:space="preserve">Approved (Phase IV)</w:t>
@@ -3230,7 +3323,6 @@
           <w:p>
             <w:pPr>
               <w:pStyle w:val="Compact"/>
-              <w:jc w:val="left"/>
             </w:pPr>
             <w:r>
               <w:t xml:space="preserve">No</w:t>
@@ -3242,7 +3334,6 @@
           <w:p>
             <w:pPr>
               <w:pStyle w:val="Compact"/>
-              <w:jc w:val="left"/>
             </w:pPr>
             <w:r>
               <w:t xml:space="preserve">0.73</w:t>
@@ -3254,7 +3345,6 @@
           <w:p>
             <w:pPr>
               <w:pStyle w:val="Compact"/>
-              <w:jc w:val="left"/>
             </w:pPr>
             <w:r>
               <w:t xml:space="preserve">0.605</w:t>
@@ -3266,7 +3356,6 @@
           <w:p>
             <w:pPr>
               <w:pStyle w:val="Compact"/>
-              <w:jc w:val="left"/>
             </w:pPr>
             <w:r>
               <w:t xml:space="preserve">0.917</w:t>
@@ -3278,7 +3367,6 @@
           <w:p>
             <w:pPr>
               <w:pStyle w:val="Compact"/>
-              <w:jc w:val="left"/>
             </w:pPr>
             <w:r>
               <w:t xml:space="preserve">3</w:t>
@@ -3290,7 +3378,6 @@
           <w:p>
             <w:pPr>
               <w:pStyle w:val="Compact"/>
-              <w:jc w:val="left"/>
             </w:pPr>
             <w:r>
               <w:t xml:space="preserve">Yes</w:t>
@@ -3302,7 +3389,6 @@
           <w:p>
             <w:pPr>
               <w:pStyle w:val="Compact"/>
-              <w:jc w:val="left"/>
             </w:pPr>
             <w:r>
               <w:t xml:space="preserve">6/6</w:t>
@@ -3316,7 +3402,6 @@
           <w:p>
             <w:pPr>
               <w:pStyle w:val="Compact"/>
-              <w:jc w:val="left"/>
             </w:pPr>
             <w:r>
               <w:t xml:space="preserve">Panitumumab</w:t>
@@ -3328,7 +3413,6 @@
           <w:p>
             <w:pPr>
               <w:pStyle w:val="Compact"/>
-              <w:jc w:val="left"/>
             </w:pPr>
             <w:r>
               <w:t xml:space="preserve">EGFR control</w:t>
@@ -3340,7 +3424,6 @@
           <w:p>
             <w:pPr>
               <w:pStyle w:val="Compact"/>
-              <w:jc w:val="left"/>
             </w:pPr>
             <w:r>
               <w:t xml:space="preserve">Anti-EGFR antibody/ADC</w:t>
@@ -3352,7 +3435,6 @@
           <w:p>
             <w:pPr>
               <w:pStyle w:val="Compact"/>
-              <w:jc w:val="left"/>
             </w:pPr>
             <w:r>
               <w:t xml:space="preserve">EGFR</w:t>
@@ -3364,7 +3446,6 @@
           <w:p>
             <w:pPr>
               <w:pStyle w:val="Compact"/>
-              <w:jc w:val="left"/>
             </w:pPr>
             <w:r>
               <w:t xml:space="preserve">Approved (Phase IV)</w:t>
@@ -3376,7 +3457,6 @@
           <w:p>
             <w:pPr>
               <w:pStyle w:val="Compact"/>
-              <w:jc w:val="left"/>
             </w:pPr>
             <w:r>
               <w:t xml:space="preserve">No</w:t>
@@ -3388,7 +3468,6 @@
           <w:p>
             <w:pPr>
               <w:pStyle w:val="Compact"/>
-              <w:jc w:val="left"/>
             </w:pPr>
             <w:r>
               <w:t xml:space="preserve">0.73</w:t>
@@ -3400,7 +3479,6 @@
           <w:p>
             <w:pPr>
               <w:pStyle w:val="Compact"/>
-              <w:jc w:val="left"/>
             </w:pPr>
             <w:r>
               <w:t xml:space="preserve">0.605</w:t>
@@ -3412,7 +3490,6 @@
           <w:p>
             <w:pPr>
               <w:pStyle w:val="Compact"/>
-              <w:jc w:val="left"/>
             </w:pPr>
             <w:r>
               <w:t xml:space="preserve">0.917</w:t>
@@ -3424,7 +3501,6 @@
           <w:p>
             <w:pPr>
               <w:pStyle w:val="Compact"/>
-              <w:jc w:val="left"/>
             </w:pPr>
             <w:r>
               <w:t xml:space="preserve">3</w:t>
@@ -3436,7 +3512,6 @@
           <w:p>
             <w:pPr>
               <w:pStyle w:val="Compact"/>
-              <w:jc w:val="left"/>
             </w:pPr>
             <w:r>
               <w:t xml:space="preserve">Yes</w:t>
@@ -3448,7 +3523,6 @@
           <w:p>
             <w:pPr>
               <w:pStyle w:val="Compact"/>
-              <w:jc w:val="left"/>
             </w:pPr>
             <w:r>
               <w:t xml:space="preserve">6/6</w:t>
@@ -3462,7 +3536,6 @@
           <w:p>
             <w:pPr>
               <w:pStyle w:val="Compact"/>
-              <w:jc w:val="left"/>
             </w:pPr>
             <w:r>
               <w:t xml:space="preserve">Gefitinib</w:t>
@@ -3474,7 +3547,6 @@
           <w:p>
             <w:pPr>
               <w:pStyle w:val="Compact"/>
-              <w:jc w:val="left"/>
             </w:pPr>
             <w:r>
               <w:t xml:space="preserve">EGFR control</w:t>
@@ -3486,7 +3558,6 @@
           <w:p>
             <w:pPr>
               <w:pStyle w:val="Compact"/>
-              <w:jc w:val="left"/>
             </w:pPr>
             <w:r>
               <w:t xml:space="preserve">EGFR TKI (1st-2nd gen)</w:t>
@@ -3498,7 +3569,6 @@
           <w:p>
             <w:pPr>
               <w:pStyle w:val="Compact"/>
-              <w:jc w:val="left"/>
             </w:pPr>
             <w:r>
               <w:t xml:space="preserve">EGFR</w:t>
@@ -3510,7 +3580,6 @@
           <w:p>
             <w:pPr>
               <w:pStyle w:val="Compact"/>
-              <w:jc w:val="left"/>
             </w:pPr>
             <w:r>
               <w:t xml:space="preserve">Approved (Phase IV)</w:t>
@@ -3522,7 +3591,6 @@
           <w:p>
             <w:pPr>
               <w:pStyle w:val="Compact"/>
-              <w:jc w:val="left"/>
             </w:pPr>
             <w:r>
               <w:t xml:space="preserve">No</w:t>
@@ -3534,7 +3602,6 @@
           <w:p>
             <w:pPr>
               <w:pStyle w:val="Compact"/>
-              <w:jc w:val="left"/>
             </w:pPr>
             <w:r>
               <w:t xml:space="preserve">0.717</w:t>
@@ -3546,7 +3613,6 @@
           <w:p>
             <w:pPr>
               <w:pStyle w:val="Compact"/>
-              <w:jc w:val="left"/>
             </w:pPr>
             <w:r>
               <w:t xml:space="preserve">0.605</w:t>
@@ -3558,7 +3624,6 @@
           <w:p>
             <w:pPr>
               <w:pStyle w:val="Compact"/>
-              <w:jc w:val="left"/>
             </w:pPr>
             <w:r>
               <w:t xml:space="preserve">0.884</w:t>
@@ -3570,7 +3635,6 @@
           <w:p>
             <w:pPr>
               <w:pStyle w:val="Compact"/>
-              <w:jc w:val="left"/>
             </w:pPr>
             <w:r>
               <w:t xml:space="preserve">4</w:t>
@@ -3582,7 +3646,6 @@
           <w:p>
             <w:pPr>
               <w:pStyle w:val="Compact"/>
-              <w:jc w:val="left"/>
             </w:pPr>
             <w:r>
               <w:t xml:space="preserve">Yes</w:t>
@@ -3594,7 +3657,6 @@
           <w:p>
             <w:pPr>
               <w:pStyle w:val="Compact"/>
-              <w:jc w:val="left"/>
             </w:pPr>
             <w:r>
               <w:t xml:space="preserve">6/6</w:t>
@@ -3608,7 +3670,6 @@
           <w:p>
             <w:pPr>
               <w:pStyle w:val="Compact"/>
-              <w:jc w:val="left"/>
             </w:pPr>
             <w:r>
               <w:t xml:space="preserve">Lapatinib</w:t>
@@ -3620,7 +3681,6 @@
           <w:p>
             <w:pPr>
               <w:pStyle w:val="Compact"/>
-              <w:jc w:val="left"/>
             </w:pPr>
             <w:r>
               <w:t xml:space="preserve">EGFR control</w:t>
@@ -3632,7 +3692,6 @@
           <w:p>
             <w:pPr>
               <w:pStyle w:val="Compact"/>
-              <w:jc w:val="left"/>
             </w:pPr>
             <w:r>
               <w:t xml:space="preserve">EGFR TKI (1st-2nd gen)</w:t>
@@ -3644,7 +3703,6 @@
           <w:p>
             <w:pPr>
               <w:pStyle w:val="Compact"/>
-              <w:jc w:val="left"/>
             </w:pPr>
             <w:r>
               <w:t xml:space="preserve">EGFR</w:t>
@@ -3656,7 +3714,6 @@
           <w:p>
             <w:pPr>
               <w:pStyle w:val="Compact"/>
-              <w:jc w:val="left"/>
             </w:pPr>
             <w:r>
               <w:t xml:space="preserve">Approved (Phase IV)</w:t>
@@ -3668,7 +3725,6 @@
           <w:p>
             <w:pPr>
               <w:pStyle w:val="Compact"/>
-              <w:jc w:val="left"/>
             </w:pPr>
             <w:r>
               <w:t xml:space="preserve">No</w:t>
@@ -3680,7 +3736,6 @@
           <w:p>
             <w:pPr>
               <w:pStyle w:val="Compact"/>
-              <w:jc w:val="left"/>
             </w:pPr>
             <w:r>
               <w:t xml:space="preserve">0.698</w:t>
@@ -3692,7 +3747,6 @@
           <w:p>
             <w:pPr>
               <w:pStyle w:val="Compact"/>
-              <w:jc w:val="left"/>
             </w:pPr>
             <w:r>
               <w:t xml:space="preserve">0.605</w:t>
@@ -3704,7 +3758,6 @@
           <w:p>
             <w:pPr>
               <w:pStyle w:val="Compact"/>
-              <w:jc w:val="left"/>
             </w:pPr>
             <w:r>
               <w:t xml:space="preserve">0.836</w:t>
@@ -3716,7 +3769,6 @@
           <w:p>
             <w:pPr>
               <w:pStyle w:val="Compact"/>
-              <w:jc w:val="left"/>
             </w:pPr>
             <w:r>
               <w:t xml:space="preserve">4</w:t>
@@ -3728,7 +3780,6 @@
           <w:p>
             <w:pPr>
               <w:pStyle w:val="Compact"/>
-              <w:jc w:val="left"/>
             </w:pPr>
             <w:r>
               <w:t xml:space="preserve">Yes</w:t>
@@ -3740,7 +3791,6 @@
           <w:p>
             <w:pPr>
               <w:pStyle w:val="Compact"/>
-              <w:jc w:val="left"/>
             </w:pPr>
             <w:r>
               <w:t xml:space="preserve">6/6</w:t>
@@ -3754,7 +3804,6 @@
           <w:p>
             <w:pPr>
               <w:pStyle w:val="Compact"/>
-              <w:jc w:val="left"/>
             </w:pPr>
             <w:r>
               <w:t xml:space="preserve">Afatinib</w:t>
@@ -3766,7 +3815,6 @@
           <w:p>
             <w:pPr>
               <w:pStyle w:val="Compact"/>
-              <w:jc w:val="left"/>
             </w:pPr>
             <w:r>
               <w:t xml:space="preserve">EGFR control</w:t>
@@ -3778,7 +3826,6 @@
           <w:p>
             <w:pPr>
               <w:pStyle w:val="Compact"/>
-              <w:jc w:val="left"/>
             </w:pPr>
             <w:r>
               <w:t xml:space="preserve">EGFR TKI (1st-2nd gen)</w:t>
@@ -3790,7 +3837,6 @@
           <w:p>
             <w:pPr>
               <w:pStyle w:val="Compact"/>
-              <w:jc w:val="left"/>
             </w:pPr>
             <w:r>
               <w:t xml:space="preserve">EGFR</w:t>
@@ -3802,7 +3848,6 @@
           <w:p>
             <w:pPr>
               <w:pStyle w:val="Compact"/>
-              <w:jc w:val="left"/>
             </w:pPr>
             <w:r>
               <w:t xml:space="preserve">Approved (Phase IV)</w:t>
@@ -3814,7 +3859,6 @@
           <w:p>
             <w:pPr>
               <w:pStyle w:val="Compact"/>
-              <w:jc w:val="left"/>
             </w:pPr>
             <w:r>
               <w:t xml:space="preserve">Yes</w:t>
@@ -3826,7 +3870,6 @@
           <w:p>
             <w:pPr>
               <w:pStyle w:val="Compact"/>
-              <w:jc w:val="left"/>
             </w:pPr>
             <w:r>
               <w:t xml:space="preserve">0.695</w:t>
@@ -3838,7 +3881,6 @@
           <w:p>
             <w:pPr>
               <w:pStyle w:val="Compact"/>
-              <w:jc w:val="left"/>
             </w:pPr>
             <w:r>
               <w:t xml:space="preserve">0.605</w:t>
@@ -3850,7 +3892,6 @@
           <w:p>
             <w:pPr>
               <w:pStyle w:val="Compact"/>
-              <w:jc w:val="left"/>
             </w:pPr>
             <w:r>
               <w:t xml:space="preserve">0.829</w:t>
@@ -3862,7 +3903,6 @@
           <w:p>
             <w:pPr>
               <w:pStyle w:val="Compact"/>
-              <w:jc w:val="left"/>
             </w:pPr>
             <w:r>
               <w:t xml:space="preserve">4</w:t>
@@ -3874,7 +3914,6 @@
           <w:p>
             <w:pPr>
               <w:pStyle w:val="Compact"/>
-              <w:jc w:val="left"/>
             </w:pPr>
             <w:r>
               <w:t xml:space="preserve">Yes</w:t>
@@ -3886,7 +3925,6 @@
           <w:p>
             <w:pPr>
               <w:pStyle w:val="Compact"/>
-              <w:jc w:val="left"/>
             </w:pPr>
             <w:r>
               <w:t xml:space="preserve">6/6</w:t>
@@ -3900,7 +3938,6 @@
           <w:p>
             <w:pPr>
               <w:pStyle w:val="Compact"/>
-              <w:jc w:val="left"/>
             </w:pPr>
             <w:r>
               <w:t xml:space="preserve">Erlotinib</w:t>
@@ -3912,7 +3949,6 @@
           <w:p>
             <w:pPr>
               <w:pStyle w:val="Compact"/>
-              <w:jc w:val="left"/>
             </w:pPr>
             <w:r>
               <w:t xml:space="preserve">EGFR control</w:t>
@@ -3924,7 +3960,6 @@
           <w:p>
             <w:pPr>
               <w:pStyle w:val="Compact"/>
-              <w:jc w:val="left"/>
             </w:pPr>
             <w:r>
               <w:t xml:space="preserve">EGFR TKI (1st-2nd gen)</w:t>
@@ -3936,7 +3971,6 @@
           <w:p>
             <w:pPr>
               <w:pStyle w:val="Compact"/>
-              <w:jc w:val="left"/>
             </w:pPr>
             <w:r>
               <w:t xml:space="preserve">EGFR</w:t>
@@ -3948,7 +3982,6 @@
           <w:p>
             <w:pPr>
               <w:pStyle w:val="Compact"/>
-              <w:jc w:val="left"/>
             </w:pPr>
             <w:r>
               <w:t xml:space="preserve">Approved (Phase IV)</w:t>
@@ -3960,7 +3993,6 @@
           <w:p>
             <w:pPr>
               <w:pStyle w:val="Compact"/>
-              <w:jc w:val="left"/>
             </w:pPr>
             <w:r>
               <w:t xml:space="preserve">No</w:t>
@@ -3972,7 +4004,6 @@
           <w:p>
             <w:pPr>
               <w:pStyle w:val="Compact"/>
-              <w:jc w:val="left"/>
             </w:pPr>
             <w:r>
               <w:t xml:space="preserve">0.689</w:t>
@@ -3984,7 +4015,6 @@
           <w:p>
             <w:pPr>
               <w:pStyle w:val="Compact"/>
-              <w:jc w:val="left"/>
             </w:pPr>
             <w:r>
               <w:t xml:space="preserve">0.605</w:t>
@@ -3996,7 +4026,6 @@
           <w:p>
             <w:pPr>
               <w:pStyle w:val="Compact"/>
-              <w:jc w:val="left"/>
             </w:pPr>
             <w:r>
               <w:t xml:space="preserve">0.813</w:t>
@@ -4008,7 +4037,6 @@
           <w:p>
             <w:pPr>
               <w:pStyle w:val="Compact"/>
-              <w:jc w:val="left"/>
             </w:pPr>
             <w:r>
               <w:t xml:space="preserve">3</w:t>
@@ -4020,7 +4048,6 @@
           <w:p>
             <w:pPr>
               <w:pStyle w:val="Compact"/>
-              <w:jc w:val="left"/>
             </w:pPr>
             <w:r>
               <w:t xml:space="preserve">Yes</w:t>
@@ -4032,7 +4059,6 @@
           <w:p>
             <w:pPr>
               <w:pStyle w:val="Compact"/>
-              <w:jc w:val="left"/>
             </w:pPr>
             <w:r>
               <w:t xml:space="preserve">6/6</w:t>
@@ -4046,12 +4072,11 @@
           <w:p>
             <w:pPr>
               <w:pStyle w:val="Compact"/>
-              <w:jc w:val="left"/>
             </w:pPr>
             <w:r>
               <w:rPr>
+                <w:i/>
                 <w:iCs/>
-                <w:i/>
               </w:rPr>
               <w:t xml:space="preserve">plus 60 additional anti-EGFR agents</w:t>
             </w:r>
@@ -4062,7 +4087,6 @@
           <w:p>
             <w:pPr>
               <w:pStyle w:val="Compact"/>
-              <w:jc w:val="left"/>
             </w:pPr>
             <w:r>
               <w:t xml:space="preserve">EGFR control</w:t>
@@ -4074,7 +4098,6 @@
           <w:p>
             <w:pPr>
               <w:pStyle w:val="Compact"/>
-              <w:jc w:val="left"/>
             </w:pPr>
             <w:r>
               <w:t xml:space="preserve">anti-EGFR (mixed)</w:t>
@@ -4086,7 +4109,6 @@
           <w:p>
             <w:pPr>
               <w:pStyle w:val="Compact"/>
-              <w:jc w:val="left"/>
             </w:pPr>
             <w:r>
               <w:t xml:space="preserve">EGFR</w:t>
@@ -4098,7 +4120,6 @@
           <w:p>
             <w:pPr>
               <w:pStyle w:val="Compact"/>
-              <w:jc w:val="left"/>
             </w:pPr>
             <w:r>
               <w:t xml:space="preserve">Approved-to-Phase I</w:t>
@@ -4110,7 +4131,6 @@
           <w:p>
             <w:pPr>
               <w:pStyle w:val="Compact"/>
-              <w:jc w:val="left"/>
             </w:pPr>
             <w:r>
               <w:t xml:space="preserve">mixed</w:t>
@@ -4122,7 +4142,6 @@
           <w:p>
             <w:pPr>
               <w:pStyle w:val="Compact"/>
-              <w:jc w:val="left"/>
             </w:pPr>
             <w:r>
               <w:t xml:space="preserve">0.50-0.66</w:t>
@@ -4134,7 +4153,6 @@
           <w:p>
             <w:pPr>
               <w:pStyle w:val="Compact"/>
-              <w:jc w:val="left"/>
             </w:pPr>
             <w:r>
               <w:t xml:space="preserve">0.605</w:t>
@@ -4146,7 +4164,6 @@
           <w:p>
             <w:pPr>
               <w:pStyle w:val="Compact"/>
-              <w:jc w:val="left"/>
             </w:pPr>
             <w:r>
               <w:t xml:space="preserve">varies</w:t>
@@ -4158,7 +4175,6 @@
           <w:p>
             <w:pPr>
               <w:pStyle w:val="Compact"/>
-              <w:jc w:val="left"/>
             </w:pPr>
             <w:r>
               <w:t xml:space="preserve">2-3</w:t>
@@ -4170,7 +4186,6 @@
           <w:p>
             <w:pPr>
               <w:pStyle w:val="Compact"/>
-              <w:jc w:val="left"/>
             </w:pPr>
             <w:r>
               <w:t xml:space="preserve">mixed</w:t>
@@ -4182,7 +4197,6 @@
           <w:p>
             <w:pPr>
               <w:pStyle w:val="Compact"/>
-              <w:jc w:val="left"/>
             </w:pPr>
             <w:r>
               <w:t xml:space="preserve">mixed</w:t>
@@ -4196,7 +4210,6 @@
           <w:p>
             <w:pPr>
               <w:pStyle w:val="Compact"/>
-              <w:jc w:val="left"/>
             </w:pPr>
             <w:r>
               <w:t xml:space="preserve">Metformin</w:t>
@@ -4208,7 +4221,6 @@
           <w:p>
             <w:pPr>
               <w:pStyle w:val="Compact"/>
-              <w:jc w:val="left"/>
             </w:pPr>
             <w:r>
               <w:t xml:space="preserve">Hub-central</w:t>
@@ -4220,7 +4232,6 @@
           <w:p>
             <w:pPr>
               <w:pStyle w:val="Compact"/>
-              <w:jc w:val="left"/>
             </w:pPr>
             <w:r>
               <w:t xml:space="preserve">OXPHOS</w:t>
@@ -4232,7 +4243,6 @@
           <w:p>
             <w:pPr>
               <w:pStyle w:val="Compact"/>
-              <w:jc w:val="left"/>
             </w:pPr>
             <w:r>
               <w:t xml:space="preserve">NDUFS2</w:t>
@@ -4244,7 +4254,6 @@
           <w:p>
             <w:pPr>
               <w:pStyle w:val="Compact"/>
-              <w:jc w:val="left"/>
             </w:pPr>
             <w:r>
               <w:t xml:space="preserve">Approved (Phase IV)</w:t>
@@ -4256,7 +4265,6 @@
           <w:p>
             <w:pPr>
               <w:pStyle w:val="Compact"/>
-              <w:jc w:val="left"/>
             </w:pPr>
             <w:r>
               <w:t xml:space="preserve">No</w:t>
@@ -4268,7 +4276,6 @@
           <w:p>
             <w:pPr>
               <w:pStyle w:val="Compact"/>
-              <w:jc w:val="left"/>
             </w:pPr>
             <w:r>
               <w:t xml:space="preserve">0.591</w:t>
@@ -4280,7 +4287,6 @@
           <w:p>
             <w:pPr>
               <w:pStyle w:val="Compact"/>
-              <w:jc w:val="left"/>
             </w:pPr>
             <w:r>
               <w:t xml:space="preserve">0.502</w:t>
@@ -4292,7 +4298,6 @@
           <w:p>
             <w:pPr>
               <w:pStyle w:val="Compact"/>
-              <w:jc w:val="left"/>
             </w:pPr>
             <w:r>
               <w:t xml:space="preserve">0.725</w:t>
@@ -4304,7 +4309,6 @@
           <w:p>
             <w:pPr>
               <w:pStyle w:val="Compact"/>
-              <w:jc w:val="left"/>
             </w:pPr>
             <w:r>
               <w:t xml:space="preserve">3</w:t>
@@ -4316,7 +4320,6 @@
           <w:p>
             <w:pPr>
               <w:pStyle w:val="Compact"/>
-              <w:jc w:val="left"/>
             </w:pPr>
             <w:r>
               <w:t xml:space="preserve">Yes</w:t>
@@ -4328,7 +4331,6 @@
           <w:p>
             <w:pPr>
               <w:pStyle w:val="Compact"/>
-              <w:jc w:val="left"/>
             </w:pPr>
             <w:r>
               <w:t xml:space="preserve">6/6</w:t>
@@ -4342,7 +4344,6 @@
           <w:p>
             <w:pPr>
               <w:pStyle w:val="Compact"/>
-              <w:jc w:val="left"/>
             </w:pPr>
             <w:r>
               <w:t xml:space="preserve">Bortezomib D-Mannitol</w:t>
@@ -4354,7 +4355,6 @@
           <w:p>
             <w:pPr>
               <w:pStyle w:val="Compact"/>
-              <w:jc w:val="left"/>
             </w:pPr>
             <w:r>
               <w:t xml:space="preserve">Hub-central</w:t>
@@ -4366,7 +4366,6 @@
           <w:p>
             <w:pPr>
               <w:pStyle w:val="Compact"/>
-              <w:jc w:val="left"/>
             </w:pPr>
             <w:r>
               <w:t xml:space="preserve">Proteasome</w:t>
@@ -4378,7 +4377,6 @@
           <w:p>
             <w:pPr>
               <w:pStyle w:val="Compact"/>
-              <w:jc w:val="left"/>
             </w:pPr>
             <w:r>
               <w:t xml:space="preserve">PSMA2</w:t>
@@ -4390,7 +4388,6 @@
           <w:p>
             <w:pPr>
               <w:pStyle w:val="Compact"/>
-              <w:jc w:val="left"/>
             </w:pPr>
             <w:r>
               <w:t xml:space="preserve">Approved (Phase IV)</w:t>
@@ -4402,7 +4399,6 @@
           <w:p>
             <w:pPr>
               <w:pStyle w:val="Compact"/>
-              <w:jc w:val="left"/>
             </w:pPr>
             <w:r>
               <w:t xml:space="preserve">No</w:t>
@@ -4414,7 +4410,6 @@
           <w:p>
             <w:pPr>
               <w:pStyle w:val="Compact"/>
-              <w:jc w:val="left"/>
             </w:pPr>
             <w:r>
               <w:t xml:space="preserve">0.5</w:t>
@@ -4426,7 +4421,6 @@
           <w:p>
             <w:pPr>
               <w:pStyle w:val="Compact"/>
-              <w:jc w:val="left"/>
             </w:pPr>
             <w:r>
               <w:t xml:space="preserve">0.389</w:t>
@@ -4438,7 +4432,6 @@
           <w:p>
             <w:pPr>
               <w:pStyle w:val="Compact"/>
-              <w:jc w:val="left"/>
             </w:pPr>
             <w:r>
               <w:t xml:space="preserve">0.667</w:t>
@@ -4450,7 +4443,6 @@
           <w:p>
             <w:pPr>
               <w:pStyle w:val="Compact"/>
-              <w:jc w:val="left"/>
             </w:pPr>
             <w:r>
               <w:t xml:space="preserve">2</w:t>
@@ -4462,7 +4454,6 @@
           <w:p>
             <w:pPr>
               <w:pStyle w:val="Compact"/>
-              <w:jc w:val="left"/>
             </w:pPr>
             <w:r>
               <w:t xml:space="preserve">No</w:t>
@@ -4474,7 +4465,6 @@
           <w:p>
             <w:pPr>
               <w:pStyle w:val="Compact"/>
-              <w:jc w:val="left"/>
             </w:pPr>
             <w:r>
               <w:t xml:space="preserve">0/6</w:t>
@@ -4488,7 +4478,6 @@
           <w:p>
             <w:pPr>
               <w:pStyle w:val="Compact"/>
-              <w:jc w:val="left"/>
             </w:pPr>
             <w:r>
               <w:t xml:space="preserve">Andecaliximab</w:t>
@@ -4500,7 +4489,6 @@
           <w:p>
             <w:pPr>
               <w:pStyle w:val="Compact"/>
-              <w:jc w:val="left"/>
             </w:pPr>
             <w:r>
               <w:t xml:space="preserve">Hub-central</w:t>
@@ -4512,7 +4500,6 @@
           <w:p>
             <w:pPr>
               <w:pStyle w:val="Compact"/>
-              <w:jc w:val="left"/>
             </w:pPr>
             <w:r>
               <w:t xml:space="preserve">Immune response</w:t>
@@ -4524,7 +4511,6 @@
           <w:p>
             <w:pPr>
               <w:pStyle w:val="Compact"/>
-              <w:jc w:val="left"/>
             </w:pPr>
             <w:r>
               <w:t xml:space="preserve">MMP9</w:t>
@@ -4536,7 +4522,6 @@
           <w:p>
             <w:pPr>
               <w:pStyle w:val="Compact"/>
-              <w:jc w:val="left"/>
             </w:pPr>
             <w:r>
               <w:t xml:space="preserve">Phase III</w:t>
@@ -4548,7 +4533,6 @@
           <w:p>
             <w:pPr>
               <w:pStyle w:val="Compact"/>
-              <w:jc w:val="left"/>
             </w:pPr>
             <w:r>
               <w:t xml:space="preserve">No</w:t>
@@ -4560,7 +4544,6 @@
           <w:p>
             <w:pPr>
               <w:pStyle w:val="Compact"/>
-              <w:jc w:val="left"/>
             </w:pPr>
             <w:r>
               <w:t xml:space="preserve">0.425</w:t>
@@ -4572,7 +4555,6 @@
           <w:p>
             <w:pPr>
               <w:pStyle w:val="Compact"/>
-              <w:jc w:val="left"/>
             </w:pPr>
             <w:r>
               <w:t xml:space="preserve">0.431</w:t>
@@ -4584,7 +4566,6 @@
           <w:p>
             <w:pPr>
               <w:pStyle w:val="Compact"/>
-              <w:jc w:val="left"/>
             </w:pPr>
             <w:r>
               <w:t xml:space="preserve">0.417</w:t>
@@ -4596,7 +4577,6 @@
           <w:p>
             <w:pPr>
               <w:pStyle w:val="Compact"/>
-              <w:jc w:val="left"/>
             </w:pPr>
             <w:r>
               <w:t xml:space="preserve">3</w:t>
@@ -4608,7 +4588,6 @@
           <w:p>
             <w:pPr>
               <w:pStyle w:val="Compact"/>
-              <w:jc w:val="left"/>
             </w:pPr>
             <w:r>
               <w:t xml:space="preserve">No</w:t>
@@ -4620,7 +4599,6 @@
           <w:p>
             <w:pPr>
               <w:pStyle w:val="Compact"/>
-              <w:jc w:val="left"/>
             </w:pPr>
             <w:r>
               <w:t xml:space="preserve">0/6</w:t>
@@ -4634,7 +4612,6 @@
           <w:p>
             <w:pPr>
               <w:pStyle w:val="Compact"/>
-              <w:jc w:val="left"/>
             </w:pPr>
             <w:r>
               <w:t xml:space="preserve">Mt-3724</w:t>
@@ -4646,7 +4623,6 @@
           <w:p>
             <w:pPr>
               <w:pStyle w:val="Compact"/>
-              <w:jc w:val="left"/>
             </w:pPr>
             <w:r>
               <w:t xml:space="preserve">Hub-central</w:t>
@@ -4658,7 +4634,6 @@
           <w:p>
             <w:pPr>
               <w:pStyle w:val="Compact"/>
-              <w:jc w:val="left"/>
             </w:pPr>
             <w:r>
               <w:t xml:space="preserve">Translation</w:t>
@@ -4670,7 +4645,6 @@
           <w:p>
             <w:pPr>
               <w:pStyle w:val="Compact"/>
-              <w:jc w:val="left"/>
             </w:pPr>
             <w:r>
               <w:t xml:space="preserve">RPS11</w:t>
@@ -4682,7 +4656,6 @@
           <w:p>
             <w:pPr>
               <w:pStyle w:val="Compact"/>
-              <w:jc w:val="left"/>
             </w:pPr>
             <w:r>
               <w:t xml:space="preserve">Phase II</w:t>
@@ -4694,7 +4667,6 @@
           <w:p>
             <w:pPr>
               <w:pStyle w:val="Compact"/>
-              <w:jc w:val="left"/>
             </w:pPr>
             <w:r>
               <w:t xml:space="preserve">No</w:t>
@@ -4706,7 +4678,6 @@
           <w:p>
             <w:pPr>
               <w:pStyle w:val="Compact"/>
-              <w:jc w:val="left"/>
             </w:pPr>
             <w:r>
               <w:t xml:space="preserve">0.421</w:t>
@@ -4718,7 +4689,6 @@
           <w:p>
             <w:pPr>
               <w:pStyle w:val="Compact"/>
-              <w:jc w:val="left"/>
             </w:pPr>
             <w:r>
               <w:t xml:space="preserve">0.48</w:t>
@@ -4730,7 +4700,6 @@
           <w:p>
             <w:pPr>
               <w:pStyle w:val="Compact"/>
-              <w:jc w:val="left"/>
             </w:pPr>
             <w:r>
               <w:t xml:space="preserve">0.333</w:t>
@@ -4742,7 +4711,6 @@
           <w:p>
             <w:pPr>
               <w:pStyle w:val="Compact"/>
-              <w:jc w:val="left"/>
             </w:pPr>
             <w:r>
               <w:t xml:space="preserve">2</w:t>
@@ -4754,7 +4722,6 @@
           <w:p>
             <w:pPr>
               <w:pStyle w:val="Compact"/>
-              <w:jc w:val="left"/>
             </w:pPr>
             <w:r>
               <w:t xml:space="preserve">No</w:t>
@@ -4766,7 +4733,6 @@
           <w:p>
             <w:pPr>
               <w:pStyle w:val="Compact"/>
-              <w:jc w:val="left"/>
             </w:pPr>
             <w:r>
               <w:t xml:space="preserve">0/6</w:t>
@@ -4780,7 +4746,6 @@
           <w:p>
             <w:pPr>
               <w:pStyle w:val="Compact"/>
-              <w:jc w:val="left"/>
             </w:pPr>
             <w:r>
               <w:t xml:space="preserve">Cedazuridine</w:t>
@@ -4792,7 +4757,6 @@
           <w:p>
             <w:pPr>
               <w:pStyle w:val="Compact"/>
-              <w:jc w:val="left"/>
             </w:pPr>
             <w:r>
               <w:t xml:space="preserve">Peripheral-differential</w:t>
@@ -4804,7 +4768,6 @@
           <w:p>
             <w:pPr>
               <w:pStyle w:val="Compact"/>
-              <w:jc w:val="left"/>
             </w:pPr>
             <w:r>
               <w:t xml:space="preserve">Amino acid metabolism</w:t>
@@ -4816,7 +4779,6 @@
           <w:p>
             <w:pPr>
               <w:pStyle w:val="Compact"/>
-              <w:jc w:val="left"/>
             </w:pPr>
             <w:r>
               <w:t xml:space="preserve">CDA</w:t>
@@ -4828,7 +4790,6 @@
           <w:p>
             <w:pPr>
               <w:pStyle w:val="Compact"/>
-              <w:jc w:val="left"/>
             </w:pPr>
             <w:r>
               <w:t xml:space="preserve">Approved (Phase IV)</w:t>
@@ -4840,7 +4801,6 @@
           <w:p>
             <w:pPr>
               <w:pStyle w:val="Compact"/>
-              <w:jc w:val="left"/>
             </w:pPr>
             <w:r>
               <w:t xml:space="preserve">No</w:t>
@@ -4852,7 +4812,6 @@
           <w:p>
             <w:pPr>
               <w:pStyle w:val="Compact"/>
-              <w:jc w:val="left"/>
             </w:pPr>
             <w:r>
               <w:t xml:space="preserve">0.5</w:t>
@@ -4864,7 +4823,6 @@
           <w:p>
             <w:pPr>
               <w:pStyle w:val="Compact"/>
-              <w:jc w:val="left"/>
             </w:pPr>
             <w:r>
               <w:t xml:space="preserve">0.333</w:t>
@@ -4876,7 +4834,6 @@
           <w:p>
             <w:pPr>
               <w:pStyle w:val="Compact"/>
-              <w:jc w:val="left"/>
             </w:pPr>
             <w:r>
               <w:t xml:space="preserve">0.75</w:t>
@@ -4888,7 +4845,6 @@
           <w:p>
             <w:pPr>
               <w:pStyle w:val="Compact"/>
-              <w:jc w:val="left"/>
             </w:pPr>
             <w:r>
               <w:t xml:space="preserve">3</w:t>
@@ -4900,7 +4856,6 @@
           <w:p>
             <w:pPr>
               <w:pStyle w:val="Compact"/>
-              <w:jc w:val="left"/>
             </w:pPr>
             <w:r>
               <w:t xml:space="preserve">No</w:t>
@@ -4912,7 +4867,6 @@
           <w:p>
             <w:pPr>
               <w:pStyle w:val="Compact"/>
-              <w:jc w:val="left"/>
             </w:pPr>
             <w:r>
               <w:t xml:space="preserve">0/6</w:t>
@@ -4926,7 +4880,6 @@
           <w:p>
             <w:pPr>
               <w:pStyle w:val="Compact"/>
-              <w:jc w:val="left"/>
             </w:pPr>
             <w:r>
               <w:t xml:space="preserve">Azacitidine</w:t>
@@ -4938,7 +4891,6 @@
           <w:p>
             <w:pPr>
               <w:pStyle w:val="Compact"/>
-              <w:jc w:val="left"/>
             </w:pPr>
             <w:r>
               <w:t xml:space="preserve">Peripheral-differential</w:t>
@@ -4950,7 +4902,6 @@
           <w:p>
             <w:pPr>
               <w:pStyle w:val="Compact"/>
-              <w:jc w:val="left"/>
             </w:pPr>
             <w:r>
               <w:t xml:space="preserve">Chromatin remodeling</w:t>
@@ -4962,7 +4913,6 @@
           <w:p>
             <w:pPr>
               <w:pStyle w:val="Compact"/>
-              <w:jc w:val="left"/>
             </w:pPr>
             <w:r>
               <w:t xml:space="preserve">DNMT1</w:t>
@@ -4974,7 +4924,6 @@
           <w:p>
             <w:pPr>
               <w:pStyle w:val="Compact"/>
-              <w:jc w:val="left"/>
             </w:pPr>
             <w:r>
               <w:t xml:space="preserve">Approved (Phase IV)</w:t>
@@ -4986,7 +4935,6 @@
           <w:p>
             <w:pPr>
               <w:pStyle w:val="Compact"/>
-              <w:jc w:val="left"/>
             </w:pPr>
             <w:r>
               <w:t xml:space="preserve">No</w:t>
@@ -4998,7 +4946,6 @@
           <w:p>
             <w:pPr>
               <w:pStyle w:val="Compact"/>
-              <w:jc w:val="left"/>
             </w:pPr>
             <w:r>
               <w:t xml:space="preserve">0.494</w:t>
@@ -5010,7 +4957,6 @@
           <w:p>
             <w:pPr>
               <w:pStyle w:val="Compact"/>
-              <w:jc w:val="left"/>
             </w:pPr>
             <w:r>
               <w:t xml:space="preserve">0.359</w:t>
@@ -5022,7 +4968,6 @@
           <w:p>
             <w:pPr>
               <w:pStyle w:val="Compact"/>
-              <w:jc w:val="left"/>
             </w:pPr>
             <w:r>
               <w:t xml:space="preserve">0.695</w:t>
@@ -5034,7 +4979,6 @@
           <w:p>
             <w:pPr>
               <w:pStyle w:val="Compact"/>
-              <w:jc w:val="left"/>
             </w:pPr>
             <w:r>
               <w:t xml:space="preserve">4</w:t>
@@ -5046,7 +4990,6 @@
           <w:p>
             <w:pPr>
               <w:pStyle w:val="Compact"/>
-              <w:jc w:val="left"/>
             </w:pPr>
             <w:r>
               <w:t xml:space="preserve">No</w:t>
@@ -5058,7 +5001,6 @@
           <w:p>
             <w:pPr>
               <w:pStyle w:val="Compact"/>
-              <w:jc w:val="left"/>
             </w:pPr>
             <w:r>
               <w:t xml:space="preserve">4/6</w:t>
@@ -5072,7 +5014,6 @@
           <w:p>
             <w:pPr>
               <w:pStyle w:val="Compact"/>
-              <w:jc w:val="left"/>
             </w:pPr>
             <w:r>
               <w:t xml:space="preserve">Pentoxifylline</w:t>
@@ -5084,7 +5025,6 @@
           <w:p>
             <w:pPr>
               <w:pStyle w:val="Compact"/>
-              <w:jc w:val="left"/>
             </w:pPr>
             <w:r>
               <w:t xml:space="preserve">Peripheral-differential</w:t>
@@ -5096,7 +5036,6 @@
           <w:p>
             <w:pPr>
               <w:pStyle w:val="Compact"/>
-              <w:jc w:val="left"/>
             </w:pPr>
             <w:r>
               <w:t xml:space="preserve">Amino acid metabolism</w:t>
@@ -5108,7 +5047,6 @@
           <w:p>
             <w:pPr>
               <w:pStyle w:val="Compact"/>
-              <w:jc w:val="left"/>
             </w:pPr>
             <w:r>
               <w:t xml:space="preserve">PDE6D</w:t>
@@ -5120,7 +5058,6 @@
           <w:p>
             <w:pPr>
               <w:pStyle w:val="Compact"/>
-              <w:jc w:val="left"/>
             </w:pPr>
             <w:r>
               <w:t xml:space="preserve">Approved (Phase IV)</w:t>
@@ -5132,7 +5069,6 @@
           <w:p>
             <w:pPr>
               <w:pStyle w:val="Compact"/>
-              <w:jc w:val="left"/>
             </w:pPr>
             <w:r>
               <w:t xml:space="preserve">No</w:t>
@@ -5144,7 +5080,6 @@
           <w:p>
             <w:pPr>
               <w:pStyle w:val="Compact"/>
-              <w:jc w:val="left"/>
             </w:pPr>
             <w:r>
               <w:t xml:space="preserve">0.454</w:t>
@@ -5156,7 +5091,6 @@
           <w:p>
             <w:pPr>
               <w:pStyle w:val="Compact"/>
-              <w:jc w:val="left"/>
             </w:pPr>
             <w:r>
               <w:t xml:space="preserve">0.316</w:t>
@@ -5168,7 +5102,6 @@
           <w:p>
             <w:pPr>
               <w:pStyle w:val="Compact"/>
-              <w:jc w:val="left"/>
             </w:pPr>
             <w:r>
               <w:t xml:space="preserve">0.661</w:t>
@@ -5180,7 +5113,6 @@
           <w:p>
             <w:pPr>
               <w:pStyle w:val="Compact"/>
-              <w:jc w:val="left"/>
             </w:pPr>
             <w:r>
               <w:t xml:space="preserve">3</w:t>
@@ -5192,7 +5124,6 @@
           <w:p>
             <w:pPr>
               <w:pStyle w:val="Compact"/>
-              <w:jc w:val="left"/>
             </w:pPr>
             <w:r>
               <w:t xml:space="preserve">No</w:t>
@@ -5204,7 +5135,6 @@
           <w:p>
             <w:pPr>
               <w:pStyle w:val="Compact"/>
-              <w:jc w:val="left"/>
             </w:pPr>
             <w:r>
               <w:t xml:space="preserve">3/6</w:t>
@@ -5218,7 +5148,6 @@
           <w:p>
             <w:pPr>
               <w:pStyle w:val="Compact"/>
-              <w:jc w:val="left"/>
             </w:pPr>
             <w:r>
               <w:t xml:space="preserve">Mitapivat</w:t>
@@ -5230,7 +5159,6 @@
           <w:p>
             <w:pPr>
               <w:pStyle w:val="Compact"/>
-              <w:jc w:val="left"/>
             </w:pPr>
             <w:r>
               <w:t xml:space="preserve">Peripheral-differential</w:t>
@@ -5242,7 +5170,6 @@
           <w:p>
             <w:pPr>
               <w:pStyle w:val="Compact"/>
-              <w:jc w:val="left"/>
             </w:pPr>
             <w:r>
               <w:t xml:space="preserve">Carbohydrate catabolism</w:t>
@@ -5254,7 +5181,6 @@
           <w:p>
             <w:pPr>
               <w:pStyle w:val="Compact"/>
-              <w:jc w:val="left"/>
             </w:pPr>
             <w:r>
               <w:t xml:space="preserve">PKLR</w:t>
@@ -5266,7 +5192,6 @@
           <w:p>
             <w:pPr>
               <w:pStyle w:val="Compact"/>
-              <w:jc w:val="left"/>
             </w:pPr>
             <w:r>
               <w:t xml:space="preserve">Approved (Phase IV)</w:t>
@@ -5278,7 +5203,6 @@
           <w:p>
             <w:pPr>
               <w:pStyle w:val="Compact"/>
-              <w:jc w:val="left"/>
             </w:pPr>
             <w:r>
               <w:t xml:space="preserve">No</w:t>
@@ -5290,7 +5214,6 @@
           <w:p>
             <w:pPr>
               <w:pStyle w:val="Compact"/>
-              <w:jc w:val="left"/>
             </w:pPr>
             <w:r>
               <w:t xml:space="preserve">0.445</w:t>
@@ -5302,7 +5225,6 @@
           <w:p>
             <w:pPr>
               <w:pStyle w:val="Compact"/>
-              <w:jc w:val="left"/>
             </w:pPr>
             <w:r>
               <w:t xml:space="preserve">0.353</w:t>
@@ -5314,7 +5236,6 @@
           <w:p>
             <w:pPr>
               <w:pStyle w:val="Compact"/>
-              <w:jc w:val="left"/>
             </w:pPr>
             <w:r>
               <w:t xml:space="preserve">0.583</w:t>
@@ -5326,7 +5247,6 @@
           <w:p>
             <w:pPr>
               <w:pStyle w:val="Compact"/>
-              <w:jc w:val="left"/>
             </w:pPr>
             <w:r>
               <w:t xml:space="preserve">3</w:t>
@@ -5338,7 +5258,6 @@
           <w:p>
             <w:pPr>
               <w:pStyle w:val="Compact"/>
-              <w:jc w:val="left"/>
             </w:pPr>
             <w:r>
               <w:t xml:space="preserve">No</w:t>
@@ -5350,7 +5269,6 @@
           <w:p>
             <w:pPr>
               <w:pStyle w:val="Compact"/>
-              <w:jc w:val="left"/>
             </w:pPr>
             <w:r>
               <w:t xml:space="preserve">0/6</w:t>
@@ -5364,7 +5282,6 @@
           <w:p>
             <w:pPr>
               <w:pStyle w:val="Compact"/>
-              <w:jc w:val="left"/>
             </w:pPr>
             <w:r>
               <w:t xml:space="preserve">Valproic Acid</w:t>
@@ -5376,7 +5293,6 @@
           <w:p>
             <w:pPr>
               <w:pStyle w:val="Compact"/>
-              <w:jc w:val="left"/>
             </w:pPr>
             <w:r>
               <w:t xml:space="preserve">Peripheral-differential</w:t>
@@ -5388,7 +5304,6 @@
           <w:p>
             <w:pPr>
               <w:pStyle w:val="Compact"/>
-              <w:jc w:val="left"/>
             </w:pPr>
             <w:r>
               <w:t xml:space="preserve">Carboxylic acid metabolism</w:t>
@@ -5400,7 +5315,6 @@
           <w:p>
             <w:pPr>
               <w:pStyle w:val="Compact"/>
-              <w:jc w:val="left"/>
             </w:pPr>
             <w:r>
               <w:t xml:space="preserve">ALDH5A1</w:t>
@@ -5412,7 +5326,6 @@
           <w:p>
             <w:pPr>
               <w:pStyle w:val="Compact"/>
-              <w:jc w:val="left"/>
             </w:pPr>
             <w:r>
               <w:t xml:space="preserve">Approved (Phase IV)</w:t>
@@ -5424,7 +5337,6 @@
           <w:p>
             <w:pPr>
               <w:pStyle w:val="Compact"/>
-              <w:jc w:val="left"/>
             </w:pPr>
             <w:r>
               <w:t xml:space="preserve">No</w:t>
@@ -5436,7 +5348,6 @@
           <w:p>
             <w:pPr>
               <w:pStyle w:val="Compact"/>
-              <w:jc w:val="left"/>
             </w:pPr>
             <w:r>
               <w:t xml:space="preserve">0.438</w:t>
@@ -5448,7 +5359,6 @@
           <w:p>
             <w:pPr>
               <w:pStyle w:val="Compact"/>
-              <w:jc w:val="left"/>
             </w:pPr>
             <w:r>
               <w:t xml:space="preserve">0.244</w:t>
@@ -5460,7 +5370,6 @@
           <w:p>
             <w:pPr>
               <w:pStyle w:val="Compact"/>
-              <w:jc w:val="left"/>
             </w:pPr>
             <w:r>
               <w:t xml:space="preserve">0.73</w:t>
@@ -5472,7 +5381,6 @@
           <w:p>
             <w:pPr>
               <w:pStyle w:val="Compact"/>
-              <w:jc w:val="left"/>
             </w:pPr>
             <w:r>
               <w:t xml:space="preserve">4</w:t>
@@ -5484,7 +5392,6 @@
           <w:p>
             <w:pPr>
               <w:pStyle w:val="Compact"/>
-              <w:jc w:val="left"/>
             </w:pPr>
             <w:r>
               <w:t xml:space="preserve">No</w:t>
@@ -5496,7 +5403,6 @@
           <w:p>
             <w:pPr>
               <w:pStyle w:val="Compact"/>
-              <w:jc w:val="left"/>
             </w:pPr>
             <w:r>
               <w:t xml:space="preserve">2/6</w:t>
@@ -5510,7 +5416,6 @@
           <w:p>
             <w:pPr>
               <w:pStyle w:val="Compact"/>
-              <w:jc w:val="left"/>
             </w:pPr>
             <w:r>
               <w:t xml:space="preserve">Mycophenolate Mofetil</w:t>
@@ -5522,7 +5427,6 @@
           <w:p>
             <w:pPr>
               <w:pStyle w:val="Compact"/>
-              <w:jc w:val="left"/>
             </w:pPr>
             <w:r>
               <w:t xml:space="preserve">Peripheral-differential</w:t>
@@ -5534,7 +5438,6 @@
           <w:p>
             <w:pPr>
               <w:pStyle w:val="Compact"/>
-              <w:jc w:val="left"/>
             </w:pPr>
             <w:r>
               <w:t xml:space="preserve">Amino acid metabolism</w:t>
@@ -5546,7 +5449,6 @@
           <w:p>
             <w:pPr>
               <w:pStyle w:val="Compact"/>
-              <w:jc w:val="left"/>
             </w:pPr>
             <w:r>
               <w:t xml:space="preserve">IMPDH2</w:t>
@@ -5558,7 +5460,6 @@
           <w:p>
             <w:pPr>
               <w:pStyle w:val="Compact"/>
-              <w:jc w:val="left"/>
             </w:pPr>
             <w:r>
               <w:t xml:space="preserve">Approved (Phase IV)</w:t>
@@ -5570,7 +5471,6 @@
           <w:p>
             <w:pPr>
               <w:pStyle w:val="Compact"/>
-              <w:jc w:val="left"/>
             </w:pPr>
             <w:r>
               <w:t xml:space="preserve">No</w:t>
@@ -5582,7 +5482,6 @@
           <w:p>
             <w:pPr>
               <w:pStyle w:val="Compact"/>
-              <w:jc w:val="left"/>
             </w:pPr>
             <w:r>
               <w:t xml:space="preserve">0.431</w:t>
@@ -5594,7 +5493,6 @@
           <w:p>
             <w:pPr>
               <w:pStyle w:val="Compact"/>
-              <w:jc w:val="left"/>
             </w:pPr>
             <w:r>
               <w:t xml:space="preserve">0.274</w:t>
@@ -5606,7 +5504,6 @@
           <w:p>
             <w:pPr>
               <w:pStyle w:val="Compact"/>
-              <w:jc w:val="left"/>
             </w:pPr>
             <w:r>
               <w:t xml:space="preserve">0.667</w:t>
@@ -5618,7 +5515,6 @@
           <w:p>
             <w:pPr>
               <w:pStyle w:val="Compact"/>
-              <w:jc w:val="left"/>
             </w:pPr>
             <w:r>
               <w:t xml:space="preserve">2</w:t>
@@ -5630,7 +5526,6 @@
           <w:p>
             <w:pPr>
               <w:pStyle w:val="Compact"/>
-              <w:jc w:val="left"/>
             </w:pPr>
             <w:r>
               <w:t xml:space="preserve">No</w:t>
@@ -5642,7 +5537,6 @@
           <w:p>
             <w:pPr>
               <w:pStyle w:val="Compact"/>
-              <w:jc w:val="left"/>
             </w:pPr>
             <w:r>
               <w:t xml:space="preserve">0/6</w:t>
@@ -5656,7 +5550,6 @@
           <w:p>
             <w:pPr>
               <w:pStyle w:val="Compact"/>
-              <w:jc w:val="left"/>
             </w:pPr>
             <w:r>
               <w:t xml:space="preserve">Acetazolamide</w:t>
@@ -5668,7 +5561,6 @@
           <w:p>
             <w:pPr>
               <w:pStyle w:val="Compact"/>
-              <w:jc w:val="left"/>
             </w:pPr>
             <w:r>
               <w:t xml:space="preserve">Peripheral-differential</w:t>
@@ -5680,7 +5572,6 @@
           <w:p>
             <w:pPr>
               <w:pStyle w:val="Compact"/>
-              <w:jc w:val="left"/>
             </w:pPr>
             <w:r>
               <w:t xml:space="preserve">Cell adhesion / membrane</w:t>
@@ -5692,7 +5583,6 @@
           <w:p>
             <w:pPr>
               <w:pStyle w:val="Compact"/>
-              <w:jc w:val="left"/>
             </w:pPr>
             <w:r>
               <w:t xml:space="preserve">CA2</w:t>
@@ -5704,7 +5594,6 @@
           <w:p>
             <w:pPr>
               <w:pStyle w:val="Compact"/>
-              <w:jc w:val="left"/>
             </w:pPr>
             <w:r>
               <w:t xml:space="preserve">Approved (Phase IV)</w:t>
@@ -5716,7 +5605,6 @@
           <w:p>
             <w:pPr>
               <w:pStyle w:val="Compact"/>
-              <w:jc w:val="left"/>
             </w:pPr>
             <w:r>
               <w:t xml:space="preserve">No</w:t>
@@ -5728,7 +5616,6 @@
           <w:p>
             <w:pPr>
               <w:pStyle w:val="Compact"/>
-              <w:jc w:val="left"/>
             </w:pPr>
             <w:r>
               <w:t xml:space="preserve">0.422</w:t>
@@ -5740,7 +5627,6 @@
           <w:p>
             <w:pPr>
               <w:pStyle w:val="Compact"/>
-              <w:jc w:val="left"/>
             </w:pPr>
             <w:r>
               <w:t xml:space="preserve">0.249</w:t>
@@ -5752,7 +5638,6 @@
           <w:p>
             <w:pPr>
               <w:pStyle w:val="Compact"/>
-              <w:jc w:val="left"/>
             </w:pPr>
             <w:r>
               <w:t xml:space="preserve">0.682</w:t>
@@ -5764,7 +5649,6 @@
           <w:p>
             <w:pPr>
               <w:pStyle w:val="Compact"/>
-              <w:jc w:val="left"/>
             </w:pPr>
             <w:r>
               <w:t xml:space="preserve">4</w:t>
@@ -5776,7 +5660,6 @@
           <w:p>
             <w:pPr>
               <w:pStyle w:val="Compact"/>
-              <w:jc w:val="left"/>
             </w:pPr>
             <w:r>
               <w:t xml:space="preserve">No</w:t>
@@ -5788,7 +5671,6 @@
           <w:p>
             <w:pPr>
               <w:pStyle w:val="Compact"/>
-              <w:jc w:val="left"/>
             </w:pPr>
             <w:r>
               <w:t xml:space="preserve">2/6</w:t>
@@ -5802,7 +5684,6 @@
           <w:p>
             <w:pPr>
               <w:pStyle w:val="Compact"/>
-              <w:jc w:val="left"/>
             </w:pPr>
             <w:r>
               <w:t xml:space="preserve">Tranylcypromine</w:t>
@@ -5814,7 +5695,6 @@
           <w:p>
             <w:pPr>
               <w:pStyle w:val="Compact"/>
-              <w:jc w:val="left"/>
             </w:pPr>
             <w:r>
               <w:t xml:space="preserve">Peripheral-differential</w:t>
@@ -5826,7 +5706,6 @@
           <w:p>
             <w:pPr>
               <w:pStyle w:val="Compact"/>
-              <w:jc w:val="left"/>
             </w:pPr>
             <w:r>
               <w:t xml:space="preserve">Amino acid metabolism</w:t>
@@ -5838,7 +5717,6 @@
           <w:p>
             <w:pPr>
               <w:pStyle w:val="Compact"/>
-              <w:jc w:val="left"/>
             </w:pPr>
             <w:r>
               <w:t xml:space="preserve">MAOA</w:t>
@@ -5850,7 +5728,6 @@
           <w:p>
             <w:pPr>
               <w:pStyle w:val="Compact"/>
-              <w:jc w:val="left"/>
             </w:pPr>
             <w:r>
               <w:t xml:space="preserve">Approved (Phase IV)</w:t>
@@ -5862,7 +5739,6 @@
           <w:p>
             <w:pPr>
               <w:pStyle w:val="Compact"/>
-              <w:jc w:val="left"/>
             </w:pPr>
             <w:r>
               <w:t xml:space="preserve">No</w:t>
@@ -5874,7 +5750,6 @@
           <w:p>
             <w:pPr>
               <w:pStyle w:val="Compact"/>
-              <w:jc w:val="left"/>
             </w:pPr>
             <w:r>
               <w:t xml:space="preserve">0.421</w:t>
@@ -5886,7 +5761,6 @@
           <w:p>
             <w:pPr>
               <w:pStyle w:val="Compact"/>
-              <w:jc w:val="left"/>
             </w:pPr>
             <w:r>
               <w:t xml:space="preserve">0.258</w:t>
@@ -5898,7 +5772,6 @@
           <w:p>
             <w:pPr>
               <w:pStyle w:val="Compact"/>
-              <w:jc w:val="left"/>
             </w:pPr>
             <w:r>
               <w:t xml:space="preserve">0.667</w:t>
@@ -5910,7 +5783,6 @@
           <w:p>
             <w:pPr>
               <w:pStyle w:val="Compact"/>
-              <w:jc w:val="left"/>
             </w:pPr>
             <w:r>
               <w:t xml:space="preserve">3</w:t>
@@ -5922,7 +5794,6 @@
           <w:p>
             <w:pPr>
               <w:pStyle w:val="Compact"/>
-              <w:jc w:val="left"/>
             </w:pPr>
             <w:r>
               <w:t xml:space="preserve">No</w:t>
@@ -5934,7 +5805,6 @@
           <w:p>
             <w:pPr>
               <w:pStyle w:val="Compact"/>
-              <w:jc w:val="left"/>
             </w:pPr>
             <w:r>
               <w:t xml:space="preserve">2/6</w:t>
@@ -5948,7 +5818,6 @@
           <w:p>
             <w:pPr>
               <w:pStyle w:val="Compact"/>
-              <w:jc w:val="left"/>
             </w:pPr>
             <w:r>
               <w:t xml:space="preserve">Doxycycline</w:t>
@@ -5960,7 +5829,6 @@
           <w:p>
             <w:pPr>
               <w:pStyle w:val="Compact"/>
-              <w:jc w:val="left"/>
             </w:pPr>
             <w:r>
               <w:t xml:space="preserve">Peripheral-differential</w:t>
@@ -5972,7 +5840,6 @@
           <w:p>
             <w:pPr>
               <w:pStyle w:val="Compact"/>
-              <w:jc w:val="left"/>
             </w:pPr>
             <w:r>
               <w:t xml:space="preserve">Immune response</w:t>
@@ -5984,7 +5851,6 @@
           <w:p>
             <w:pPr>
               <w:pStyle w:val="Compact"/>
-              <w:jc w:val="left"/>
             </w:pPr>
             <w:r>
               <w:t xml:space="preserve">MMP8</w:t>
@@ -5996,7 +5862,6 @@
           <w:p>
             <w:pPr>
               <w:pStyle w:val="Compact"/>
-              <w:jc w:val="left"/>
             </w:pPr>
             <w:r>
               <w:t xml:space="preserve">Approved (Phase IV)</w:t>
@@ -6008,7 +5873,6 @@
           <w:p>
             <w:pPr>
               <w:pStyle w:val="Compact"/>
-              <w:jc w:val="left"/>
             </w:pPr>
             <w:r>
               <w:t xml:space="preserve">No</w:t>
@@ -6020,7 +5884,6 @@
           <w:p>
             <w:pPr>
               <w:pStyle w:val="Compact"/>
-              <w:jc w:val="left"/>
             </w:pPr>
             <w:r>
               <w:t xml:space="preserve">0.418</w:t>
@@ -6032,7 +5895,6 @@
           <w:p>
             <w:pPr>
               <w:pStyle w:val="Compact"/>
-              <w:jc w:val="left"/>
             </w:pPr>
             <w:r>
               <w:t xml:space="preserve">0.338</w:t>
@@ -6044,7 +5906,6 @@
           <w:p>
             <w:pPr>
               <w:pStyle w:val="Compact"/>
-              <w:jc w:val="left"/>
             </w:pPr>
             <w:r>
               <w:t xml:space="preserve">0.537</w:t>
@@ -6056,7 +5917,6 @@
           <w:p>
             <w:pPr>
               <w:pStyle w:val="Compact"/>
-              <w:jc w:val="left"/>
             </w:pPr>
             <w:r>
               <w:t xml:space="preserve">3</w:t>
@@ -6068,7 +5928,6 @@
           <w:p>
             <w:pPr>
               <w:pStyle w:val="Compact"/>
-              <w:jc w:val="left"/>
             </w:pPr>
             <w:r>
               <w:t xml:space="preserve">No</w:t>
@@ -6080,7 +5939,6 @@
           <w:p>
             <w:pPr>
               <w:pStyle w:val="Compact"/>
-              <w:jc w:val="left"/>
             </w:pPr>
             <w:r>
               <w:t xml:space="preserve">2/6</w:t>
@@ -6196,59 +6054,59 @@
       </w:r>
       <w:r>
         <w:rPr>
+          <w:i/>
           <w:iCs/>
-          <w:i/>
         </w:rPr>
         <w:t xml:space="preserve">Assembled from</w:t>
       </w:r>
       <w:r>
         <w:rPr>
+          <w:i/>
           <w:iCs/>
-          <w:i/>
         </w:rPr>
         <w:t xml:space="preserve"> </w:t>
       </w:r>
       <w:r>
         <w:rPr>
           <w:rStyle w:val="VerbatimChar"/>
+          <w:i/>
           <w:iCs/>
-          <w:i/>
         </w:rPr>
         <w:t xml:space="preserve">results/tables/pub/main/Tab4_EGFR_validation.tsv</w:t>
       </w:r>
       <w:r>
         <w:rPr>
+          <w:i/>
           <w:iCs/>
+        </w:rPr>
+        <w:t xml:space="preserve"> </w:t>
+      </w:r>
+      <w:r>
+        <w:rPr>
           <w:i/>
-        </w:rPr>
-        <w:t xml:space="preserve"> </w:t>
-      </w:r>
-      <w:r>
-        <w:rPr>
           <w:iCs/>
-          <w:i/>
         </w:rPr>
         <w:t xml:space="preserve">and</w:t>
       </w:r>
       <w:r>
         <w:rPr>
+          <w:i/>
           <w:iCs/>
-          <w:i/>
         </w:rPr>
         <w:t xml:space="preserve"> </w:t>
       </w:r>
       <w:r>
         <w:rPr>
           <w:rStyle w:val="VerbatimChar"/>
+          <w:i/>
           <w:iCs/>
-          <w:i/>
         </w:rPr>
         <w:t xml:space="preserve">Tab5_novel_candidates_by_module.tsv</w:t>
       </w:r>
       <w:r>
         <w:rPr>
+          <w:i/>
           <w:iCs/>
-          <w:i/>
         </w:rPr>
         <w:t xml:space="preserve">.</w:t>
       </w:r>
@@ -6260,8 +6118,8 @@
         </w:pict>
       </w:r>
     </w:p>
-    <w:bookmarkEnd w:id="58"/>
-    <w:bookmarkStart w:id="59" w:name="references"/>
+    <w:bookmarkEnd w:id="47"/>
+    <w:bookmarkStart w:id="48" w:name="references"/>
     <w:p>
       <w:pPr>
         <w:pStyle w:val="Heading1"/>
@@ -6270,7 +6128,7 @@
         <w:t xml:space="preserve">References</w:t>
       </w:r>
     </w:p>
-    <w:bookmarkEnd w:id="59"/>
+    <w:bookmarkEnd w:id="48"/>
     <w:sectPr>
       <w:footnotePr>
         <w:numRestart w:val="eachSect"/>
@@ -6306,14 +6164,14 @@
 <file path=word/numbering.xml><?xml version="1.0" encoding="utf-8"?>
 <w:numbering xmlns:w="http://schemas.openxmlformats.org/wordprocessingml/2006/main">
   <w:abstractNum w:abstractNumId="990">
-    <w:nsid w:val="A990"/>
+    <w:nsid w:val="0000A990"/>
     <w:multiLevelType w:val="multilevel"/>
     <w:lvl w:ilvl="0">
       <w:numFmt w:val="bullet"/>
       <w:lvlText w:val=" "/>
       <w:lvlJc w:val="left"/>
       <w:pPr>
-        <w:ind w:left="720" w:hanging="480"/>
+        <w:ind w:left="720" w:hanging="360"/>
       </w:pPr>
     </w:lvl>
     <w:lvl w:ilvl="1">
@@ -6321,7 +6179,7 @@
       <w:lvlText w:val=" "/>
       <w:lvlJc w:val="left"/>
       <w:pPr>
-        <w:ind w:left="1440" w:hanging="480"/>
+        <w:ind w:left="1440" w:hanging="360"/>
       </w:pPr>
     </w:lvl>
     <w:lvl w:ilvl="2">
@@ -6329,7 +6187,7 @@
       <w:lvlText w:val=" "/>
       <w:lvlJc w:val="left"/>
       <w:pPr>
-        <w:ind w:left="2160" w:hanging="480"/>
+        <w:ind w:left="2160" w:hanging="360"/>
       </w:pPr>
     </w:lvl>
     <w:lvl w:ilvl="3">
@@ -6337,7 +6195,7 @@
       <w:lvlText w:val=" "/>
       <w:lvlJc w:val="left"/>
       <w:pPr>
-        <w:ind w:left="2880" w:hanging="480"/>
+        <w:ind w:left="2880" w:hanging="360"/>
       </w:pPr>
     </w:lvl>
     <w:lvl w:ilvl="4">
@@ -6345,7 +6203,7 @@
       <w:lvlText w:val=" "/>
       <w:lvlJc w:val="left"/>
       <w:pPr>
-        <w:ind w:left="3600" w:hanging="480"/>
+        <w:ind w:left="3600" w:hanging="360"/>
       </w:pPr>
     </w:lvl>
     <w:lvl w:ilvl="5">
@@ -6353,7 +6211,7 @@
       <w:lvlText w:val=" "/>
       <w:lvlJc w:val="left"/>
       <w:pPr>
-        <w:ind w:left="4320" w:hanging="480"/>
+        <w:ind w:left="4320" w:hanging="360"/>
       </w:pPr>
     </w:lvl>
     <w:lvl w:ilvl="6">
@@ -6361,7 +6219,7 @@
       <w:lvlText w:val=" "/>
       <w:lvlJc w:val="left"/>
       <w:pPr>
-        <w:ind w:left="5040" w:hanging="480"/>
+        <w:ind w:left="5040" w:hanging="360"/>
       </w:pPr>
     </w:lvl>
     <w:lvl w:ilvl="7">
@@ -6369,7 +6227,7 @@
       <w:lvlText w:val=" "/>
       <w:lvlJc w:val="left"/>
       <w:pPr>
-        <w:ind w:left="5760" w:hanging="480"/>
+        <w:ind w:left="5760" w:hanging="360"/>
       </w:pPr>
     </w:lvl>
     <w:lvl w:ilvl="8">
@@ -6377,12 +6235,12 @@
       <w:lvlText w:val=" "/>
       <w:lvlJc w:val="left"/>
       <w:pPr>
-        <w:ind w:left="6480" w:hanging="480"/>
+        <w:ind w:left="6480" w:hanging="360"/>
       </w:pPr>
     </w:lvl>
   </w:abstractNum>
   <w:abstractNum w:abstractNumId="99831">
-    <w:nsid w:val="A99831"/>
+    <w:nsid w:val="00A99831"/>
     <w:multiLevelType w:val="multilevel"/>
     <w:lvl w:ilvl="0">
       <w:start w:val="1"/>
@@ -6390,7 +6248,7 @@
       <w:lvlText w:val="(%1)"/>
       <w:lvlJc w:val="left"/>
       <w:pPr>
-        <w:ind w:left="720" w:hanging="480"/>
+        <w:ind w:left="720" w:hanging="360"/>
       </w:pPr>
     </w:lvl>
     <w:lvl w:ilvl="1">
@@ -6399,7 +6257,7 @@
       <w:lvlText w:val="(%2)"/>
       <w:lvlJc w:val="left"/>
       <w:pPr>
-        <w:ind w:left="1440" w:hanging="480"/>
+        <w:ind w:left="1440" w:hanging="360"/>
       </w:pPr>
     </w:lvl>
     <w:lvl w:ilvl="2">
@@ -6408,7 +6266,7 @@
       <w:lvlText w:val="(%3)"/>
       <w:lvlJc w:val="left"/>
       <w:pPr>
-        <w:ind w:left="2160" w:hanging="480"/>
+        <w:ind w:left="2160" w:hanging="360"/>
       </w:pPr>
     </w:lvl>
     <w:lvl w:ilvl="3">
@@ -6417,7 +6275,7 @@
       <w:lvlText w:val="(%4)"/>
       <w:lvlJc w:val="left"/>
       <w:pPr>
-        <w:ind w:left="2880" w:hanging="480"/>
+        <w:ind w:left="2880" w:hanging="360"/>
       </w:pPr>
     </w:lvl>
     <w:lvl w:ilvl="4">
@@ -6426,7 +6284,7 @@
       <w:lvlText w:val="(%5)"/>
       <w:lvlJc w:val="left"/>
       <w:pPr>
-        <w:ind w:left="3600" w:hanging="480"/>
+        <w:ind w:left="3600" w:hanging="360"/>
       </w:pPr>
     </w:lvl>
     <w:lvl w:ilvl="5">
@@ -6435,7 +6293,7 @@
       <w:lvlText w:val="(%6)"/>
       <w:lvlJc w:val="left"/>
       <w:pPr>
-        <w:ind w:left="4320" w:hanging="480"/>
+        <w:ind w:left="4320" w:hanging="360"/>
       </w:pPr>
     </w:lvl>
     <w:lvl w:ilvl="6">
@@ -6444,7 +6302,7 @@
       <w:lvlText w:val="(%7)"/>
       <w:lvlJc w:val="left"/>
       <w:pPr>
-        <w:ind w:left="5040" w:hanging="480"/>
+        <w:ind w:left="5040" w:hanging="360"/>
       </w:pPr>
     </w:lvl>
     <w:lvl w:ilvl="7">
@@ -6453,7 +6311,7 @@
       <w:lvlText w:val="(%8)"/>
       <w:lvlJc w:val="left"/>
       <w:pPr>
-        <w:ind w:left="5760" w:hanging="480"/>
+        <w:ind w:left="5760" w:hanging="360"/>
       </w:pPr>
     </w:lvl>
     <w:lvl w:ilvl="8">
@@ -6462,7 +6320,7 @@
       <w:lvlText w:val="(%9)"/>
       <w:lvlJc w:val="left"/>
       <w:pPr>
-        <w:ind w:left="6480" w:hanging="480"/>
+        <w:ind w:left="6480" w:hanging="360"/>
       </w:pPr>
     </w:lvl>
   </w:abstractNum>
@@ -7237,8 +7095,8 @@
     <w:name w:val="KeywordTok"/>
     <w:basedOn w:val="VerbatimChar"/>
     <w:rPr>
+      <w:b/>
       <w:color w:val="007020"/>
-      <w:b/>
     </w:rPr>
   </w:style>
   <w:style w:type="character" w:customStyle="1" w:styleId="DataTypeTok">
@@ -7315,42 +7173,42 @@
     <w:name w:val="ImportTok"/>
     <w:basedOn w:val="VerbatimChar"/>
     <w:rPr>
+      <w:b/>
       <w:color w:val="008000"/>
-      <w:b/>
     </w:rPr>
   </w:style>
   <w:style w:type="character" w:customStyle="1" w:styleId="CommentTok">
     <w:name w:val="CommentTok"/>
     <w:basedOn w:val="VerbatimChar"/>
     <w:rPr>
+      <w:i/>
       <w:color w:val="60a0b0"/>
-      <w:i/>
     </w:rPr>
   </w:style>
   <w:style w:type="character" w:customStyle="1" w:styleId="DocumentationTok">
     <w:name w:val="DocumentationTok"/>
     <w:basedOn w:val="VerbatimChar"/>
     <w:rPr>
+      <w:i/>
       <w:color w:val="ba2121"/>
-      <w:i/>
     </w:rPr>
   </w:style>
   <w:style w:type="character" w:customStyle="1" w:styleId="AnnotationTok">
     <w:name w:val="AnnotationTok"/>
     <w:basedOn w:val="VerbatimChar"/>
     <w:rPr>
-      <w:color w:val="60a0b0"/>
       <w:b/>
       <w:i/>
+      <w:color w:val="60a0b0"/>
     </w:rPr>
   </w:style>
   <w:style w:type="character" w:customStyle="1" w:styleId="CommentVarTok">
     <w:name w:val="CommentVarTok"/>
     <w:basedOn w:val="VerbatimChar"/>
     <w:rPr>
-      <w:color w:val="60a0b0"/>
       <w:b/>
       <w:i/>
+      <w:color w:val="60a0b0"/>
     </w:rPr>
   </w:style>
   <w:style w:type="character" w:customStyle="1" w:styleId="OtherTok">
@@ -7378,8 +7236,8 @@
     <w:name w:val="ControlFlowTok"/>
     <w:basedOn w:val="VerbatimChar"/>
     <w:rPr>
+      <w:b/>
       <w:color w:val="007020"/>
-      <w:b/>
     </w:rPr>
   </w:style>
   <w:style w:type="character" w:customStyle="1" w:styleId="OperatorTok">
@@ -7424,34 +7282,34 @@
     <w:name w:val="InformationTok"/>
     <w:basedOn w:val="VerbatimChar"/>
     <w:rPr>
-      <w:color w:val="60a0b0"/>
       <w:b/>
       <w:i/>
+      <w:color w:val="60a0b0"/>
     </w:rPr>
   </w:style>
   <w:style w:type="character" w:customStyle="1" w:styleId="WarningTok">
     <w:name w:val="WarningTok"/>
     <w:basedOn w:val="VerbatimChar"/>
     <w:rPr>
-      <w:color w:val="60a0b0"/>
       <w:b/>
       <w:i/>
+      <w:color w:val="60a0b0"/>
     </w:rPr>
   </w:style>
   <w:style w:type="character" w:customStyle="1" w:styleId="AlertTok">
     <w:name w:val="AlertTok"/>
     <w:basedOn w:val="VerbatimChar"/>
     <w:rPr>
+      <w:b/>
       <w:color w:val="ff0000"/>
-      <w:b/>
     </w:rPr>
   </w:style>
   <w:style w:type="character" w:customStyle="1" w:styleId="ErrorTok">
     <w:name w:val="ErrorTok"/>
     <w:basedOn w:val="VerbatimChar"/>
     <w:rPr>
+      <w:b/>
       <w:color w:val="ff0000"/>
-      <w:b/>
     </w:rPr>
   </w:style>
   <w:style w:type="character" w:customStyle="1" w:styleId="NormalTok">

</xml_diff>